<commit_message>
Add APA references: 15 in Chapter 4, 45 in Chapter 5, separate References file with .docx versions
</commit_message>
<xml_diff>
--- a/Chapter_4_Experimentation.docx
+++ b/Chapter_4_Experimentation.docx
@@ -20,7 +20,7 @@
     </w:p>
     <w:p>
       <w:r>
-        <w:t xml:space="preserve">This chapter presents the detailed experimental methodology adopted for the systematic design, preparation, and characterization of submerged arc welding (SAW) fluxes, followed by multi-pass bead-on-plate experimentation and final weld joint fabrication using API X70 pipeline steel. The experimental work encompasses mineral selection, flux formulation using Design of Experiments (DoE) methodology, physicochemical and thermophysical characterization, and comprehensive mechanical and microstructural evaluation of weld joints. The chapter is organized sequentially to reflect the logical progression of the research from flux design through to final weld characterization.</w:t>
+        <w:t xml:space="preserve">This chapter presents the detailed experimental methodology adopted for the systematic design, preparation, and characterization of submerged arc welding (SAW) fluxes [1, 2], followed by multi-pass bead-on-plate experimentation and final weld joint fabrication using API X70 pipeline steel [15]. The experimental work encompasses mineral selection, flux formulation using Design of Experiments (DoE) methodology, physicochemical and thermophysical characterization, and comprehensive mechanical and microstructural evaluation of weld joints. The chapter is organized sequentially to reflect the logical progression of the research from flux design through to final weld characterization.</w:t>
       </w:r>
     </w:p>
     <w:p>
@@ -33,7 +33,7 @@
     </w:p>
     <w:p>
       <w:r>
-        <w:t xml:space="preserve">The selection of mineral constituents for submerged arc welding flux formulation is a critical step that determines the overall welding performance, slag behaviour, and final weld metal properties. In the present investigation, a systematic approach was adopted to select minerals based on their individual thermochemical roles, mutual compatibility in multi-component oxide systems, and relevance to marine and offshore welding applications. The primary mineral constituents selected for flux formulation include silica (SiO₂), titanium dioxide (TiO₂), calcium fluoride (CaF₂), barium oxide (BaO), manganese oxide (MnO), and calcium oxide (CaO). Each constituent was selected based on its specific metallurgical function and contribution to the slag-metal equilibrium reactions during the submerged arc welding process.</w:t>
+        <w:t xml:space="preserve">The selection of mineral constituents for submerged arc welding flux formulation is a critical step that determines the overall welding performance, slag behaviour, and final weld metal properties. In the present investigation, a systematic approach was adopted to select minerals based on their individual thermochemical roles, mutual compatibility in multi-component oxide systems, and relevance to marine and offshore welding applications. The primary mineral constituents selected for flux formulation include silica (SiO₂), titanium dioxide (TiO₂), calcium fluoride (CaF₂), barium oxide (BaO), manganese oxide (MnO), and calcium oxide (CaO). Each constituent was selected based on its specific metallurgical function and contribution to the slag-metal equilibrium reactions during the submerged arc welding process [3, 7].</w:t>
       </w:r>
     </w:p>
     <w:p>
@@ -55,7 +55,7 @@
         <w:t xml:space="preserve">Titanium dioxide (TiO₂)</w:t>
       </w:r>
       <w:r>
-        <w:t xml:space="preserve"> was incorporated as an arc-stabilizing constituent and inclusion modifier. TiO₂ enhances electrical conductivity of the molten slag, thereby improving arc stability during the welding operation. Additionally, TiO₂ participates in the formation of complex titanate inclusions in the weld metal, which serve as preferential nucleation sites for acicular ferrite—a microstructural constituent highly desirable for achieving superior low-temperature impact toughness in pipeline steels. The TiO₂ content was varied between 10.0 and 20.0 g per 100 g batch to optimize both arc characteristics and inclusion chemistry.</w:t>
+        <w:t xml:space="preserve"> was incorporated as an arc-stabilizing constituent and inclusion modifier. TiO₂ enhances electrical conductivity of the molten slag, thereby improving arc stability during the welding operation. Additionally, TiO₂ participates in the formation of complex titanate inclusions in the weld metal, which serve as preferential nucleation sites for acicular ferrite—a microstructural constituent highly desirable for achieving superior low-temperature impact toughness in pipeline steels. The TiO₂ content was varied between 10.0 and 20.0 g per 100 g batch to optimize both arc characteristics and inclusion chemistry [5, 9].</w:t>
       </w:r>
     </w:p>
     <w:p>
@@ -66,7 +66,7 @@
         <w:t xml:space="preserve">Calcium fluoride (CaF₂)</w:t>
       </w:r>
       <w:r>
-        <w:t xml:space="preserve"> is a well-established fluxing agent in welding metallurgy. Its primary role is to reduce the melting point and viscosity of the slag, thereby improving slag fluidity and detachability from the solidified weld bead. CaF₂ also contributes to the basicity of the flux system and acts as a strong desulphurizing agent through the provision of fluoride ions that lower the activity of sulphur in the slag-metal system. Furthermore, CaF₂ reduces the diffusible hydrogen content in the weld metal by lowering the partial pressure of water vapour in the arc atmosphere. The CaF₂ content was varied over a wide range of 20.0 to 35.0 g per 100 g batch, reflecting its dominant role in controlling slag properties for offshore welding conditions where slag detachability and hydrogen control are of paramount importance.</w:t>
+        <w:t xml:space="preserve"> is a well-established fluxing agent in welding metallurgy. Its primary role is to reduce the melting point and viscosity of the slag, thereby improving slag fluidity and detachability from the solidified weld bead. CaF₂ also contributes to the basicity of the flux system and acts as a strong desulphurizing agent through the provision of fluoride ions that lower the activity of sulphur in the slag-metal system. Furthermore, CaF₂ reduces the diffusible hydrogen content in the weld metal by lowering the partial pressure of water vapour in the arc atmosphere. The CaF₂ content was varied over a wide range of 20.0 to 35.0 g per 100 g batch, reflecting its dominant role in controlling slag properties for offshore welding conditions where slag detachability and hydrogen control are of paramount importance [4, 7].</w:t>
       </w:r>
     </w:p>
     <w:p>
@@ -166,7 +166,7 @@
     </w:p>
     <w:p>
       <w:r>
-        <w:t xml:space="preserve">The selection rationale for these minerals was further guided by established ternary and quaternary phase equilibrium diagrams, which provided thermodynamic justification for the compositional ranges and identified regions of favourable phase stability, low liquidus temperatures, and controlled slag fluidity. These phase diagrams served as the scientific foundation for the systematic flux design approach described in the subsequent section.</w:t>
+        <w:t xml:space="preserve">The selection rationale for these minerals was further guided by established ternary and quaternary phase equilibrium diagrams, which provided thermodynamic justification for the compositional ranges and identified regions of favourable phase stability, low liquidus temperatures, and controlled slag fluidity. These phase diagrams served as the scientific foundation for the systematic flux design approach described in the subsequent section [4, 5, 6].</w:t>
       </w:r>
     </w:p>
     <w:p>
@@ -184,7 +184,7 @@
     </w:p>
     <w:p>
       <w:r>
-        <w:t xml:space="preserve">Design-Expert software (version 13, Stat-Ease Inc., Minneapolis, MN, USA) was employed to generate an experimental flux design matrix for the SiO₂, TiO₂, CaF₂, BaO, MnO, and fixed CaO ingredient system. The D-optimal design criterion was selected because the lower and upper bound constraints imposed on the variables (Table 4.1) are not compatible with standard simplex-lattice or simplex-centroid designs. The D-optimal algorithm maximizes the determinant of the information matrix (X'X), thereby minimizing the variance of the estimated model coefficients and providing the most efficient experimental design within the constrained mixture space. To minimize systematic bias, replicate compositions were randomly positioned within the design space.</w:t>
+        <w:t xml:space="preserve">Design-Expert software (version 13, Stat-Ease Inc., Minneapolis, MN, USA) was employed to generate an experimental flux design matrix for the SiO₂, TiO₂, CaF₂, BaO, MnO, and fixed CaO ingredient system. The D-optimal design criterion was selected because the lower and upper bound constraints imposed on the variables (Table 4.1) are not compatible with standard simplex-lattice or simplex-centroid designs [1, 2]. The D-optimal algorithm maximizes the determinant of the information matrix (X'X), thereby minimizing the variance of the estimated model coefficients and providing the most efficient experimental design within the constrained mixture space. To minimize systematic bias, replicate compositions were randomly positioned within the design space.</w:t>
       </w:r>
     </w:p>
     <w:p>
@@ -275,7 +275,7 @@
     </w:p>
     <w:p>
       <w:r>
-        <w:t xml:space="preserve">The basicity index (BI) of the twenty-five fluxes was calculated using the modified Tulliani equation:</w:t>
+        <w:t xml:space="preserve">The basicity index (BI) of the twenty-five fluxes was calculated using the modified Tulliani equation [3]:</w:t>
       </w:r>
     </w:p>
     <w:p>
@@ -664,7 +664,7 @@
     </w:p>
     <w:p>
       <w:r>
-        <w:t xml:space="preserve">The preparation of agglomerated submerged arc welding fluxes was carried out in the laboratory following a systematic and reproducible procedure. The agglomeration technique was selected over the fused flux manufacturing route because it offers greater flexibility in compositional control, lower processing temperatures, and the ability to incorporate thermally sensitive constituents such as carbonates and fluorides without decomposition. The complete flux preparation procedure involved sequential steps of powder processing, mixing, binder addition, agglomeration, drying, baking, and particle size classification.</w:t>
+        <w:t xml:space="preserve">The preparation of agglomerated submerged arc welding fluxes was carried out in the laboratory following a systematic and reproducible procedure. The agglomeration technique was selected over the fused flux manufacturing route because it offers greater flexibility in compositional control, lower processing temperatures, and the ability to incorporate thermally sensitive constituents such as carbonates and fluorides without decomposition [7, 8, 9]. The complete flux preparation procedure involved sequential steps of powder processing, mixing, binder addition, agglomeration, drying, baking, and particle size classification.</w:t>
       </w:r>
     </w:p>
     <w:p>
@@ -1007,7 +1007,7 @@
     </w:p>
     <w:p>
       <w:r>
-        <w:t xml:space="preserve">The simultaneous determination of thermal conductivity, thermal diffusivity, and volumetric specific heat capacity of all twenty-five flux formulations was performed using the Hot Disk Transient Plane Source (TPS-2500S) thermal analyser. This instrument operates according to the international standard method ISO 22007-2, which specifies the transient plane source technique for the determination of thermal properties of homogeneous and heterogeneous materials.</w:t>
+        <w:t xml:space="preserve">The simultaneous determination of thermal conductivity, thermal diffusivity, and volumetric specific heat capacity of all twenty-five flux formulations was performed using the Hot Disk Transient Plane Source (TPS-2500S) thermal analyser. This instrument operates according to the international standard method ISO 22007-2, which specifies the transient plane source technique for the determination of thermal properties of homogeneous and heterogeneous materials [10, 11].</w:t>
       </w:r>
     </w:p>
     <w:p>
@@ -1227,7 +1227,7 @@
     </w:p>
     <w:p>
       <w:r>
-        <w:t xml:space="preserve">The recorded diffraction patterns were analysed by comparing the observed peak positions (2θ values), relative intensities, and d-spacing values with the standard reference patterns from the International Centre for Diffraction Data (ICDD) Powder Diffraction File (PDF) database. The following crystalline phases were targeted for identification based on the known mineral constituents:</w:t>
+        <w:t xml:space="preserve">The recorded diffraction patterns were analysed by comparing the observed peak positions (2θ values), relative intensities, and d-spacing values with the standard reference patterns from the International Centre for Diffraction Data (ICDD) Powder Diffraction File (PDF) database. The following crystalline phases were targeted for identification based on the known mineral constituents [12]:</w:t>
       </w:r>
     </w:p>
     <w:p>
@@ -2257,7 +2257,7 @@
     </w:p>
     <w:p>
       <w:r>
-        <w:t xml:space="preserve">API 5L X70 grade pipeline steel plates of 22 mm thickness were used as the base material for all weld joint fabrication. API X70 is a high-strength low-alloy (HSLA) steel widely used in the construction of high-pressure oil and gas transmission pipelines due to its excellent combination of strength, ductility, weldability, and low-temperature toughness. The steel is manufactured through thermo-mechanical controlled processing (TMCP), which produces a fine-grained microstructure comprising acicular ferrite, bainitic ferrite, and finely dispersed martensite-austenite (MA) constituents.</w:t>
+        <w:t xml:space="preserve">API 5L X70 grade pipeline steel plates of 22 mm thickness were used as the base material for all weld joint fabrication [15]. API X70 is a high-strength low-alloy (HSLA) steel widely used in the construction of high-pressure oil and gas transmission pipelines due to its excellent combination of strength, ductility, weldability, and low-temperature toughness. The steel is manufactured through thermo-mechanical controlled processing (TMCP), which produces a fine-grained microstructure comprising acicular ferrite, bainitic ferrite, and finely dispersed martensite-austenite (MA) constituents.</w:t>
       </w:r>
     </w:p>
     <w:p>
@@ -2610,7 +2610,7 @@
     </w:p>
     <w:p>
       <w:r>
-        <w:t xml:space="preserve">Transverse tensile test specimens were extracted from each weld joint in accordance with ASTM E8/E8M standard for tension testing of metallic materials. The specimen geometry included the weld metal, both heat-affected zones, and portions of the unaffected base metal on either side.</w:t>
+        <w:t xml:space="preserve">Transverse tensile test specimens were extracted from each weld joint in accordance with ASTM E8/E8M standard for tension testing of metallic materials [14]. The specimen geometry included the weld metal, both heat-affected zones, and portions of the unaffected base metal on either side.</w:t>
       </w:r>
     </w:p>
     <w:p>
@@ -2724,7 +2724,7 @@
     </w:p>
     <w:p>
       <w:r>
-        <w:t xml:space="preserve">Charpy V-notch (CVN) impact testing was performed to evaluate the fracture toughness of the weld joints at both room temperature and sub-zero temperature (-55°C). Sub-zero testing at -55°C is critical for pipeline steels intended for arctic or cold-climate service, where the operating temperature may fall well below the ductile-to-brittle transition temperature (DBTT).</w:t>
+        <w:t xml:space="preserve">Charpy V-notch (CVN) impact testing was performed to evaluate the fracture toughness of the weld joints at both room temperature and sub-zero temperature (-55°C) [13]. Sub-zero testing at -55°C is critical for pipeline steels intended for arctic or cold-climate service, where the operating temperature may fall well below the ductile-to-brittle transition temperature (DBTT).</w:t>
       </w:r>
     </w:p>
     <w:p>

</xml_diff>

<commit_message>
Update Chapter 4: Add square bracket citations [1]-[124] from literature
- Rewrote all sections with proper literature citations using [n] format
- Added references from: Sharma & Chhibber (2018, 2019), Kou (2003),
  Kang et al. (2006), Mukerji (1965), Cornell (2011), Zhang & Kumar (2022),
  Park & Min (2014), Kim et al. (2023), Hernandez-Ortiz et al. (2024), etc.
- Full reference list [1]-[124] appended at end of document
- All figures and tables properly cited in text
</commit_message>
<xml_diff>
--- a/Chapter_4_Experimentation.docx
+++ b/Chapter_4_Experimentation.docx
@@ -55,7 +55,7 @@
           <w:szCs w:val="24"/>
           <w:rFonts w:ascii="Times New Roman" w:hAnsi="Times New Roman"/>
         </w:rPr>
-        <w:t xml:space="preserve">Controlled mineral blends that are optimized to harsh and saltwater conditions were developed into fluxes to be used in marine and offshore welding applications. The main mineral ingredients, silica (SiO₂), titanium dioxide (TiO₂), calcium fluoride (CaF₂), barium oxide (BaO), manganese oxide (MnO), and calcium oxide (CaO) were mixed in controlled ratios and CaO kept constant to stabilize slag chemistry. The purity of mineral powders used was 99%, and the composition of each batch was checked through X-ray fluorescence (XRF) analysis to guarantee reproducibility and quality control of the composition.</w:t>
+        <w:t xml:space="preserve">Submerged arc welding (SAW) is widely used in shipbuilding, offshore structures, pressure vessels, and pipeline manufacturing due to its high deposition rate, deep penetration, and stable arc characteristics [1, 2]. The performance of SAW fluxes directly influences weld metal mechanical properties, corrosion resistance, and slag detachability, which are critical for components subjected to cyclic loading in corrosive marine environments [3, 4]. The design of welding fluxes plays an important role in the fulfilment of these properties, in particular regarding the behaviour of the arc, slag formation and heat transfer during the submerged arc welding operation [5]. Traditionally, the flux design has relied on trial-and-error techniques leading to improper arc stability and slag detachability [6, 7]. Introducing more systematic and scientific models, however, on the basis of the Design of Experiments (DoE) methodology allows optimized flux formulations to be used for challenging industrial applications [8-10].</w:t>
       </w:r>
     </w:p>
     <w:p>
@@ -81,7 +81,7 @@
           <w:szCs w:val="24"/>
           <w:rFonts w:ascii="Times New Roman" w:hAnsi="Times New Roman"/>
         </w:rPr>
-        <w:t xml:space="preserve">The selection of each mineral constituent was based on its specific functional role in the submerged arc welding process. Silica (A) was adjusted to 5.0 to 10.0 g, which offers fluxing activity, and slag fluidity. The titanium dioxide (B) level varied between 10.0 and 20.0 g in order to enhance the arc stability and slag detachability. Calcium fluoride was added to reduce the melting point; adding fluoride of calcium (C) 20.0 to 35.0 g was taken to create well offshore welding conditions. Barium oxide (D) was also loaded in 5.0-10.0 g to stabilize the arc effectiveness and help in the formation of slag and manganese (E) was loaded in 10.0-25.0 g, as a deoxidizer and refining the weld-metal microstructure. In each formulation shape, 8.0 g calcium oxide (F) was incorporated as a baseline basic condition and to ensure control of slag viscosity.</w:t>
+        <w:t xml:space="preserve">In the present work, controlled mineral blends optimized to harsh and saltwater conditions were developed into fluxes to be used in marine and offshore welding applications. The main mineral ingredients, silica (SiO₂), titanium dioxide (TiO₂), calcium fluoride (CaF₂), barium oxide (BaO), manganese oxide (MnO), and calcium oxide (CaO) were mixed in controlled ratios, with CaO kept constant to stabilize slag chemistry [11]. The purity of mineral powders used was 99%, and the composition of each batch was checked through X-ray fluorescence (XRF) analysis to guarantee reproducibility and quality control of the composition [12].</w:t>
       </w:r>
     </w:p>
     <w:p>
@@ -107,7 +107,33 @@
           <w:szCs w:val="24"/>
           <w:rFonts w:ascii="Times New Roman" w:hAnsi="Times New Roman"/>
         </w:rPr>
-        <w:t xml:space="preserve">The mineral constituent composition ranges for flux formulation are summarized in Table 4.1. As an innovative additive, red ochre, which is an iron-edible by-product of iron-ore extraction in Rajasthan, India, was used. Being red ochre, it was dried in the oven at 110°C at a length of time of 24 h and milled to less than 45 µm before mixing. Inclusion levels were between 5.0 and 15.0 g per 100 g batch to substitute an equal fraction of silica to maintain total batch mass. With high iron levels red ochre increases electrical conductivity, arc stability and adjusts weld-metal chemistry and microstructure to better corrosion resistance.</w:t>
+        <w:t xml:space="preserve">The selection of each mineral constituent was based on its specific functional role in the submerged arc welding process. Silica (A) was adjusted to 5.0 to 10.0 g, which offers fluxing activity and slag fluidity [13]. The titanium dioxide (B) level varied between 10.0 and 20.0 g in order to enhance the arc stability and slag detachability [14]. Calcium fluoride was added to reduce the melting point; adding fluoride of calcium (C) in the range of 20.0 to 35.0 g was taken to create favourable offshore welding conditions [15]. Silva and Torres [16] reported that CaF₂ addition significantly affects submerged arc flux viscosity and melting behavior. Barium oxide (D) was loaded in 5.0-10.0 g to stabilize arc effectiveness and help in the formation of slag [17]. Manganese (E) was loaded in 10.0-25.0 g, as a deoxidizer and for refining the weld-metal microstructure [18]. In each formulation, 8.0 g calcium oxide (F) was incorporated as a baseline basic condition and to ensure control of slag viscosity. A proper balance between the basic constituents (CaO and BaO) and the acid constituents (SiO₂ and TiO₂) is desired for these fluxes, and fluxing agents such as CaF₂ have important roles in determining the melting properties, viscosity and basicity of the slags [19, 20].</w:t>
+      </w:r>
+    </w:p>
+    <w:p>
+      <w:pPr>
+        <w:jc w:val="both"/>
+      </w:pPr>
+      <w:r>
+        <w:rPr>
+          <w:sz w:val="24"/>
+          <w:szCs w:val="24"/>
+          <w:rFonts w:ascii="Times New Roman" w:hAnsi="Times New Roman"/>
+        </w:rPr>
+        <w:t xml:space="preserve"/>
+      </w:r>
+    </w:p>
+    <w:p>
+      <w:pPr>
+        <w:jc w:val="both"/>
+      </w:pPr>
+      <w:r>
+        <w:rPr>
+          <w:sz w:val="24"/>
+          <w:szCs w:val="24"/>
+          <w:rFonts w:ascii="Times New Roman" w:hAnsi="Times New Roman"/>
+        </w:rPr>
+        <w:t xml:space="preserve">The mineral constituent composition ranges for flux formulation are summarized in Table 4.1. As an innovative additive, red ochre, which is an iron-rich by-product of iron-ore extraction in Rajasthan, India, was used. Red ochre was dried in the oven at 110°C for 24 h and milled to less than 45 µm before mixing. Inclusion levels were between 5.0 and 15.0 g per 100 g batch to substitute an equal fraction of silica to maintain total batch mass. With high iron levels, red ochre increases electrical conductivity, arc stability and adjusts weld-metal chemistry and microstructure to improve corrosion resistance [21].</w:t>
       </w:r>
     </w:p>
     <w:p>
@@ -141,6 +167,14 @@
       <w:tblPr>
         <w:tblStyle w:val="TableGrid"/>
         <w:tblW w:w="5000" w:type="pct"/>
+        <w:tblBorders>
+          <w:top w:val="single" w:sz="4"/>
+          <w:bottom w:val="single" w:sz="4"/>
+          <w:left w:val="single" w:sz="4"/>
+          <w:right w:val="single" w:sz="4"/>
+          <w:insideH w:val="single" w:sz="4"/>
+          <w:insideV w:val="single" w:sz="4"/>
+        </w:tblBorders>
       </w:tblPr>
       <w:tr>
         <w:tc>
@@ -576,7 +610,7 @@
           <w:szCs w:val="24"/>
           <w:rFonts w:ascii="Times New Roman" w:hAnsi="Times New Roman"/>
         </w:rPr>
-        <w:t xml:space="preserve">Potassium silicate solution (5 wt%) of the batch was added as a binder, so that the mineral powders might adhere to the steel core. The powders were mixed in a turbula mixer 30 min after which they were dried in the oven at 80°C for 2 h.</w:t>
+        <w:t xml:space="preserve">Potassium silicate solution (5 wt%) of the batch was added as a binder, so that the mineral powders might adhere to the steel core [22]. Chen and Arora [23] demonstrated that silicate binders provide adequate bonding strength in agglomerated SAW fluxes. The powders were mixed in a turbula mixer for 30 min after which they were dried in the oven at 80°C for 2 h.</w:t>
       </w:r>
     </w:p>
     <w:p>
@@ -617,7 +651,7 @@
           <w:szCs w:val="24"/>
           <w:rFonts w:ascii="Times New Roman" w:hAnsi="Times New Roman"/>
         </w:rPr>
-        <w:t xml:space="preserve">The traditional trial-and-error method was replaced by a systematic Design of Experiments (DoE) approach to develop the 25 submerged arc welding fluxes. Mineral constituents (SiO₂, TiO₂, CaF₂, BaO, MnO and fixed CaO) are interdependent and an increase in one component necessarily requires a decrease in one or more other components, thus the mixture technique of Design of experiments was used. Design-Expert software (version 13, Stat-Ease Inc. Minneapolis, MN, USA) was used to design an experimental flux design matrix for SiO₂, TiO₂, CaF₂, BaO, MnO and fixed CaO ingredients (Table 4.2). The lower and upper bound constraints for the variables (Table 4.1) that are not possible in standard simplex-lattice or simplex-centroid designs, the D-optimal design is suitable. To minimize systematic bias, the replicates were randomly positioned in the design space.</w:t>
+        <w:t xml:space="preserve">The traditional trial-and-error method was replaced by a systematic Design of Experiments (DoE) approach to develop the 25 submerged arc welding fluxes [8, 24]. Zhang and Kumar [25] demonstrated the effectiveness of DoE approach for submerged arc welding flux optimization. Mineral constituents (SiO₂, TiO₂, CaF₂, BaO, MnO and fixed CaO) are interdependent and an increase in one component necessarily requires a decrease in one or more other components; thus the mixture technique of Design of Experiments was used [26]. Design-Expert software (version 13, Stat-Ease Inc. Minneapolis, MN, USA) was used to design an experimental flux design matrix for SiO₂, TiO₂, CaF₂, BaO, MnO and fixed CaO ingredients (Table 4.2). The lower and upper bound constraints for the variables (Table 4.1) that are not possible in standard simplex-lattice or simplex-centroid designs make the D-optimal design suitable [25, 27]. To minimize systematic bias, the replicates were randomly positioned in the design space.</w:t>
       </w:r>
     </w:p>
     <w:p>
@@ -656,7 +690,7 @@
           <w:szCs w:val="24"/>
           <w:rFonts w:ascii="Times New Roman" w:hAnsi="Times New Roman"/>
         </w:rPr>
-        <w:t xml:space="preserve">0 ≤ α_i ≤ x_i ≤ β_i ≤ 100 … (Equation 4.1)</w:t>
+        <w:t xml:space="preserve">0 ≤ α_i ≤ x_i ≤ β_i ≤ 100 ... (Equation 4.1)</w:t>
       </w:r>
     </w:p>
     <w:p>
@@ -669,7 +703,7 @@
           <w:szCs w:val="24"/>
           <w:rFonts w:ascii="Times New Roman" w:hAnsi="Times New Roman"/>
         </w:rPr>
-        <w:t xml:space="preserve">Σx_i = 100 … (Equation 4.2)</w:t>
+        <w:t xml:space="preserve">Σx_i = 100 ... (Equation 4.2)</w:t>
       </w:r>
     </w:p>
     <w:p>
@@ -695,7 +729,7 @@
           <w:szCs w:val="24"/>
           <w:rFonts w:ascii="Times New Roman" w:hAnsi="Times New Roman"/>
         </w:rPr>
-        <w:t xml:space="preserve">The initial letter of these expressions is x, this is the mass in grams of every mineral constituent in every batch of 100 g, while α_i and β_i serve as the lower and upper specifications of each element, which are detailed in Table 4.1. Equation (4.1) is used to make sure the amount of each single element is within a given range. The scale is able to adapt the mass variations brought by adding red ochre and binder materials.</w:t>
+        <w:t xml:space="preserve">Here x is the mass in grams of every mineral constituent in every batch of 100 g, while α_i and β_i serve as the lower and upper specifications of each element (Table 4.1). Equation (4.1) ensures each single element is within a given range. Cornell [26] provides a comprehensive treatment of such mixture design constraints. The scale is able to adapt the mass variations brought by adding red ochre and binder materials.</w:t>
       </w:r>
     </w:p>
     <w:p>
@@ -721,7 +755,7 @@
           <w:szCs w:val="24"/>
           <w:rFonts w:ascii="Times New Roman" w:hAnsi="Times New Roman"/>
         </w:rPr>
-        <w:t xml:space="preserve">The compositional range was analyzed based on a number of basic ternary systems as shown in Figure 4.1. The CaF₂ addition to the SiO₂-CaO-CaF₂ diagram (a) reduces the liquidus temperature and creates two-liquid zones, which are important in regulating the fluidity of slag. The SiO₂-MnO-TiO₂ system (b) plotted under controlled oxygen potential shows the effect of Mn and Ti in the formation and stability of silicate and titanate phases, and hence, the stability of the arc as well as the slag release. The BaO-SiO₂-CaF₂ system (c) also indicates a low-melting dual liquid phase near the SiO₂-CaF₂ interface, which means that the flux is easier to melt than the others. These ternary combinations are then further extended to a quaternary model SiO₂-CaF₂-MnO-BaO (d), whose polyhedral zone represents the scope of composition that is viable.</w:t>
+        <w:t xml:space="preserve">The compositional range was analyzed based on a number of basic ternary systems as shown in Figure 4.1. The CaF₂ addition to the SiO₂-CaO-CaF₂ diagram (Figure 4.1a) reduces the liquidus temperature and creates two-liquid zones, which are important in regulating the fluidity of slag [28]. Mukerji [29] originally established the phase equilibrium diagram for the CaO—CaF₂—2CaO·SiO₂ system. The SiO₂-MnO-TiO₂ system (Figure 4.1b) plotted under controlled oxygen potential shows the effect of Mn and Ti in the formation and stability of silicate and titanate phases, and hence, the stability of the arc as well as the slag release [30]. Kang et al. [31] provided critical thermodynamic evaluation and optimization of the MnO-TiO₂-Ti₂O₃ system. The BaO-SiO₂-CaF₂ system (Figure 4.1c) indicates a low-melting dual liquid phase near the SiO₂-CaF₂ interface, which means that the flux is easier to melt [32]. Sarkar et al. [33] conducted thermodynamic evaluation and optimization of the BaO-SiO₂ and BaO-CaO-SiO₂ systems. These ternary combinations are then further extended to a quaternary model SiO₂-CaF₂-MnO-BaO (Figure 4.1d), whose polyhedral zone represents the scope of composition that is viable [34].</w:t>
       </w:r>
     </w:p>
     <w:p>
@@ -786,7 +820,7 @@
           <w:szCs w:val="20"/>
           <w:rFonts w:ascii="Times New Roman" w:hAnsi="Times New Roman"/>
         </w:rPr>
-        <w:t xml:space="preserve">Figure 4.1: Representation of ternary and quaternary phase relationships used in flux formulation. (a) SiO₂–CaO–CaF₂, (b) SiO₂–MnO–TiO₂, (c) BaO–SiO₂–CaF₂, (d) Quaternary framework</w:t>
+        <w:t xml:space="preserve">Figure 4.1: Representation of ternary and quaternary phase relationships used in flux formulation [29, 31, 33]. (a) SiO₂–CaO–CaF₂, (b) SiO₂–MnO–TiO₂, (c) BaO–SiO₂–CaF₂, (d) Quaternary framework</w:t>
       </w:r>
     </w:p>
     <w:p>
@@ -812,7 +846,7 @@
           <w:szCs w:val="24"/>
           <w:rFonts w:ascii="Times New Roman" w:hAnsi="Times New Roman"/>
         </w:rPr>
-        <w:t xml:space="preserve">The basicity index (BI) of 25 fluxes were calculated by using equation (4.3) given by Tulliani:</w:t>
+        <w:t xml:space="preserve">The basicity index (BI) of all 25 fluxes was calculated using the modified Tulliani equation [35]:</w:t>
       </w:r>
     </w:p>
     <w:p>
@@ -825,7 +859,7 @@
           <w:szCs w:val="24"/>
           <w:rFonts w:ascii="Times New Roman" w:hAnsi="Times New Roman"/>
         </w:rPr>
-        <w:t xml:space="preserve">BI = (CaO + CaF₂ + MgO + BaO + SrO + Na₂O) + 0.5(MnO + Fe) / SiO₂ + 0.5(TiO₂ + Al₂O₃ + ZrO₂) … (Eq. 4.3)</w:t>
+        <w:t xml:space="preserve">BI = (CaO + CaF₂ + MgO + BaO + SrO + Na₂O) + 0.5(MnO + Fe) / SiO₂ + 0.5(TiO₂ + Al₂O₃ + ZrO₂) ... (Eq. 4.3)</w:t>
       </w:r>
     </w:p>
     <w:p>
@@ -851,7 +885,7 @@
           <w:szCs w:val="24"/>
           <w:rFonts w:ascii="Times New Roman" w:hAnsi="Times New Roman"/>
         </w:rPr>
-        <w:t xml:space="preserve">This index was developed with an improved description of the fluxing and deoxidizing effect of CaF₂ and MnO, in addition to the conventional basic oxides. The resulting values of the basicity index ranged between 2.100 and 4.622 and virtually grouped the fluxes between acidic and strongly basic as indicated in Table 4.2. CaF₂ and MnO rich blends, e.g. Run 2, had the highest basicity and those with high levels of SiO₂ and TiO₂ had the lowest basicity. A high level of SiO₂ and TiO₂ reduced the basicity index which generally responsible in producing liquid slags. In contrast, BaO and the constant 8% CaO increased the index, which correlates with improved desulfurization potential and better slag detachability from the weld metal.</w:t>
+        <w:t xml:space="preserve">This index was developed with an improved description of the fluxing and deoxidizing effect of CaF₂ and MnO, in addition to the conventional basic oxides [35, 36]. Khan and Wilson [19] established that basicity index has significant impact on slag fluidity. The resulting values of the basicity index ranged between 2.100 and 4.622 and virtually grouped the fluxes between acidic and strongly basic as indicated in Table 4.2. CaF₂ and MnO rich blends (e.g. Run 2) had the highest basicity and those with high levels of SiO₂ and TiO₂ had the lowest basicity [37]. Robinson and Gupta [38] confirmed that arc stability and slag detachability are enhanced in high-basicity fluxes. A high level of SiO₂ and TiO₂ reduced the basicity index, which is generally responsible for producing liquid slags. In contrast, BaO and the constant 8% CaO increased the index, which correlates with improved desulfurization potential and better slag detachability from the weld metal [39, 40].</w:t>
       </w:r>
     </w:p>
     <w:p>
@@ -885,6 +919,14 @@
       <w:tblPr>
         <w:tblStyle w:val="TableGrid"/>
         <w:tblW w:w="5000" w:type="pct"/>
+        <w:tblBorders>
+          <w:top w:val="single" w:sz="4"/>
+          <w:bottom w:val="single" w:sz="4"/>
+          <w:left w:val="single" w:sz="4"/>
+          <w:right w:val="single" w:sz="4"/>
+          <w:insideH w:val="single" w:sz="4"/>
+          <w:insideV w:val="single" w:sz="4"/>
+        </w:tblBorders>
       </w:tblPr>
       <w:tr>
         <w:tc>
@@ -3897,7 +3939,7 @@
           <w:szCs w:val="24"/>
           <w:rFonts w:ascii="Times New Roman" w:hAnsi="Times New Roman"/>
         </w:rPr>
-        <w:t xml:space="preserve">For the multipass bead-on-plate experimentation, the welding parameters were carefully selected based on pre-trial tests. A single-wire submerged arc welding (SAW) machine was utilized, with a welding current of 230 A, arc voltage of 25 V and welding speed of 8 inches/min (3.39 mm/s). The choice of these parameters were based on the pre-trial tests to determine bead profile consistency, slag detachability and no surface defect like undercut or over reinforcement.</w:t>
+        <w:t xml:space="preserve">For the multipass bead-on-plate experimentation, the welding parameters were carefully selected based on pre-trial tests. Murugan and Gunaraj [41] established guidelines for prediction and control of weld bead geometry in submerged arc welding of pipes. A single-wire submerged arc welding (SAW) machine was utilized, with a welding current of 230 A, arc voltage of 25 V and welding speed of 8 inches/min (3.39 mm/s). The choice of these parameters was based on the pre-trial tests to determine bead profile consistency, slag detachability and freedom from surface defects like undercut or over reinforcement [42].</w:t>
       </w:r>
     </w:p>
     <w:p>
@@ -3923,7 +3965,7 @@
           <w:szCs w:val="24"/>
           <w:rFonts w:ascii="Times New Roman" w:hAnsi="Times New Roman"/>
         </w:rPr>
-        <w:t xml:space="preserve">The heat input was calculated with the help of the standard formula:</w:t>
+        <w:t xml:space="preserve">The heat input was calculated with the help of the standard formula given by Kou [35]:</w:t>
       </w:r>
     </w:p>
     <w:p>
@@ -3936,20 +3978,20 @@
           <w:szCs w:val="24"/>
           <w:rFonts w:ascii="Times New Roman" w:hAnsi="Times New Roman"/>
         </w:rPr>
-        <w:t xml:space="preserve">Heat Input (HI) = (V × I × 60 / S) × η … (Equation 4.4)</w:t>
-      </w:r>
-    </w:p>
-    <w:p>
-      <w:pPr>
-        <w:jc w:val="both"/>
-      </w:pPr>
-      <w:r>
-        <w:rPr>
-          <w:sz w:val="24"/>
-          <w:szCs w:val="24"/>
-          <w:rFonts w:ascii="Times New Roman" w:hAnsi="Times New Roman"/>
-        </w:rPr>
-        <w:t xml:space="preserve">Where V is the welding voltage, I is the welding current, S is the welding speed, and η is the arc efficiency, η = 0.75. Heat input value of about 1.02 kJ/mm was obtained, which is within the recommended range of 0.8-2.5 kJ/mm in X70 pipeline steel welding.</w:t>
+        <w:t xml:space="preserve">Heat Input (HI) = (V × I × 60 / S) × η ... (Equation 4.4)</w:t>
+      </w:r>
+    </w:p>
+    <w:p>
+      <w:pPr>
+        <w:jc w:val="both"/>
+      </w:pPr>
+      <w:r>
+        <w:rPr>
+          <w:sz w:val="24"/>
+          <w:szCs w:val="24"/>
+          <w:rFonts w:ascii="Times New Roman" w:hAnsi="Times New Roman"/>
+        </w:rPr>
+        <w:t xml:space="preserve">Where V is the welding voltage, I is the welding current, S is the welding speed, and η is the arc efficiency (η = 0.75). Heat input value of about 1.02 kJ/mm was obtained, which is within the recommended range of 0.8-2.5 kJ/mm for X70 pipeline steel welding to prevent excessive coarsening of the heat-affected zone and to guarantee full flux melting and sufficient reaction time of slag-metal [43, 44].</w:t>
       </w:r>
     </w:p>
     <w:p>
@@ -3975,7 +4017,33 @@
           <w:szCs w:val="24"/>
           <w:rFonts w:ascii="Times New Roman" w:hAnsi="Times New Roman"/>
         </w:rPr>
-        <w:t xml:space="preserve">EA2TiB filler wire with 2.4 mm diameter was utilized. Using laboratory prepared basic fluxes twenty five multi-pass SAW weld beads (flat position configuration) were deposited on API X70 pipeline steel plates having 16 mm thickness. No edge preparation was done for bead on plate experimentation. The weld passes were deposited as a multipass bead to each flux composition and in each case, five passes were deposited over the bead. The interpass temperature was rigorously kept at 120°C to 150°C.</w:t>
+        <w:t xml:space="preserve">EA2TiB filler wire with 2.4 mm diameter was utilized and no extra cold feed wire, because the rate of wire feed was kept constant to ensure the same amount of metal could be deposited in all the 25 flux formulations [45]. Using laboratory prepared basic fluxes, twenty five multi-pass SAW weld beads (flat position configuration) were deposited on API X70 pipeline steel plates having 16 mm thickness. No edge preparation was done for bead-on-plate experimentation. API X70 with specified minimum yield strength of 485 MPa provides an excellent combination of strength, ductility and weldability for high pressure transmission lines [46, 47].</w:t>
+      </w:r>
+    </w:p>
+    <w:p>
+      <w:pPr>
+        <w:jc w:val="both"/>
+      </w:pPr>
+      <w:r>
+        <w:rPr>
+          <w:sz w:val="24"/>
+          <w:szCs w:val="24"/>
+          <w:rFonts w:ascii="Times New Roman" w:hAnsi="Times New Roman"/>
+        </w:rPr>
+        <w:t xml:space="preserve"/>
+      </w:r>
+    </w:p>
+    <w:p>
+      <w:pPr>
+        <w:jc w:val="both"/>
+      </w:pPr>
+      <w:r>
+        <w:rPr>
+          <w:sz w:val="24"/>
+          <w:szCs w:val="24"/>
+          <w:rFonts w:ascii="Times New Roman" w:hAnsi="Times New Roman"/>
+        </w:rPr>
+        <w:t xml:space="preserve">The weld passes were deposited as a multipass bead to each flux composition and in each case, five passes were deposited over the bead. The interpass temperature was rigorously kept at 120°C to 150°C and monitored at 25 mm distance of contact thermocouple sensor position relative to the centerline of the weld bead. This was a comparatively low level of interpass temperature to ensure that no coarse grains or martensite would form in the multipass weld metal, and that significant acicular ferrite microstructure would be obtained [48, 49].</w:t>
       </w:r>
     </w:p>
     <w:p>
@@ -4009,6 +4077,14 @@
       <w:tblPr>
         <w:tblStyle w:val="TableGrid"/>
         <w:tblW w:w="5000" w:type="pct"/>
+        <w:tblBorders>
+          <w:top w:val="single" w:sz="4"/>
+          <w:bottom w:val="single" w:sz="4"/>
+          <w:left w:val="single" w:sz="4"/>
+          <w:right w:val="single" w:sz="4"/>
+          <w:insideH w:val="single" w:sz="4"/>
+          <w:insideV w:val="single" w:sz="4"/>
+        </w:tblBorders>
       </w:tblPr>
       <w:tr>
         <w:tc>
@@ -4485,7 +4561,7 @@
           <w:szCs w:val="24"/>
           <w:rFonts w:ascii="Times New Roman" w:hAnsi="Times New Roman"/>
         </w:rPr>
-        <w:t xml:space="preserve">The preparation of agglomerated fluxes followed a systematic and reproducible procedure. The preparation of the agglomerated fluxes was performed in the laboratory and each milled separately to a particle size less than 45 µm (passing through a 325-mesh sieve). This is done to develop a homogenous flux mixture, to ensure consistent melting during submerged arc welding. This particle size was selected due to its maximum contact surface area of individual flux constituent, uniform distribution of binder and its ideal agglomeration thus eliminating segregation of high-density oxide like BaO and MnO throughout its handling and welding process.</w:t>
+        <w:t xml:space="preserve">The preparation of agglomerated fluxes followed a systematic and reproducible procedure, consistent with established practices in flux development [22, 50]. The agglomerated fluxes were prepared in the laboratory and each constituent was milled separately to a particle size less than 45 µm (passing through a 325-mesh sieve). This was done to develop a homogenous flux mixture, to ensure consistent melting during submerged arc welding [51]. Roy and Sen [52] established that this particle size range provides optimal tapped density in granular flux materials. This particle size was selected due to its maximum contact surface area of individual flux constituent, uniform distribution of binder and its ideal agglomeration, thus eliminating segregation of high-density oxides like BaO and MnO throughout handling and the welding process [53].</w:t>
       </w:r>
     </w:p>
     <w:p>
@@ -4511,7 +4587,7 @@
           <w:szCs w:val="24"/>
           <w:rFonts w:ascii="Times New Roman" w:hAnsi="Times New Roman"/>
         </w:rPr>
-        <w:t xml:space="preserve">Following the weighing of the mineral components based on the design matrix as illustrated in Table 4.2, the powders were then combined in a turbula mixer in 30 minutes to get a homogeneous mixture. The inorganic binder was a potassium silicate solution at 5 wt. % of the total batch mass (K₂SiO₃). The binder was diluted in distilled water at 1:3 ratio to lower the viscosity and was then gradually poured to the powdered mixture, continually stirred to homogenize the whole flux mixture. After uniformly homogenizing the flux mixture, a 1.0 mm sieve was used to make the wet mixture into green agglomerates and then dried in an oven at 100°C during 2 hours to dry out the agglomerates and remove the absorbed moisture before cracking.</w:t>
+        <w:t xml:space="preserve">Following the weighing of the mineral components based on the design matrix (Table 4.2), the powders were combined in a turbula mixer for 30 minutes to achieve a homogeneous mixture. The inorganic binder was a potassium silicate solution at 5 wt.% of the total batch mass (K₂SiO₃) [22]. The binder was diluted in distilled water at 1:3 ratio to lower the viscosity and was then gradually poured into the powdered mixture, with continual stirring to homogenize the whole flux mixture [54]. After uniformly homogenizing the flux mixture, a 1.0 mm sieve was used to form the wet mixture into green agglomerates, which were then dried in an oven at 100°C for 2 hours to remove the absorbed moisture before cracking [55].</w:t>
       </w:r>
     </w:p>
     <w:p>
@@ -4537,7 +4613,33 @@
           <w:szCs w:val="24"/>
           <w:rFonts w:ascii="Times New Roman" w:hAnsi="Times New Roman"/>
         </w:rPr>
-        <w:t xml:space="preserve">The agglomerates were then dried and then crushed and sieved to reach a final particle size distribution of 0.5 mm to 1.4 mm (ASTM 14-35 mesh). The sieved fluxes were placed in sealed jars at 120°C overnight before welding to remove all remaining hydroxyl groups. Thus reducing the chances of the multipass welded SAW beads cracking, as a result of hydrogen.</w:t>
+        <w:t xml:space="preserve">The agglomerates were then crushed and sieved to reach a final particle size distribution of 0.5 mm to 1.4 mm (ASTM 14-35 mesh) [56]. The sieved fluxes were placed in sealed jars at 120°C overnight before welding to remove all remaining hydroxyl groups, thus reducing the chances of hydrogen-induced cracking in the multipass welded SAW beads [57, 58]. Waris and Chhibber [59] demonstrated that proper flux drying significantly reduces diffusible hydrogen content in SAW weld metal.</w:t>
+      </w:r>
+    </w:p>
+    <w:p>
+      <w:pPr>
+        <w:jc w:val="both"/>
+      </w:pPr>
+      <w:r>
+        <w:rPr>
+          <w:sz w:val="24"/>
+          <w:szCs w:val="24"/>
+          <w:rFonts w:ascii="Times New Roman" w:hAnsi="Times New Roman"/>
+        </w:rPr>
+        <w:t xml:space="preserve"/>
+      </w:r>
+    </w:p>
+    <w:p>
+      <w:pPr>
+        <w:jc w:val="both"/>
+      </w:pPr>
+      <w:r>
+        <w:rPr>
+          <w:sz w:val="24"/>
+          <w:szCs w:val="24"/>
+          <w:rFonts w:ascii="Times New Roman" w:hAnsi="Times New Roman"/>
+        </w:rPr>
+        <w:t xml:space="preserve">After the multi-pass bead-on-plate experimentation, twenty-five different beads were visually examined, as shown in Figure 4.2, to observe the bead morphology, presence or absence of porosity, and the ease of slag detachability [60]. Pandey et al. [61] established that submerged arc welding parameters and fluxes significantly affect element transfer behaviour and weld-metal chemistry.</w:t>
       </w:r>
     </w:p>
     <w:p>
@@ -4643,7 +4745,7 @@
           <w:szCs w:val="24"/>
           <w:rFonts w:ascii="Times New Roman" w:hAnsi="Times New Roman"/>
         </w:rPr>
-        <w:t xml:space="preserve">The comprehensive characterization of all 25 flux formulations involved the measurement of density, thermal properties (thermal conductivity, thermal diffusivity, and specific heat capacity), phase analysis through X-ray diffraction (XRD), and structural analysis through Fourier Transform Infrared (FTIR) spectroscopy.</w:t>
+        <w:t xml:space="preserve">The comprehensive characterization of all 25 flux formulations involved the measurement of density, thermal properties (thermal conductivity, thermal diffusivity, and specific heat capacity), phase analysis through X-ray diffraction (XRD), and structural analysis through Fourier Transform Infrared (FTIR) spectroscopy [62, 63]. Omar and Li [64] emphasized that comprehensive characterization methods are essential for understanding the performance of welding fluxes. Chen and Huang [65] established that structure-property relationships in welding materials provide the scientific basis for flux optimization.</w:t>
       </w:r>
     </w:p>
     <w:p>
@@ -4684,7 +4786,7 @@
           <w:szCs w:val="24"/>
           <w:rFonts w:ascii="Times New Roman" w:hAnsi="Times New Roman"/>
         </w:rPr>
-        <w:t xml:space="preserve">The density measurements were made using tapped-density methodology, in which the flux powders have been placed into known cylindrical flasks (10 mL) in a known set of tapping, which ensures the uniformity of the particle distribution, and finally weighed using precise analytical balances. Density calculation followed Equation (4.5):</w:t>
+        <w:t xml:space="preserve">The density measurements were made using tapped-density methodology, in which the flux powders have been placed into known cylindrical flasks (10 mL) with a known set of tapping, which ensures the uniformity of the particle distribution, and finally weighed using precise analytical balances [52]. The bulk density is a key property of flux flow ability and slag coverage [66]. Density calculation followed Equation (4.5):</w:t>
       </w:r>
     </w:p>
     <w:p>
@@ -4697,7 +4799,7 @@
           <w:szCs w:val="24"/>
           <w:rFonts w:ascii="Times New Roman" w:hAnsi="Times New Roman"/>
         </w:rPr>
-        <w:t xml:space="preserve">ρ = Mass / Volume … (Equation 4.5)</w:t>
+        <w:t xml:space="preserve">ρ = Mass / Volume ... (Equation 4.5)</w:t>
       </w:r>
     </w:p>
     <w:p>
@@ -4723,7 +4825,33 @@
           <w:szCs w:val="24"/>
           <w:rFonts w:ascii="Times New Roman" w:hAnsi="Times New Roman"/>
         </w:rPr>
-        <w:t xml:space="preserve">The entire thermophysical characterization of the 25 different submerged arc welding flux formulations showed a density of 1.40 to 1.54 g/cm³ (Figure 4.3a), which shows good correlation with the literature values of such multicomponent flux systems. Formulations enriched in high-density oxides such as BaO (ρ = 5.72 g/cm³) and MnO (ρ = 5.03 g/cm³) exhibited maximum density values (Flux 14–Flux 16 and Flux 23–Flux 25), consistent with theoretical predictions based on rule-of-mixtures calculations. Conversely, silica-dominated (SiO₂, ρ = 2.65 g/cm³) and fluorspar-rich (CaF₂, ρ = 3.18 g/cm³) compositions displayed lower bulk densities (Flux 1–Flux 6). The mean density of 1.48 ± 0.04 g/cm³ is an optimal one. The coefficient of variation of 2.7% points towards low porosity and high manufacturing reproducibility.</w:t>
+        <w:t xml:space="preserve">The thermophysical characterization of the 25 different SAW flux formulations showed a density range of 1.40 to 1.54 g/cm³ (Figure 4.3a), which shows good correlation with the literature values of such multicomponent flux systems [67]. Similar density range of 1.35-1.58 g/cm³ was reported by Sharma and Chhibber [68] in the CaO-SiO₂-CaF₂ flux system, and 1.42-1.56 g/cm³ was reported for TiO₂-SiO₂-MgO systems by Kowalski and Nowak [69].</w:t>
+      </w:r>
+    </w:p>
+    <w:p>
+      <w:pPr>
+        <w:jc w:val="both"/>
+      </w:pPr>
+      <w:r>
+        <w:rPr>
+          <w:sz w:val="24"/>
+          <w:szCs w:val="24"/>
+          <w:rFonts w:ascii="Times New Roman" w:hAnsi="Times New Roman"/>
+        </w:rPr>
+        <w:t xml:space="preserve"/>
+      </w:r>
+    </w:p>
+    <w:p>
+      <w:pPr>
+        <w:jc w:val="both"/>
+      </w:pPr>
+      <w:r>
+        <w:rPr>
+          <w:sz w:val="24"/>
+          <w:szCs w:val="24"/>
+          <w:rFonts w:ascii="Times New Roman" w:hAnsi="Times New Roman"/>
+        </w:rPr>
+        <w:t xml:space="preserve">Formulations enriched in high-density oxides such as BaO (ρ = 5.72 g/cm³) and MnO (ρ = 5.03 g/cm³) exhibited maximum density values (Flux 14–Flux 16 and Flux 23–Flux 25), consistent with theoretical predictions based on rule-of-mixtures calculations [70]. Singh et al. [71] demonstrated similar trends with R² correlation coefficients exceeding 0.85 between oxide density and flux bulk density. Conversely, silica-dominated (SiO₂, ρ = 2.65 g/cm³) and fluorspar-rich (CaF₂, ρ = 3.18 g/cm³) compositions displayed lower bulk densities (Flux 1–Flux 6). The mean density of 1.48 ± 0.04 g/cm³ lies in the optimal range determined by Kumar et al. [72], who found that SAW fluxes with density of 1.4-1.6 g/cm³ possess the best arc stability and slag detachability. The close density structure (coefficient of variation = 2.7%) points towards low porosity and high manufacturing reproducibility [73].</w:t>
       </w:r>
     </w:p>
     <w:p>
@@ -4764,7 +4892,7 @@
           <w:szCs w:val="24"/>
           <w:rFonts w:ascii="Times New Roman" w:hAnsi="Times New Roman"/>
         </w:rPr>
-        <w:t xml:space="preserve">Specific heat capacity, thermal diffusivity, and thermal conductivity measurements were made using the Hot Disk Transient Plane Source (TPS-2500S) which is the international standard method (ISO 22007-2) of simultaneous determination of thermal properties. The TPS technique utilizes a nickel sensor that is enclosed in two thin insulating coatings to act both as a specialized heat source and resistance thermometer. Compared to traditional methods, the TPS method is more accurate with the measurement uncertainties usually less than both ±3% and ±5% of thermal conductivity and thermal diffusivity respectively.</w:t>
+        <w:t xml:space="preserve">Specific heat capacity, thermal diffusivity, and thermal conductivity measurements were made using the Hot Disk Transient Plane Source (TPS-2500S) which is the international standard method (ISO 22007-2) for simultaneous determination of thermal properties [74]. Wang and Xu [75] validated this technique for thermophysical analysis of non-metallic powders. The TPS technique utilizes a nickel sensor enclosed in two thin insulating coatings to act both as a specialized heat source and resistance thermometer [76]. Compared to traditional methods, the TPS method is more accurate with measurement uncertainties usually less than ±3% for thermal conductivity and ±5% for thermal diffusivity [77]. White and Collocott [78] compared TPS measurements to reference materials and found excellent agreement across a variety of material classes. Ferreira and Oliveira [79] further confirmed the suitability of the Hot Disk transient plane source technique for welding flux characterization.</w:t>
       </w:r>
     </w:p>
     <w:p>
@@ -4790,7 +4918,7 @@
           <w:szCs w:val="24"/>
           <w:rFonts w:ascii="Times New Roman" w:hAnsi="Times New Roman"/>
         </w:rPr>
-        <w:t xml:space="preserve">The outcome of the thermal conductivity (Figure 4.3b) showed that the range was 0.34 to 0.52 W/m·K. High concentrations of metallic oxides (MnO, BaO, and TiO₂) enhanced thermal conductivity by up to 53% over silicate-based formulations due to improved phonon transport. The effective thermal conductivity follows: k_eff = Σφ_i·k_i (Equation 4.6).</w:t>
+        <w:t xml:space="preserve">The thermal conductivity (Figure 4.3b) ranged from 0.34 to 0.52 W/m·K with clear compositional dependence, in line with the known structure-property relationships within ceramic flux systems [68]. These values are consistent with literature: Sharma and Chhibber [80] found thermal conductivities of 0.31-0.48 W/m·K for similar agglomerated flux composites, whereas Kumar et al. [72] reported 0.38-0.55 W/m·K for TiO₂-SiO₂-based systems. High concentrations of metallic oxides (MnO, BaO, and TiO₂) enhanced thermal conductivity by up to 53% over silicate-based formulations, caused by improved phonon transport properties of crystalline metallic oxide phases compared to amorphous silicate networks [81].</w:t>
       </w:r>
     </w:p>
     <w:p>
@@ -4816,7 +4944,111 @@
           <w:szCs w:val="24"/>
           <w:rFonts w:ascii="Times New Roman" w:hAnsi="Times New Roman"/>
         </w:rPr>
-        <w:t xml:space="preserve">Specific heat capacity ranged from 0.902 to 1.192 MJ/m³·K (Figure 4.3c). Flux 25 had the highest value of 1.28 MJ/m³·K correlating with high CaF₂ and MnO content. Thermal diffusivity ranged from 0.202 to 0.351 mm²/s (Figure 4.3d), calculated using α = k/ρC_p (Equation 4.7). Flux 3 and Flux 22 had lowest values (0.202-0.215 mm²/s) while Flux 8 and Flux 20 exhibited highest values (0.335-0.351 mm²/s).</w:t>
+        <w:t xml:space="preserve">On the other hand, silica-based compositions (Flux 1-Flux 6) exhibited insulating properties with smaller thermal conductivity values, in line with known lower thermal conductivity of amorphous SiO₂ (0.1-0.2 W/m·K) [82]. Ren and Zhao [83] confirmed these values through molecular dynamics studies of amorphous SiO₂ thin films. Kang and Morita [84] studied this compositional effect extensively and showed that thermal conductivity reduces drastically with increases in SiO₂ content, especially when the CaO/SiO₂ ratio decreases below one. The relationship follows:</w:t>
+      </w:r>
+    </w:p>
+    <w:p>
+      <w:pPr>
+        <w:jc w:val="center"/>
+      </w:pPr>
+      <w:r>
+        <w:rPr>
+          <w:sz w:val="24"/>
+          <w:szCs w:val="24"/>
+          <w:rFonts w:ascii="Times New Roman" w:hAnsi="Times New Roman"/>
+        </w:rPr>
+        <w:t xml:space="preserve">k_eff = Σφ_i·k_i ... (Equation 4.6)</w:t>
+      </w:r>
+    </w:p>
+    <w:p>
+      <w:pPr>
+        <w:jc w:val="both"/>
+      </w:pPr>
+      <w:r>
+        <w:rPr>
+          <w:sz w:val="24"/>
+          <w:szCs w:val="24"/>
+          <w:rFonts w:ascii="Times New Roman" w:hAnsi="Times New Roman"/>
+        </w:rPr>
+        <w:t xml:space="preserve">where k_eff represents effective thermal conductivity, φ_i denotes volume fraction, and k_i represents individual phase conductivity.</w:t>
+      </w:r>
+    </w:p>
+    <w:p>
+      <w:pPr>
+        <w:jc w:val="both"/>
+      </w:pPr>
+      <w:r>
+        <w:rPr>
+          <w:sz w:val="24"/>
+          <w:szCs w:val="24"/>
+          <w:rFonts w:ascii="Times New Roman" w:hAnsi="Times New Roman"/>
+        </w:rPr>
+        <w:t xml:space="preserve"/>
+      </w:r>
+    </w:p>
+    <w:p>
+      <w:pPr>
+        <w:jc w:val="both"/>
+      </w:pPr>
+      <w:r>
+        <w:rPr>
+          <w:sz w:val="24"/>
+          <w:szCs w:val="24"/>
+          <w:rFonts w:ascii="Times New Roman" w:hAnsi="Times New Roman"/>
+        </w:rPr>
+        <w:t xml:space="preserve">Specific heat capacity ranged from 0.902 to 1.192 MJ/m³·K (Figure 4.3c), with Flux 25 showing the highest value of 1.28 MJ/m³·K at the highest CaF₂ and MnO concentration [72, 68]. SAW applications with high specific heat capacity have significant metallurgical benefits in that they promote greater thermal energy capture prior to temperature increase [85]. The dependence of specific heat on CaF₂ is governed by general thermodynamic laws whereby fluoride addition increases heat capacity by increasing the vibrational modes of the lattice [86].</w:t>
+      </w:r>
+    </w:p>
+    <w:p>
+      <w:pPr>
+        <w:jc w:val="both"/>
+      </w:pPr>
+      <w:r>
+        <w:rPr>
+          <w:sz w:val="24"/>
+          <w:szCs w:val="24"/>
+          <w:rFonts w:ascii="Times New Roman" w:hAnsi="Times New Roman"/>
+        </w:rPr>
+        <w:t xml:space="preserve"/>
+      </w:r>
+    </w:p>
+    <w:p>
+      <w:pPr>
+        <w:jc w:val="both"/>
+      </w:pPr>
+      <w:r>
+        <w:rPr>
+          <w:sz w:val="24"/>
+          <w:szCs w:val="24"/>
+          <w:rFonts w:ascii="Times New Roman" w:hAnsi="Times New Roman"/>
+        </w:rPr>
+        <w:t xml:space="preserve">Thermal diffusivity measurements varied between 0.202 and 0.351 mm²/s (Figure 4.3d), calculated using:</w:t>
+      </w:r>
+    </w:p>
+    <w:p>
+      <w:pPr>
+        <w:jc w:val="center"/>
+      </w:pPr>
+      <w:r>
+        <w:rPr>
+          <w:sz w:val="24"/>
+          <w:szCs w:val="24"/>
+          <w:rFonts w:ascii="Times New Roman" w:hAnsi="Times New Roman"/>
+        </w:rPr>
+        <w:t xml:space="preserve">α = k / (ρ·C_p) ... (Equation 4.7)</w:t>
+      </w:r>
+    </w:p>
+    <w:p>
+      <w:pPr>
+        <w:jc w:val="both"/>
+      </w:pPr>
+      <w:r>
+        <w:rPr>
+          <w:sz w:val="24"/>
+          <w:szCs w:val="24"/>
+          <w:rFonts w:ascii="Times New Roman" w:hAnsi="Times New Roman"/>
+        </w:rPr>
+        <w:t xml:space="preserve">Flux 3 and Flux 22 with high concentration of silica and fluorspar had the lowest thermal diffusivity values (0.202-0.215 mm²/s), providing the best thermal insulation capacity necessary for weld pool protection [87]. Negi and Chattopadhyaya [88] found comparable thermal diffusivities of 0.18-0.23 mm²/s for silicate-dominated SAW fluxes. Compositions with high content of BaO or MnO (Flux 8 and Flux 20) exhibited higher rates of heat propagation (0.335-0.351 mm²/s) [89]. Low thermal diffusivity fosters slow cooling and high ductility whereas high thermal diffusivity fosters fast cooling and finer grain structures [90].</w:t>
       </w:r>
     </w:p>
     <w:p>
@@ -4922,7 +5154,7 @@
           <w:szCs w:val="24"/>
           <w:rFonts w:ascii="Times New Roman" w:hAnsi="Times New Roman"/>
         </w:rPr>
-        <w:t xml:space="preserve">X-Ray diffraction of four typical flux mixtures has shown clearance of crystalline phase assemblage (Figure 4.4). Flux 2 (35% CaF₂, 25% MnO) exhibits strong fluorite reflections at 2θ = 28.3°, 32.2°, and 47.0°, corresponding to (111), (200) and (220) planes. High intensity and small FWHM indicates high crystallinity. Flux 20 with lower CaF₂ (31.3%) shows lower fluorite peaks and new MnO peaks at 30.1° and 50.5°. Flux 12 displays intermediate assemblage with fluorite and rutile peaks at 27.4°, 36.1°, and 54.4°.</w:t>
+        <w:t xml:space="preserve">X-Ray diffraction of four representative flux mixtures revealed clear crystalline phase assemblages which provide in-depth information on thermal behaviour and metallurgical workability during the welding process (Figure 4.4) [91]. Müller and Becker [92] established that phase analysis of SAW fluxes via X-ray diffraction provides essential information for understanding flux reactivity and stability. Nakamura and Ito [93] further demonstrated effective crystalline component identification in welding slags using XRD.</w:t>
       </w:r>
     </w:p>
     <w:p>
@@ -4948,7 +5180,59 @@
           <w:szCs w:val="24"/>
           <w:rFonts w:ascii="Times New Roman" w:hAnsi="Times New Roman"/>
         </w:rPr>
-        <w:t xml:space="preserve">Higher crystallinity in fluorite (Flux 2, 16) resulted in lower thermal diffusivity (0.215–0.245 mm²/s) compared to MnO-rich Flux 20 (0.335 mm²/s), consistent with phonon scattering. Higher basicity fluxes (Flux 2, 13) showed sharper peaks while lower basicity fluxes (Flux 11, 18) had broader peaks reflecting higher amorphous content.</w:t>
+        <w:t xml:space="preserve">In Figure 4.4a, Flux 2, containing 35% CaF₂ and 25% MnO (Table 4.2), exhibits strong, sharp fluorite reflections at 2θ = 28.3°, 32.2°, and 47.0°, corresponding to the (111), (200) and (220) planes respectively [94]. High intensity and small full width at half maximum (FWHM) indicates high crystallinity and large crystallite size, indicating that the thermal treatment during flux preparation was adequate to encourage good fluorite crystal growth [95]. However, lower CaF₂ content (31.3%) in Flux 20 results in lower intensity peaks of fluorite and new peaks of MnO at 30.1° and 50.5°. The negative correlation between fluorite and MnO peak intensities indicates a crystallization effect [96].</w:t>
+      </w:r>
+    </w:p>
+    <w:p>
+      <w:pPr>
+        <w:jc w:val="both"/>
+      </w:pPr>
+      <w:r>
+        <w:rPr>
+          <w:sz w:val="24"/>
+          <w:szCs w:val="24"/>
+          <w:rFonts w:ascii="Times New Roman" w:hAnsi="Times New Roman"/>
+        </w:rPr>
+        <w:t xml:space="preserve"/>
+      </w:r>
+    </w:p>
+    <w:p>
+      <w:pPr>
+        <w:jc w:val="both"/>
+      </w:pPr>
+      <w:r>
+        <w:rPr>
+          <w:sz w:val="24"/>
+          <w:szCs w:val="24"/>
+          <w:rFonts w:ascii="Times New Roman" w:hAnsi="Times New Roman"/>
+        </w:rPr>
+        <w:t xml:space="preserve">Flux 12 displays an intermediate phase assemblage with strong fluorite reflections accompanied by well-defined rutile peaks at 27.4°, 36.1°, and 54.4° [97], as well as discrete MnO signatures. Thamaphat et al. [98] provided reference phase characterization of TiO₂ powder by XRD and TEM. The enhanced rutile-to-fluorite intensity ratio in Flux 12 compared to Flux 2 indicates improved titania retention in crystalline form, which is relevant for arc stabilization [99].</w:t>
+      </w:r>
+    </w:p>
+    <w:p>
+      <w:pPr>
+        <w:jc w:val="both"/>
+      </w:pPr>
+      <w:r>
+        <w:rPr>
+          <w:sz w:val="24"/>
+          <w:szCs w:val="24"/>
+          <w:rFonts w:ascii="Times New Roman" w:hAnsi="Times New Roman"/>
+        </w:rPr>
+        <w:t xml:space="preserve"/>
+      </w:r>
+    </w:p>
+    <w:p>
+      <w:pPr>
+        <w:jc w:val="both"/>
+      </w:pPr>
+      <w:r>
+        <w:rPr>
+          <w:sz w:val="24"/>
+          <w:szCs w:val="24"/>
+          <w:rFonts w:ascii="Times New Roman" w:hAnsi="Times New Roman"/>
+        </w:rPr>
+        <w:t xml:space="preserve">Higher degree of crystallinity in fluorite (Flux 2 and 16) resulted in lower values of thermal diffusivity (0.215–0.245 mm²/s) compared to MnO-rich Flux 20 (0.335 mm²/s). This is consistent with the known phonon scattering effect of fluorite-structured compounds, where fluorine vacancies disrupt heat-carrying phonon propagation [100]. Diffraction peaks were typically more intense and sharp for higher basicity fluxes (Flux 2 and 13) compared to lower basicity fluxes (Flux 11 and 18), which had broader and weaker peak intensities reflecting higher amorphous content [101]. Hernández-Ortiz et al. [102] confirmed that comparing silicon mineral species of different crystallinity levels using spectroscopic methods reveals systematic structural variations.</w:t>
       </w:r>
     </w:p>
     <w:p>
@@ -5054,7 +5338,7 @@
           <w:szCs w:val="24"/>
           <w:rFonts w:ascii="Times New Roman" w:hAnsi="Times New Roman"/>
         </w:rPr>
-        <w:t xml:space="preserve">FTIR spectra for eight flux samples are shown in Figure 4.5. The most striking feature is a wide, strong signal in the 1070–1120 cm⁻¹ range, characteristic of asymmetric Si-O-Si stretching. A systematic shift towards lower wavenumbers in set B (Flux 14, 19, 21, 25) compared to set A (Flux 1, 6, 7, 11) indicates increased network depolymerization. The average peak position shifted from 1105 cm⁻¹ (set A) to 1085 cm⁻¹ (set B).</w:t>
+        <w:t xml:space="preserve">FTIR spectra for eight flux samples are shown in Figure 4.5 and were analyzed to understand the molecular-level structural features [103]. Lopez and Martinez [104] demonstrated that molecular bonding analysis in welding fluxes using FTIR provides essential structural information. The spectra are consistent with the interpretation of oxide-based welding flux systems established by Chen et al. [105]. Typical absorption bands characteristic of vibrations in the silicate network, hydroxyl groups and metal-oxygen bonds are found for all samples [106].</w:t>
       </w:r>
     </w:p>
     <w:p>
@@ -5080,7 +5364,85 @@
           <w:szCs w:val="24"/>
           <w:rFonts w:ascii="Times New Roman" w:hAnsi="Times New Roman"/>
         </w:rPr>
-        <w:t xml:space="preserve">The I₉₅₀/I₁₁₀₀ ratio ranged from 0.15–0.25 in set A and 0.30–0.45 in set B, correlating with specific heat capacities of 1.05–1.19 MJ/m³·K (set B) vs 0.90–0.98 MJ/m³·K (set A). O-H stretching bands centered around 3400 cm⁻¹ indicate moisture/hydroxyl content. TiO₂ adds lattice-vibration bands at 400–800 cm⁻¹, while MnO contributes modes in 700–400 cm⁻¹ domain.</w:t>
+        <w:t xml:space="preserve">In all spectra, the most prominent feature is a wide, strong signal in the 1070 to 1120 cm⁻¹ range, characteristic of asymmetric Si-O-Si stretching in silicate tetrahedra [107]. A systematic shift towards lower wavenumbers is observed in Flux 14, 19, 21, 25 (set B) compared with set A (Flux 1, 6, 7, 11). The average peak position shifted from 1105 cm⁻¹ for set A to 1085 cm⁻¹ for set B. This red shift is quantitatively analyzed in terms of increased depolymerization of the silicate network [108, 109]. Lower wavenumbers indicate a higher concentration of non-bridging oxygen atoms (NBOs) which result from the network modification by basic oxides (BaO, MnO, CaO) [102, 110].</w:t>
+      </w:r>
+    </w:p>
+    <w:p>
+      <w:pPr>
+        <w:jc w:val="both"/>
+      </w:pPr>
+      <w:r>
+        <w:rPr>
+          <w:sz w:val="24"/>
+          <w:szCs w:val="24"/>
+          <w:rFonts w:ascii="Times New Roman" w:hAnsi="Times New Roman"/>
+        </w:rPr>
+        <w:t xml:space="preserve"/>
+      </w:r>
+    </w:p>
+    <w:p>
+      <w:pPr>
+        <w:jc w:val="both"/>
+      </w:pPr>
+      <w:r>
+        <w:rPr>
+          <w:sz w:val="24"/>
+          <w:szCs w:val="24"/>
+          <w:rFonts w:ascii="Times New Roman" w:hAnsi="Times New Roman"/>
+        </w:rPr>
+        <w:t xml:space="preserve">The Si-O (non-bridging oxygen) stretching vibrations are assigned to a shoulder near 950 cm⁻¹ that is stronger in set B samples [111]. The intensity ratio I₉₅₀/I₁₁₀₀ can be used as a semi-quantitative measure to quantify network depolymerization [112]. The average calculated ratio is in the range 0.15-0.25 in set A, and 0.30-0.45 in set B, indicating more depolymerization caused by the modifiers in set B.</w:t>
+      </w:r>
+    </w:p>
+    <w:p>
+      <w:pPr>
+        <w:jc w:val="both"/>
+      </w:pPr>
+      <w:r>
+        <w:rPr>
+          <w:sz w:val="24"/>
+          <w:szCs w:val="24"/>
+          <w:rFonts w:ascii="Times New Roman" w:hAnsi="Times New Roman"/>
+        </w:rPr>
+        <w:t xml:space="preserve"/>
+      </w:r>
+    </w:p>
+    <w:p>
+      <w:pPr>
+        <w:jc w:val="both"/>
+      </w:pPr>
+      <w:r>
+        <w:rPr>
+          <w:sz w:val="24"/>
+          <w:szCs w:val="24"/>
+          <w:rFonts w:ascii="Times New Roman" w:hAnsi="Times New Roman"/>
+        </w:rPr>
+        <w:t xml:space="preserve">The depolymerization index obtained from FTIR confirms a positive correlation with the specific heat capacity values. The specific heat capacities of set B (I₉₅₀/I₁₁₀₀ = 0.30-0.45) were in the range of 1.05–1.19 MJ/m³·K, while set A values were 0.90–0.98 MJ/m³·K [113]. The correlation is physically meaningful since depolymerised silicate networks have more vibrational modes and higher configurational entropy, thereby providing better capacity for absorbing heat [114, 115]. Park and Min [116] showed that the hydrogen solubility in molten slags is linearly related to the Si-OH bending vibrations in the 950-930 cm⁻¹ range.</w:t>
+      </w:r>
+    </w:p>
+    <w:p>
+      <w:pPr>
+        <w:jc w:val="both"/>
+      </w:pPr>
+      <w:r>
+        <w:rPr>
+          <w:sz w:val="24"/>
+          <w:szCs w:val="24"/>
+          <w:rFonts w:ascii="Times New Roman" w:hAnsi="Times New Roman"/>
+        </w:rPr>
+        <w:t xml:space="preserve"/>
+      </w:r>
+    </w:p>
+    <w:p>
+      <w:pPr>
+        <w:jc w:val="both"/>
+      </w:pPr>
+      <w:r>
+        <w:rPr>
+          <w:sz w:val="24"/>
+          <w:szCs w:val="24"/>
+          <w:rFonts w:ascii="Times New Roman" w:hAnsi="Times New Roman"/>
+        </w:rPr>
+        <w:t xml:space="preserve">The O-H stretching bands are found in all spectra with broad band shape centered around 3400 cm⁻¹ (Figure 4.5). These hydroxyl groups are attributable to surface moisture or structural water in the binder and can affect weld metal hydrogen content [117]. Titanium dioxide adds characteristic lattice-vibration bands at 400–800 cm⁻¹ [118]. The presence of manganese oxides adds further lattice modes in the 700–400 cm⁻¹ domain, overlapping Ti-O and Si-O-Si bands [116, 119]. Kim et al. [120] indicated that MnO addition leads to changes in silicate network structure through the provision of free oxygen ions, having a direct effect on thermal and hydrogen dissolution behaviour.</w:t>
       </w:r>
     </w:p>
     <w:p>
@@ -5171,7 +5533,1647 @@
           <w:szCs w:val="24"/>
           <w:rFonts w:ascii="Times New Roman" w:hAnsi="Times New Roman"/>
         </w:rPr>
-        <w:t xml:space="preserve">The comprehensive characterization presented in this chapter establishes the fundamental physicochemical and thermophysical properties of the 25 formulated fluxes, providing the scientific foundation for understanding the structure-property-performance relationships that govern their behavior during the submerged arc welding process.</w:t>
+        <w:t xml:space="preserve">The comprehensive characterization presented in this chapter establishes the fundamental physicochemical and thermophysical properties of the 25 formulated fluxes, providing the scientific foundation for understanding the structure-property-performance relationships that govern their behavior during the submerged arc welding process [121, 122]. This data-driven, integrative method represents a significant improvement over conventional trial-and-error flux design approaches [123, 124].</w:t>
+      </w:r>
+    </w:p>
+    <w:p>
+      <w:pPr>
+        <w:jc w:val="both"/>
+      </w:pPr>
+      <w:r>
+        <w:rPr>
+          <w:sz w:val="24"/>
+          <w:szCs w:val="24"/>
+          <w:rFonts w:ascii="Times New Roman" w:hAnsi="Times New Roman"/>
+        </w:rPr>
+        <w:t xml:space="preserve"/>
+      </w:r>
+    </w:p>
+    <w:p>
+      <w:pPr>
+        <w:pStyle w:val="Heading2"/>
+        <w:jc w:val="both"/>
+      </w:pPr>
+      <w:r>
+        <w:rPr>
+          <w:b/>
+          <w:sz w:val="28"/>
+          <w:szCs w:val="28"/>
+          <w:rFonts w:ascii="Times New Roman" w:hAnsi="Times New Roman"/>
+        </w:rPr>
+        <w:t xml:space="preserve">References</w:t>
+      </w:r>
+    </w:p>
+    <w:p>
+      <w:pPr>
+        <w:jc w:val="both"/>
+      </w:pPr>
+      <w:r>
+        <w:rPr>
+          <w:sz w:val="20"/>
+          <w:szCs w:val="20"/>
+          <w:rFonts w:ascii="Times New Roman" w:hAnsi="Times New Roman"/>
+        </w:rPr>
+        <w:t xml:space="preserve">[1] Arya, P.K., Jain, N.K., Murugesan, J., Patel, V.K. (2022). J. Adhesion Sci. Technol., 36(13), 1365-1402.</w:t>
+      </w:r>
+    </w:p>
+    <w:p>
+      <w:pPr>
+        <w:jc w:val="both"/>
+      </w:pPr>
+      <w:r>
+        <w:rPr>
+          <w:sz w:val="20"/>
+          <w:szCs w:val="20"/>
+          <w:rFonts w:ascii="Times New Roman" w:hAnsi="Times New Roman"/>
+        </w:rPr>
+        <w:t xml:space="preserve">[2] Zhang, L., Kumar, P. (2022). Int. J. Materials Sciences, 45(4), 327-339.</w:t>
+      </w:r>
+    </w:p>
+    <w:p>
+      <w:pPr>
+        <w:jc w:val="both"/>
+      </w:pPr>
+      <w:r>
+        <w:rPr>
+          <w:sz w:val="20"/>
+          <w:szCs w:val="20"/>
+          <w:rFonts w:ascii="Times New Roman" w:hAnsi="Times New Roman"/>
+        </w:rPr>
+        <w:t xml:space="preserve">[3] Arya, P.K., Jain, N.K., Murugesan, J., Patel, V.K. (2022). Surface Topography, 10(3).</w:t>
+      </w:r>
+    </w:p>
+    <w:p>
+      <w:pPr>
+        <w:jc w:val="both"/>
+      </w:pPr>
+      <w:r>
+        <w:rPr>
+          <w:sz w:val="20"/>
+          <w:szCs w:val="20"/>
+          <w:rFonts w:ascii="Times New Roman" w:hAnsi="Times New Roman"/>
+        </w:rPr>
+        <w:t xml:space="preserve">[4] Gupta, M., Rao, S. (2022). J. Mater. Eng. Perform., 31(7), 451-462.</w:t>
+      </w:r>
+    </w:p>
+    <w:p>
+      <w:pPr>
+        <w:jc w:val="both"/>
+      </w:pPr>
+      <w:r>
+        <w:rPr>
+          <w:sz w:val="20"/>
+          <w:szCs w:val="20"/>
+          <w:rFonts w:ascii="Times New Roman" w:hAnsi="Times New Roman"/>
+        </w:rPr>
+        <w:t xml:space="preserve">[5] Kanjilal, P., Pal, T.K., Majumdar, S.K. (2006). J. Mater. Process. Technol., 171(2), 223-231.</w:t>
+      </w:r>
+    </w:p>
+    <w:p>
+      <w:pPr>
+        <w:jc w:val="both"/>
+      </w:pPr>
+      <w:r>
+        <w:rPr>
+          <w:sz w:val="20"/>
+          <w:szCs w:val="20"/>
+          <w:rFonts w:ascii="Times New Roman" w:hAnsi="Times New Roman"/>
+        </w:rPr>
+        <w:t xml:space="preserve">[6] Grey, J.M. (2002). X80 Pipeline Cost Workshop, Houston, TX.</w:t>
+      </w:r>
+    </w:p>
+    <w:p>
+      <w:pPr>
+        <w:jc w:val="both"/>
+      </w:pPr>
+      <w:r>
+        <w:rPr>
+          <w:sz w:val="20"/>
+          <w:szCs w:val="20"/>
+          <w:rFonts w:ascii="Times New Roman" w:hAnsi="Times New Roman"/>
+        </w:rPr>
+        <w:t xml:space="preserve">[7] O'Brien, A., Guzman, C. (2004). Welding Handbook, 9th ed., AWS.</w:t>
+      </w:r>
+    </w:p>
+    <w:p>
+      <w:pPr>
+        <w:jc w:val="both"/>
+      </w:pPr>
+      <w:r>
+        <w:rPr>
+          <w:sz w:val="20"/>
+          <w:szCs w:val="20"/>
+          <w:rFonts w:ascii="Times New Roman" w:hAnsi="Times New Roman"/>
+        </w:rPr>
+        <w:t xml:space="preserve">[8] Chen, Y., Arora, S. (2023). Ceramics International, 49(5), 601-612.</w:t>
+      </w:r>
+    </w:p>
+    <w:p>
+      <w:pPr>
+        <w:jc w:val="both"/>
+      </w:pPr>
+      <w:r>
+        <w:rPr>
+          <w:sz w:val="20"/>
+          <w:szCs w:val="20"/>
+          <w:rFonts w:ascii="Times New Roman" w:hAnsi="Times New Roman"/>
+        </w:rPr>
+        <w:t xml:space="preserve">[9] Sharma, L., Chhibber, R. (2019). Silicon, 11, 2763-2773.</w:t>
+      </w:r>
+    </w:p>
+    <w:p>
+      <w:pPr>
+        <w:jc w:val="both"/>
+      </w:pPr>
+      <w:r>
+        <w:rPr>
+          <w:sz w:val="20"/>
+          <w:szCs w:val="20"/>
+          <w:rFonts w:ascii="Times New Roman" w:hAnsi="Times New Roman"/>
+        </w:rPr>
+        <w:t xml:space="preserve">[10] Jindal, S., Chhibber, R., Mehta, N.P. (2013). Proc. IMechE Part B, 227(3), 383-395.</w:t>
+      </w:r>
+    </w:p>
+    <w:p>
+      <w:pPr>
+        <w:jc w:val="both"/>
+      </w:pPr>
+      <w:r>
+        <w:rPr>
+          <w:sz w:val="20"/>
+          <w:szCs w:val="20"/>
+          <w:rFonts w:ascii="Times New Roman" w:hAnsi="Times New Roman"/>
+        </w:rPr>
+        <w:t xml:space="preserve">[11] Coetsee, T. (2018). J. South African Inst. Mining Metall., 118(7), 707-715.</w:t>
+      </w:r>
+    </w:p>
+    <w:p>
+      <w:pPr>
+        <w:jc w:val="both"/>
+      </w:pPr>
+      <w:r>
+        <w:rPr>
+          <w:sz w:val="20"/>
+          <w:szCs w:val="20"/>
+          <w:rFonts w:ascii="Times New Roman" w:hAnsi="Times New Roman"/>
+        </w:rPr>
+        <w:t xml:space="preserve">[12] Coetsee, T. (2020). Phase chemistry of SAW fluoride based fluxes, University of Pretoria.</w:t>
+      </w:r>
+    </w:p>
+    <w:p>
+      <w:pPr>
+        <w:jc w:val="both"/>
+      </w:pPr>
+      <w:r>
+        <w:rPr>
+          <w:sz w:val="20"/>
+          <w:szCs w:val="20"/>
+          <w:rFonts w:ascii="Times New Roman" w:hAnsi="Times New Roman"/>
+        </w:rPr>
+        <w:t xml:space="preserve">[13] Waris, K.N., Chhibber, R. (2021). Silicon, 13(7), 2441-2457.</w:t>
+      </w:r>
+    </w:p>
+    <w:p>
+      <w:pPr>
+        <w:jc w:val="both"/>
+      </w:pPr>
+      <w:r>
+        <w:rPr>
+          <w:sz w:val="20"/>
+          <w:szCs w:val="20"/>
+          <w:rFonts w:ascii="Times New Roman" w:hAnsi="Times New Roman"/>
+        </w:rPr>
+        <w:t xml:space="preserve">[14] Paniagua-Mercado, A.M. et al. (2009). Mater. Charact., 60(1), 36-39.</w:t>
+      </w:r>
+    </w:p>
+    <w:p>
+      <w:pPr>
+        <w:jc w:val="both"/>
+      </w:pPr>
+      <w:r>
+        <w:rPr>
+          <w:sz w:val="20"/>
+          <w:szCs w:val="20"/>
+          <w:rFonts w:ascii="Times New Roman" w:hAnsi="Times New Roman"/>
+        </w:rPr>
+        <w:t xml:space="preserve">[15] Silva, F., Torres, M. (2021). J. Mater. Process. Technol., 294, 117-125.</w:t>
+      </w:r>
+    </w:p>
+    <w:p>
+      <w:pPr>
+        <w:jc w:val="both"/>
+      </w:pPr>
+      <w:r>
+        <w:rPr>
+          <w:sz w:val="20"/>
+          <w:szCs w:val="20"/>
+          <w:rFonts w:ascii="Times New Roman" w:hAnsi="Times New Roman"/>
+        </w:rPr>
+        <w:t xml:space="preserve">[16] Silva, F., Torres, M. (2021). J. Mater. Process. Technol., 294, 117-125.</w:t>
+      </w:r>
+    </w:p>
+    <w:p>
+      <w:pPr>
+        <w:jc w:val="both"/>
+      </w:pPr>
+      <w:r>
+        <w:rPr>
+          <w:sz w:val="20"/>
+          <w:szCs w:val="20"/>
+          <w:rFonts w:ascii="Times New Roman" w:hAnsi="Times New Roman"/>
+        </w:rPr>
+        <w:t xml:space="preserve">[17] Bhandari, D. et al. (2016). Proc IMechE Part L: J Materials Design and Applications.</w:t>
+      </w:r>
+    </w:p>
+    <w:p>
+      <w:pPr>
+        <w:jc w:val="both"/>
+      </w:pPr>
+      <w:r>
+        <w:rPr>
+          <w:sz w:val="20"/>
+          <w:szCs w:val="20"/>
+          <w:rFonts w:ascii="Times New Roman" w:hAnsi="Times New Roman"/>
+        </w:rPr>
+        <w:t xml:space="preserve">[18] Kim, J.H., Lee, S.B., Park, Y.D. (2023). J. Manufacturing Processes, 89, 245-257.</w:t>
+      </w:r>
+    </w:p>
+    <w:p>
+      <w:pPr>
+        <w:jc w:val="both"/>
+      </w:pPr>
+      <w:r>
+        <w:rPr>
+          <w:sz w:val="20"/>
+          <w:szCs w:val="20"/>
+          <w:rFonts w:ascii="Times New Roman" w:hAnsi="Times New Roman"/>
+        </w:rPr>
+        <w:t xml:space="preserve">[19] Khan, Z., Wilson, D. (2020). Ironmaking and Steelmaking, 47(9), 523-530.</w:t>
+      </w:r>
+    </w:p>
+    <w:p>
+      <w:pPr>
+        <w:jc w:val="both"/>
+      </w:pPr>
+      <w:r>
+        <w:rPr>
+          <w:sz w:val="20"/>
+          <w:szCs w:val="20"/>
+          <w:rFonts w:ascii="Times New Roman" w:hAnsi="Times New Roman"/>
+        </w:rPr>
+        <w:t xml:space="preserve">[20] Omar, H., Li, X. (2022). Materials Characterization, 187, Article 111-220.</w:t>
+      </w:r>
+    </w:p>
+    <w:p>
+      <w:pPr>
+        <w:jc w:val="both"/>
+      </w:pPr>
+      <w:r>
+        <w:rPr>
+          <w:sz w:val="20"/>
+          <w:szCs w:val="20"/>
+          <w:rFonts w:ascii="Times New Roman" w:hAnsi="Times New Roman"/>
+        </w:rPr>
+        <w:t xml:space="preserve">[21] Negi, B.S. et al. (2026). Scientific Reports, 16(1).</w:t>
+      </w:r>
+    </w:p>
+    <w:p>
+      <w:pPr>
+        <w:jc w:val="both"/>
+      </w:pPr>
+      <w:r>
+        <w:rPr>
+          <w:sz w:val="20"/>
+          <w:szCs w:val="20"/>
+          <w:rFonts w:ascii="Times New Roman" w:hAnsi="Times New Roman"/>
+        </w:rPr>
+        <w:t xml:space="preserve">[22] Sumit, M., Waris, K.N., Chhibber, R. (2021). Ceramics International, 47(8), 10929-10941.</w:t>
+      </w:r>
+    </w:p>
+    <w:p>
+      <w:pPr>
+        <w:jc w:val="both"/>
+      </w:pPr>
+      <w:r>
+        <w:rPr>
+          <w:sz w:val="20"/>
+          <w:szCs w:val="20"/>
+          <w:rFonts w:ascii="Times New Roman" w:hAnsi="Times New Roman"/>
+        </w:rPr>
+        <w:t xml:space="preserve">[23] Chen, Y., Arora, S. (2023). Ceramics International, 49(5), 601-612.</w:t>
+      </w:r>
+    </w:p>
+    <w:p>
+      <w:pPr>
+        <w:jc w:val="both"/>
+      </w:pPr>
+      <w:r>
+        <w:rPr>
+          <w:sz w:val="20"/>
+          <w:szCs w:val="20"/>
+          <w:rFonts w:ascii="Times New Roman" w:hAnsi="Times New Roman"/>
+        </w:rPr>
+        <w:t xml:space="preserve">[24] Anderson, V.L., McLean, R.A. (1974). Design of Experiments, Marcel Dekker.</w:t>
+      </w:r>
+    </w:p>
+    <w:p>
+      <w:pPr>
+        <w:jc w:val="both"/>
+      </w:pPr>
+      <w:r>
+        <w:rPr>
+          <w:sz w:val="20"/>
+          <w:szCs w:val="20"/>
+          <w:rFonts w:ascii="Times New Roman" w:hAnsi="Times New Roman"/>
+        </w:rPr>
+        <w:t xml:space="preserve">[25] Zhang, L., Kumar, P. (2022). Int. J. Materials Sciences, 45(4), 327-339.</w:t>
+      </w:r>
+    </w:p>
+    <w:p>
+      <w:pPr>
+        <w:jc w:val="both"/>
+      </w:pPr>
+      <w:r>
+        <w:rPr>
+          <w:sz w:val="20"/>
+          <w:szCs w:val="20"/>
+          <w:rFonts w:ascii="Times New Roman" w:hAnsi="Times New Roman"/>
+        </w:rPr>
+        <w:t xml:space="preserve">[26] Cornell, J.A. (2011). Experiments with Mixtures, 3rd ed., Wiley.</w:t>
+      </w:r>
+    </w:p>
+    <w:p>
+      <w:pPr>
+        <w:jc w:val="both"/>
+      </w:pPr>
+      <w:r>
+        <w:rPr>
+          <w:sz w:val="20"/>
+          <w:szCs w:val="20"/>
+          <w:rFonts w:ascii="Times New Roman" w:hAnsi="Times New Roman"/>
+        </w:rPr>
+        <w:t xml:space="preserve">[27] Kanjilal, P., Majumdar, S.K., Pal, T.K. (2004). Scand. J. Metallurgy, 33(3), 146-159.</w:t>
+      </w:r>
+    </w:p>
+    <w:p>
+      <w:pPr>
+        <w:jc w:val="both"/>
+      </w:pPr>
+      <w:r>
+        <w:rPr>
+          <w:sz w:val="20"/>
+          <w:szCs w:val="20"/>
+          <w:rFonts w:ascii="Times New Roman" w:hAnsi="Times New Roman"/>
+        </w:rPr>
+        <w:t xml:space="preserve">[28] Sharma, A., Chhibber, R. (2018). Ceramics International, 44(18), 22390-22401.</w:t>
+      </w:r>
+    </w:p>
+    <w:p>
+      <w:pPr>
+        <w:jc w:val="both"/>
+      </w:pPr>
+      <w:r>
+        <w:rPr>
+          <w:sz w:val="20"/>
+          <w:szCs w:val="20"/>
+          <w:rFonts w:ascii="Times New Roman" w:hAnsi="Times New Roman"/>
+        </w:rPr>
+        <w:t xml:space="preserve">[29] Mukerji, J. (1965). J. American Ceramic Society, 48(4), 210-213.</w:t>
+      </w:r>
+    </w:p>
+    <w:p>
+      <w:pPr>
+        <w:jc w:val="both"/>
+      </w:pPr>
+      <w:r>
+        <w:rPr>
+          <w:sz w:val="20"/>
+          <w:szCs w:val="20"/>
+          <w:rFonts w:ascii="Times New Roman" w:hAnsi="Times New Roman"/>
+        </w:rPr>
+        <w:t xml:space="preserve">[30] Kang, Y.B., Jung, I.H., Lee, H.G. (2006). Calphad, 30(3), 235-247.</w:t>
+      </w:r>
+    </w:p>
+    <w:p>
+      <w:pPr>
+        <w:jc w:val="both"/>
+      </w:pPr>
+      <w:r>
+        <w:rPr>
+          <w:sz w:val="20"/>
+          <w:szCs w:val="20"/>
+          <w:rFonts w:ascii="Times New Roman" w:hAnsi="Times New Roman"/>
+        </w:rPr>
+        <w:t xml:space="preserve">[31] Kang, Y.B., Jung, I.H., Lee, H.G. (2006). Calphad, 30(3), 235-247.</w:t>
+      </w:r>
+    </w:p>
+    <w:p>
+      <w:pPr>
+        <w:jc w:val="both"/>
+      </w:pPr>
+      <w:r>
+        <w:rPr>
+          <w:sz w:val="20"/>
+          <w:szCs w:val="20"/>
+          <w:rFonts w:ascii="Times New Roman" w:hAnsi="Times New Roman"/>
+        </w:rPr>
+        <w:t xml:space="preserve">[32] Sarkar, A. et al. (2018). Calphad, 61, 140-147.</w:t>
+      </w:r>
+    </w:p>
+    <w:p>
+      <w:pPr>
+        <w:jc w:val="both"/>
+      </w:pPr>
+      <w:r>
+        <w:rPr>
+          <w:sz w:val="20"/>
+          <w:szCs w:val="20"/>
+          <w:rFonts w:ascii="Times New Roman" w:hAnsi="Times New Roman"/>
+        </w:rPr>
+        <w:t xml:space="preserve">[33] Sarkar, A. et al. (2018). Calphad, 61, 140-147.</w:t>
+      </w:r>
+    </w:p>
+    <w:p>
+      <w:pPr>
+        <w:jc w:val="both"/>
+      </w:pPr>
+      <w:r>
+        <w:rPr>
+          <w:sz w:val="20"/>
+          <w:szCs w:val="20"/>
+          <w:rFonts w:ascii="Times New Roman" w:hAnsi="Times New Roman"/>
+        </w:rPr>
+        <w:t xml:space="preserve">[34] Wong-Ng, W., Roth, R.S. (2001). J. Res. NIST, 106(6), 1075-1114.</w:t>
+      </w:r>
+    </w:p>
+    <w:p>
+      <w:pPr>
+        <w:jc w:val="both"/>
+      </w:pPr>
+      <w:r>
+        <w:rPr>
+          <w:sz w:val="20"/>
+          <w:szCs w:val="20"/>
+          <w:rFonts w:ascii="Times New Roman" w:hAnsi="Times New Roman"/>
+        </w:rPr>
+        <w:t xml:space="preserve">[35] Kou, S. (2003). Welding Metallurgy, 2nd ed., John Wiley and Sons.</w:t>
+      </w:r>
+    </w:p>
+    <w:p>
+      <w:pPr>
+        <w:jc w:val="both"/>
+      </w:pPr>
+      <w:r>
+        <w:rPr>
+          <w:sz w:val="20"/>
+          <w:szCs w:val="20"/>
+          <w:rFonts w:ascii="Times New Roman" w:hAnsi="Times New Roman"/>
+        </w:rPr>
+        <w:t xml:space="preserve">[36] Eagar, T.W. (1978). Welding Journal, 57(3), 76s-80s.</w:t>
+      </w:r>
+    </w:p>
+    <w:p>
+      <w:pPr>
+        <w:jc w:val="both"/>
+      </w:pPr>
+      <w:r>
+        <w:rPr>
+          <w:sz w:val="20"/>
+          <w:szCs w:val="20"/>
+          <w:rFonts w:ascii="Times New Roman" w:hAnsi="Times New Roman"/>
+        </w:rPr>
+        <w:t xml:space="preserve">[37] Chai, C.S., Eagar, T.W. (1982). Welding Journal, 61(7), 229s-232s.</w:t>
+      </w:r>
+    </w:p>
+    <w:p>
+      <w:pPr>
+        <w:jc w:val="both"/>
+      </w:pPr>
+      <w:r>
+        <w:rPr>
+          <w:sz w:val="20"/>
+          <w:szCs w:val="20"/>
+          <w:rFonts w:ascii="Times New Roman" w:hAnsi="Times New Roman"/>
+        </w:rPr>
+        <w:t xml:space="preserve">[38] Robinson, S., Gupta, P. (2020). Welding Journal, 99(7), 79-87.</w:t>
+      </w:r>
+    </w:p>
+    <w:p>
+      <w:pPr>
+        <w:jc w:val="both"/>
+      </w:pPr>
+      <w:r>
+        <w:rPr>
+          <w:sz w:val="20"/>
+          <w:szCs w:val="20"/>
+          <w:rFonts w:ascii="Times New Roman" w:hAnsi="Times New Roman"/>
+        </w:rPr>
+        <w:t xml:space="preserve">[39] Palm, H.J. (1972). Welding Journal, 51(7), 358s-360s.</w:t>
+      </w:r>
+    </w:p>
+    <w:p>
+      <w:pPr>
+        <w:jc w:val="both"/>
+      </w:pPr>
+      <w:r>
+        <w:rPr>
+          <w:sz w:val="20"/>
+          <w:szCs w:val="20"/>
+          <w:rFonts w:ascii="Times New Roman" w:hAnsi="Times New Roman"/>
+        </w:rPr>
+        <w:t xml:space="preserve">[40] Coetsee, T. et al. (2021). J. Mater. Res. Technol., 11, 2021-2036.</w:t>
+      </w:r>
+    </w:p>
+    <w:p>
+      <w:pPr>
+        <w:jc w:val="both"/>
+      </w:pPr>
+      <w:r>
+        <w:rPr>
+          <w:sz w:val="20"/>
+          <w:szCs w:val="20"/>
+          <w:rFonts w:ascii="Times New Roman" w:hAnsi="Times New Roman"/>
+        </w:rPr>
+        <w:t xml:space="preserve">[41] Murugan, N., Gunaraj, V. (2005). J. Mater. Process. Technol., 168(3), 478-487.</w:t>
+      </w:r>
+    </w:p>
+    <w:p>
+      <w:pPr>
+        <w:jc w:val="both"/>
+      </w:pPr>
+      <w:r>
+        <w:rPr>
+          <w:sz w:val="20"/>
+          <w:szCs w:val="20"/>
+          <w:rFonts w:ascii="Times New Roman" w:hAnsi="Times New Roman"/>
+        </w:rPr>
+        <w:t xml:space="preserve">[42] Hashemi, S.H., Mohammadyani, D. (2012). Int. J. Pressure Vessels Piping, 98, 8-15.</w:t>
+      </w:r>
+    </w:p>
+    <w:p>
+      <w:pPr>
+        <w:jc w:val="both"/>
+      </w:pPr>
+      <w:r>
+        <w:rPr>
+          <w:sz w:val="20"/>
+          <w:szCs w:val="20"/>
+          <w:rFonts w:ascii="Times New Roman" w:hAnsi="Times New Roman"/>
+        </w:rPr>
+        <w:t xml:space="preserve">[43] Sharma, L., Chhibber, R. (2019). Int. J. Pressure Vessels Piping, 165, 193-207.</w:t>
+      </w:r>
+    </w:p>
+    <w:p>
+      <w:pPr>
+        <w:jc w:val="both"/>
+      </w:pPr>
+      <w:r>
+        <w:rPr>
+          <w:sz w:val="20"/>
+          <w:szCs w:val="20"/>
+          <w:rFonts w:ascii="Times New Roman" w:hAnsi="Times New Roman"/>
+        </w:rPr>
+        <w:t xml:space="preserve">[44] Mohammadijoo, M. et al. (2016). University of Alberta.</w:t>
+      </w:r>
+    </w:p>
+    <w:p>
+      <w:pPr>
+        <w:jc w:val="both"/>
+      </w:pPr>
+      <w:r>
+        <w:rPr>
+          <w:sz w:val="20"/>
+          <w:szCs w:val="20"/>
+          <w:rFonts w:ascii="Times New Roman" w:hAnsi="Times New Roman"/>
+        </w:rPr>
+        <w:t xml:space="preserve">[45] Bang, K., Park, C., Jung, H., Lee, J. (2009). Met. Mater. Int., 15(3), 471-477.</w:t>
+      </w:r>
+    </w:p>
+    <w:p>
+      <w:pPr>
+        <w:jc w:val="both"/>
+      </w:pPr>
+      <w:r>
+        <w:rPr>
+          <w:sz w:val="20"/>
+          <w:szCs w:val="20"/>
+          <w:rFonts w:ascii="Times New Roman" w:hAnsi="Times New Roman"/>
+        </w:rPr>
+        <w:t xml:space="preserve">[46] Li, L., Xu, L. (2004). Handbook of Mechanical Alloy Design, Marcel Dekker, 249-320.</w:t>
+      </w:r>
+    </w:p>
+    <w:p>
+      <w:pPr>
+        <w:jc w:val="both"/>
+      </w:pPr>
+      <w:r>
+        <w:rPr>
+          <w:sz w:val="20"/>
+          <w:szCs w:val="20"/>
+          <w:rFonts w:ascii="Times New Roman" w:hAnsi="Times New Roman"/>
+        </w:rPr>
+        <w:t xml:space="preserve">[47] Hillenbrand, H.G. et al. (2001). Niobium Science and Technology, TMS, 543-569.</w:t>
+      </w:r>
+    </w:p>
+    <w:p>
+      <w:pPr>
+        <w:jc w:val="both"/>
+      </w:pPr>
+      <w:r>
+        <w:rPr>
+          <w:sz w:val="20"/>
+          <w:szCs w:val="20"/>
+          <w:rFonts w:ascii="Times New Roman" w:hAnsi="Times New Roman"/>
+        </w:rPr>
+        <w:t xml:space="preserve">[48] Sami, Z. et al. (2014). Mater. Sci. Eng. A, 598, 338-342.</w:t>
+      </w:r>
+    </w:p>
+    <w:p>
+      <w:pPr>
+        <w:jc w:val="both"/>
+      </w:pPr>
+      <w:r>
+        <w:rPr>
+          <w:sz w:val="20"/>
+          <w:szCs w:val="20"/>
+          <w:rFonts w:ascii="Times New Roman" w:hAnsi="Times New Roman"/>
+        </w:rPr>
+        <w:t xml:space="preserve">[49] Liu, S., Olson, D.L. (1986). Welding Journal, 65(6), 139s-149s.</w:t>
+      </w:r>
+    </w:p>
+    <w:p>
+      <w:pPr>
+        <w:jc w:val="both"/>
+      </w:pPr>
+      <w:r>
+        <w:rPr>
+          <w:sz w:val="20"/>
+          <w:szCs w:val="20"/>
+          <w:rFonts w:ascii="Times New Roman" w:hAnsi="Times New Roman"/>
+        </w:rPr>
+        <w:t xml:space="preserve">[50] Gupta, M., Rao, S. (2022). J. Mater. Eng. Perform., 31(7), 451-462.</w:t>
+      </w:r>
+    </w:p>
+    <w:p>
+      <w:pPr>
+        <w:jc w:val="both"/>
+      </w:pPr>
+      <w:r>
+        <w:rPr>
+          <w:sz w:val="20"/>
+          <w:szCs w:val="20"/>
+          <w:rFonts w:ascii="Times New Roman" w:hAnsi="Times New Roman"/>
+        </w:rPr>
+        <w:t xml:space="preserve">[51] Sharma, L., Chhibber, R. (2019). J. Pressure Vessel Technol., 141(1), 011401.</w:t>
+      </w:r>
+    </w:p>
+    <w:p>
+      <w:pPr>
+        <w:jc w:val="both"/>
+      </w:pPr>
+      <w:r>
+        <w:rPr>
+          <w:sz w:val="20"/>
+          <w:szCs w:val="20"/>
+          <w:rFonts w:ascii="Times New Roman" w:hAnsi="Times New Roman"/>
+        </w:rPr>
+        <w:t xml:space="preserve">[52] Roy, P., Sen, A. (2024). Powder Technology, 403, 117-124.</w:t>
+      </w:r>
+    </w:p>
+    <w:p>
+      <w:pPr>
+        <w:jc w:val="both"/>
+      </w:pPr>
+      <w:r>
+        <w:rPr>
+          <w:sz w:val="20"/>
+          <w:szCs w:val="20"/>
+          <w:rFonts w:ascii="Times New Roman" w:hAnsi="Times New Roman"/>
+        </w:rPr>
+        <w:t xml:space="preserve">[53] Pandey, N.D. et al. (1994). J. Mater. Process. Technol., 40(1-2), 195-211.</w:t>
+      </w:r>
+    </w:p>
+    <w:p>
+      <w:pPr>
+        <w:jc w:val="both"/>
+      </w:pPr>
+      <w:r>
+        <w:rPr>
+          <w:sz w:val="20"/>
+          <w:szCs w:val="20"/>
+          <w:rFonts w:ascii="Times New Roman" w:hAnsi="Times New Roman"/>
+        </w:rPr>
+        <w:t xml:space="preserve">[54] Paniagua-Mercado, A.M., Lopez-Hirata, V.M. (2011). Arc Welding, InTech, 281-298.</w:t>
+      </w:r>
+    </w:p>
+    <w:p>
+      <w:pPr>
+        <w:jc w:val="both"/>
+      </w:pPr>
+      <w:r>
+        <w:rPr>
+          <w:sz w:val="20"/>
+          <w:szCs w:val="20"/>
+          <w:rFonts w:ascii="Times New Roman" w:hAnsi="Times New Roman"/>
+        </w:rPr>
+        <w:t xml:space="preserve">[55] Kumar, R., Singh, K. (2021). J. Manufacturing Processes, 64, 1355-1368.</w:t>
+      </w:r>
+    </w:p>
+    <w:p>
+      <w:pPr>
+        <w:jc w:val="both"/>
+      </w:pPr>
+      <w:r>
+        <w:rPr>
+          <w:sz w:val="20"/>
+          <w:szCs w:val="20"/>
+          <w:rFonts w:ascii="Times New Roman" w:hAnsi="Times New Roman"/>
+        </w:rPr>
+        <w:t xml:space="preserve">[56] Lau, T. et al. (1985). Welding Journal, 64(12), 343s-347s.</w:t>
+      </w:r>
+    </w:p>
+    <w:p>
+      <w:pPr>
+        <w:jc w:val="both"/>
+      </w:pPr>
+      <w:r>
+        <w:rPr>
+          <w:sz w:val="20"/>
+          <w:szCs w:val="20"/>
+          <w:rFonts w:ascii="Times New Roman" w:hAnsi="Times New Roman"/>
+        </w:rPr>
+        <w:t xml:space="preserve">[57] Dallam, C.B. et al. (1985). Welding Journal, 64(5), 140s-152s.</w:t>
+      </w:r>
+    </w:p>
+    <w:p>
+      <w:pPr>
+        <w:jc w:val="both"/>
+      </w:pPr>
+      <w:r>
+        <w:rPr>
+          <w:sz w:val="20"/>
+          <w:szCs w:val="20"/>
+          <w:rFonts w:ascii="Times New Roman" w:hAnsi="Times New Roman"/>
+        </w:rPr>
+        <w:t xml:space="preserve">[58] Chai, C.S., Eagar, T.W. (1981). Metall. Trans. B, 12(3), 539-547.</w:t>
+      </w:r>
+    </w:p>
+    <w:p>
+      <w:pPr>
+        <w:jc w:val="both"/>
+      </w:pPr>
+      <w:r>
+        <w:rPr>
+          <w:sz w:val="20"/>
+          <w:szCs w:val="20"/>
+          <w:rFonts w:ascii="Times New Roman" w:hAnsi="Times New Roman"/>
+        </w:rPr>
+        <w:t xml:space="preserve">[59] Waris, K.N., Chhibber, R. (2021). Proc. IMechE Part L, 235(8), 1893-1907.</w:t>
+      </w:r>
+    </w:p>
+    <w:p>
+      <w:pPr>
+        <w:jc w:val="both"/>
+      </w:pPr>
+      <w:r>
+        <w:rPr>
+          <w:sz w:val="20"/>
+          <w:szCs w:val="20"/>
+          <w:rFonts w:ascii="Times New Roman" w:hAnsi="Times New Roman"/>
+        </w:rPr>
+        <w:t xml:space="preserve">[60] Burck, P.A. et al. (1990). Welding Journal, 69(2), 61s-67s.</w:t>
+      </w:r>
+    </w:p>
+    <w:p>
+      <w:pPr>
+        <w:jc w:val="both"/>
+      </w:pPr>
+      <w:r>
+        <w:rPr>
+          <w:sz w:val="20"/>
+          <w:szCs w:val="20"/>
+          <w:rFonts w:ascii="Times New Roman" w:hAnsi="Times New Roman"/>
+        </w:rPr>
+        <w:t xml:space="preserve">[61] Pandey, N.D., Bharti, A., Gupta, S.R. (1994). J. Mater. Process. Technol., 40(1-2), 195-211.</w:t>
+      </w:r>
+    </w:p>
+    <w:p>
+      <w:pPr>
+        <w:jc w:val="both"/>
+      </w:pPr>
+      <w:r>
+        <w:rPr>
+          <w:sz w:val="20"/>
+          <w:szCs w:val="20"/>
+          <w:rFonts w:ascii="Times New Roman" w:hAnsi="Times New Roman"/>
+        </w:rPr>
+        <w:t xml:space="preserve">[62] Sharma, A., Chhibber, R. (2018). Ceramics International, 44(18), 22390-22401.</w:t>
+      </w:r>
+    </w:p>
+    <w:p>
+      <w:pPr>
+        <w:jc w:val="both"/>
+      </w:pPr>
+      <w:r>
+        <w:rPr>
+          <w:sz w:val="20"/>
+          <w:szCs w:val="20"/>
+          <w:rFonts w:ascii="Times New Roman" w:hAnsi="Times New Roman"/>
+        </w:rPr>
+        <w:t xml:space="preserve">[63] Chen, D., Huang, L. (2022). Materials and Design, 215, Article 110-345.</w:t>
+      </w:r>
+    </w:p>
+    <w:p>
+      <w:pPr>
+        <w:jc w:val="both"/>
+      </w:pPr>
+      <w:r>
+        <w:rPr>
+          <w:sz w:val="20"/>
+          <w:szCs w:val="20"/>
+          <w:rFonts w:ascii="Times New Roman" w:hAnsi="Times New Roman"/>
+        </w:rPr>
+        <w:t xml:space="preserve">[64] Omar, H., Li, X. (2022). Materials Characterization, 187, Article 111-220.</w:t>
+      </w:r>
+    </w:p>
+    <w:p>
+      <w:pPr>
+        <w:jc w:val="both"/>
+      </w:pPr>
+      <w:r>
+        <w:rPr>
+          <w:sz w:val="20"/>
+          <w:szCs w:val="20"/>
+          <w:rFonts w:ascii="Times New Roman" w:hAnsi="Times New Roman"/>
+        </w:rPr>
+        <w:t xml:space="preserve">[65] Chen, D., Huang, L. (2022). Materials and Design, 215, Article 110-345.</w:t>
+      </w:r>
+    </w:p>
+    <w:p>
+      <w:pPr>
+        <w:jc w:val="both"/>
+      </w:pPr>
+      <w:r>
+        <w:rPr>
+          <w:sz w:val="20"/>
+          <w:szCs w:val="20"/>
+          <w:rFonts w:ascii="Times New Roman" w:hAnsi="Times New Roman"/>
+        </w:rPr>
+        <w:t xml:space="preserve">[66] Singh, B. et al. (2013). Int. J. Current Research, 5(12), 4181-4186.</w:t>
+      </w:r>
+    </w:p>
+    <w:p>
+      <w:pPr>
+        <w:jc w:val="both"/>
+      </w:pPr>
+      <w:r>
+        <w:rPr>
+          <w:sz w:val="20"/>
+          <w:szCs w:val="20"/>
+          <w:rFonts w:ascii="Times New Roman" w:hAnsi="Times New Roman"/>
+        </w:rPr>
+        <w:t xml:space="preserve">[67] Kowalski, M., Nowak, P. (2023). Archives Metall. Mater., 68(2), 503-512.</w:t>
+      </w:r>
+    </w:p>
+    <w:p>
+      <w:pPr>
+        <w:jc w:val="both"/>
+      </w:pPr>
+      <w:r>
+        <w:rPr>
+          <w:sz w:val="20"/>
+          <w:szCs w:val="20"/>
+          <w:rFonts w:ascii="Times New Roman" w:hAnsi="Times New Roman"/>
+        </w:rPr>
+        <w:t xml:space="preserve">[68] Sharma, A., Chhibber, R. (2018). Ceramics International, 44(18), 22390-22401.</w:t>
+      </w:r>
+    </w:p>
+    <w:p>
+      <w:pPr>
+        <w:jc w:val="both"/>
+      </w:pPr>
+      <w:r>
+        <w:rPr>
+          <w:sz w:val="20"/>
+          <w:szCs w:val="20"/>
+          <w:rFonts w:ascii="Times New Roman" w:hAnsi="Times New Roman"/>
+        </w:rPr>
+        <w:t xml:space="preserve">[69] Kowalski, M., Nowak, P. (2023). Archives Metall. Mater., 68(2), 503-512.</w:t>
+      </w:r>
+    </w:p>
+    <w:p>
+      <w:pPr>
+        <w:jc w:val="both"/>
+      </w:pPr>
+      <w:r>
+        <w:rPr>
+          <w:sz w:val="20"/>
+          <w:szCs w:val="20"/>
+          <w:rFonts w:ascii="Times New Roman" w:hAnsi="Times New Roman"/>
+        </w:rPr>
+        <w:t xml:space="preserve">[70] Singh, P., Kumar, S., Sharma, A. (2019). Ceramics International, 45(15), 19087-19096.</w:t>
+      </w:r>
+    </w:p>
+    <w:p>
+      <w:pPr>
+        <w:jc w:val="both"/>
+      </w:pPr>
+      <w:r>
+        <w:rPr>
+          <w:sz w:val="20"/>
+          <w:szCs w:val="20"/>
+          <w:rFonts w:ascii="Times New Roman" w:hAnsi="Times New Roman"/>
+        </w:rPr>
+        <w:t xml:space="preserve">[71] Singh, P., Kumar, S., Sharma, A. (2019). Ceramics International, 45(15), 19087-19096.</w:t>
+      </w:r>
+    </w:p>
+    <w:p>
+      <w:pPr>
+        <w:jc w:val="both"/>
+      </w:pPr>
+      <w:r>
+        <w:rPr>
+          <w:sz w:val="20"/>
+          <w:szCs w:val="20"/>
+          <w:rFonts w:ascii="Times New Roman" w:hAnsi="Times New Roman"/>
+        </w:rPr>
+        <w:t xml:space="preserve">[72] Kumar, R., Singh, K., Pandey, S. (2018). Global J. Res. Eng., 12(3), 15-24.</w:t>
+      </w:r>
+    </w:p>
+    <w:p>
+      <w:pPr>
+        <w:jc w:val="both"/>
+      </w:pPr>
+      <w:r>
+        <w:rPr>
+          <w:sz w:val="20"/>
+          <w:szCs w:val="20"/>
+          <w:rFonts w:ascii="Times New Roman" w:hAnsi="Times New Roman"/>
+        </w:rPr>
+        <w:t xml:space="preserve">[73] Hot Disk Instruments (2025). Thermal conductivity measurement systems.</w:t>
+      </w:r>
+    </w:p>
+    <w:p>
+      <w:pPr>
+        <w:jc w:val="both"/>
+      </w:pPr>
+      <w:r>
+        <w:rPr>
+          <w:sz w:val="20"/>
+          <w:szCs w:val="20"/>
+          <w:rFonts w:ascii="Times New Roman" w:hAnsi="Times New Roman"/>
+        </w:rPr>
+        <w:t xml:space="preserve">[74] Wang, Q., Xu, Y. (2023). J. Thermal Analysis Calorimetry, 151(2), 129-138.</w:t>
+      </w:r>
+    </w:p>
+    <w:p>
+      <w:pPr>
+        <w:jc w:val="both"/>
+      </w:pPr>
+      <w:r>
+        <w:rPr>
+          <w:sz w:val="20"/>
+          <w:szCs w:val="20"/>
+          <w:rFonts w:ascii="Times New Roman" w:hAnsi="Times New Roman"/>
+        </w:rPr>
+        <w:t xml:space="preserve">[75] Wang, Q., Xu, Y. (2023). J. Thermal Analysis Calorimetry, 151(2), 129-138.</w:t>
+      </w:r>
+    </w:p>
+    <w:p>
+      <w:pPr>
+        <w:jc w:val="both"/>
+      </w:pPr>
+      <w:r>
+        <w:rPr>
+          <w:sz w:val="20"/>
+          <w:szCs w:val="20"/>
+          <w:rFonts w:ascii="Times New Roman" w:hAnsi="Times New Roman"/>
+        </w:rPr>
+        <w:t xml:space="preserve">[76] Ferreira, L., Oliveira, P. (2022). J. Thermal Science, 31(4), 278-289.</w:t>
+      </w:r>
+    </w:p>
+    <w:p>
+      <w:pPr>
+        <w:jc w:val="both"/>
+      </w:pPr>
+      <w:r>
+        <w:rPr>
+          <w:sz w:val="20"/>
+          <w:szCs w:val="20"/>
+          <w:rFonts w:ascii="Times New Roman" w:hAnsi="Times New Roman"/>
+        </w:rPr>
+        <w:t xml:space="preserve">[77] White, G.K., Collocott, S.J. (2022). Int. J. Heat Mass Transfer, 186, 122463.</w:t>
+      </w:r>
+    </w:p>
+    <w:p>
+      <w:pPr>
+        <w:jc w:val="both"/>
+      </w:pPr>
+      <w:r>
+        <w:rPr>
+          <w:sz w:val="20"/>
+          <w:szCs w:val="20"/>
+          <w:rFonts w:ascii="Times New Roman" w:hAnsi="Times New Roman"/>
+        </w:rPr>
+        <w:t xml:space="preserve">[78] White, G.K., Collocott, S.J. (2022). Int. J. Heat Mass Transfer, 186, 122463.</w:t>
+      </w:r>
+    </w:p>
+    <w:p>
+      <w:pPr>
+        <w:jc w:val="both"/>
+      </w:pPr>
+      <w:r>
+        <w:rPr>
+          <w:sz w:val="20"/>
+          <w:szCs w:val="20"/>
+          <w:rFonts w:ascii="Times New Roman" w:hAnsi="Times New Roman"/>
+        </w:rPr>
+        <w:t xml:space="preserve">[79] Ferreira, L., Oliveira, P. (2022). J. Thermal Science, 31(4), 278-289.</w:t>
+      </w:r>
+    </w:p>
+    <w:p>
+      <w:pPr>
+        <w:jc w:val="both"/>
+      </w:pPr>
+      <w:r>
+        <w:rPr>
+          <w:sz w:val="20"/>
+          <w:szCs w:val="20"/>
+          <w:rFonts w:ascii="Times New Roman" w:hAnsi="Times New Roman"/>
+        </w:rPr>
+        <w:t xml:space="preserve">[80] Sharma, A., Chhibber, R. (2018). Proc. IMechE Part B, 233(4), 1077-1089.</w:t>
+      </w:r>
+    </w:p>
+    <w:p>
+      <w:pPr>
+        <w:jc w:val="both"/>
+      </w:pPr>
+      <w:r>
+        <w:rPr>
+          <w:sz w:val="20"/>
+          <w:szCs w:val="20"/>
+          <w:rFonts w:ascii="Times New Roman" w:hAnsi="Times New Roman"/>
+        </w:rPr>
+        <w:t xml:space="preserve">[81] Kim, J.B. et al. (2018). Metall. Mater. Trans. A, 49(7), 2705-2720.</w:t>
+      </w:r>
+    </w:p>
+    <w:p>
+      <w:pPr>
+        <w:jc w:val="both"/>
+      </w:pPr>
+      <w:r>
+        <w:rPr>
+          <w:sz w:val="20"/>
+          <w:szCs w:val="20"/>
+          <w:rFonts w:ascii="Times New Roman" w:hAnsi="Times New Roman"/>
+        </w:rPr>
+        <w:t xml:space="preserve">[82] Ren, J., Zhao, J. (2018). Scientific Reports, 8, 10405.</w:t>
+      </w:r>
+    </w:p>
+    <w:p>
+      <w:pPr>
+        <w:jc w:val="both"/>
+      </w:pPr>
+      <w:r>
+        <w:rPr>
+          <w:sz w:val="20"/>
+          <w:szCs w:val="20"/>
+          <w:rFonts w:ascii="Times New Roman" w:hAnsi="Times New Roman"/>
+        </w:rPr>
+        <w:t xml:space="preserve">[83] Ren, J., Zhao, J. (2018). Scientific Reports, 8, 10405.</w:t>
+      </w:r>
+    </w:p>
+    <w:p>
+      <w:pPr>
+        <w:jc w:val="both"/>
+      </w:pPr>
+      <w:r>
+        <w:rPr>
+          <w:sz w:val="20"/>
+          <w:szCs w:val="20"/>
+          <w:rFonts w:ascii="Times New Roman" w:hAnsi="Times New Roman"/>
+        </w:rPr>
+        <w:t xml:space="preserve">[84] Kang, Y.B., Morita, K. (2009). Molten Slags Fluxes Salts Conf. Proc., 171-180.</w:t>
+      </w:r>
+    </w:p>
+    <w:p>
+      <w:pPr>
+        <w:jc w:val="both"/>
+      </w:pPr>
+      <w:r>
+        <w:rPr>
+          <w:sz w:val="20"/>
+          <w:szCs w:val="20"/>
+          <w:rFonts w:ascii="Times New Roman" w:hAnsi="Times New Roman"/>
+        </w:rPr>
+        <w:t xml:space="preserve">[85] Mitra, U., Eagar, T.W. (1984). Metall. Trans. A, 15(1), 217-227.</w:t>
+      </w:r>
+    </w:p>
+    <w:p>
+      <w:pPr>
+        <w:jc w:val="both"/>
+      </w:pPr>
+      <w:r>
+        <w:rPr>
+          <w:sz w:val="20"/>
+          <w:szCs w:val="20"/>
+          <w:rFonts w:ascii="Times New Roman" w:hAnsi="Times New Roman"/>
+        </w:rPr>
+        <w:t xml:space="preserve">[86] Chai, C.S., Eagar, T.W. (1980). Welding Journal, 59(3), 93s-98s.</w:t>
+      </w:r>
+    </w:p>
+    <w:p>
+      <w:pPr>
+        <w:jc w:val="both"/>
+      </w:pPr>
+      <w:r>
+        <w:rPr>
+          <w:sz w:val="20"/>
+          <w:szCs w:val="20"/>
+          <w:rFonts w:ascii="Times New Roman" w:hAnsi="Times New Roman"/>
+        </w:rPr>
+        <w:t xml:space="preserve">[87] Negi, V., Chattopadhyaya, S. (2013). Adv. Mater. Sci. Eng., 2013, 543594.</w:t>
+      </w:r>
+    </w:p>
+    <w:p>
+      <w:pPr>
+        <w:jc w:val="both"/>
+      </w:pPr>
+      <w:r>
+        <w:rPr>
+          <w:sz w:val="20"/>
+          <w:szCs w:val="20"/>
+          <w:rFonts w:ascii="Times New Roman" w:hAnsi="Times New Roman"/>
+        </w:rPr>
+        <w:t xml:space="preserve">[88] Negi, V., Chattopadhyaya, S. (2013). Adv. Mater. Sci. Eng., 2013, 543594.</w:t>
+      </w:r>
+    </w:p>
+    <w:p>
+      <w:pPr>
+        <w:jc w:val="both"/>
+      </w:pPr>
+      <w:r>
+        <w:rPr>
+          <w:sz w:val="20"/>
+          <w:szCs w:val="20"/>
+          <w:rFonts w:ascii="Times New Roman" w:hAnsi="Times New Roman"/>
+        </w:rPr>
+        <w:t xml:space="preserve">[89] Indacochea, J.E. et al. (1985). Metall. Trans. B, 16(2), 237-245.</w:t>
+      </w:r>
+    </w:p>
+    <w:p>
+      <w:pPr>
+        <w:jc w:val="both"/>
+      </w:pPr>
+      <w:r>
+        <w:rPr>
+          <w:sz w:val="20"/>
+          <w:szCs w:val="20"/>
+          <w:rFonts w:ascii="Times New Roman" w:hAnsi="Times New Roman"/>
+        </w:rPr>
+        <w:t xml:space="preserve">[90] Wang, C., Zhang, J. (2021). Acta Metall. Sinica, 57(9), 1126-1140.</w:t>
+      </w:r>
+    </w:p>
+    <w:p>
+      <w:pPr>
+        <w:jc w:val="both"/>
+      </w:pPr>
+      <w:r>
+        <w:rPr>
+          <w:sz w:val="20"/>
+          <w:szCs w:val="20"/>
+          <w:rFonts w:ascii="Times New Roman" w:hAnsi="Times New Roman"/>
+        </w:rPr>
+        <w:t xml:space="preserve">[91] Muller, T., Becker, R. (2023). J. Applied Crystallography, 56(1), 33-44.</w:t>
+      </w:r>
+    </w:p>
+    <w:p>
+      <w:pPr>
+        <w:jc w:val="both"/>
+      </w:pPr>
+      <w:r>
+        <w:rPr>
+          <w:sz w:val="20"/>
+          <w:szCs w:val="20"/>
+          <w:rFonts w:ascii="Times New Roman" w:hAnsi="Times New Roman"/>
+        </w:rPr>
+        <w:t xml:space="preserve">[92] Muller, T., Becker, R. (2023). J. Applied Crystallography, 56(1), 33-44.</w:t>
+      </w:r>
+    </w:p>
+    <w:p>
+      <w:pPr>
+        <w:jc w:val="both"/>
+      </w:pPr>
+      <w:r>
+        <w:rPr>
+          <w:sz w:val="20"/>
+          <w:szCs w:val="20"/>
+          <w:rFonts w:ascii="Times New Roman" w:hAnsi="Times New Roman"/>
+        </w:rPr>
+        <w:t xml:space="preserve">[93] Nakamura, H., Ito, K. (2022). Powder Diffraction, 37(3), 158-167.</w:t>
+      </w:r>
+    </w:p>
+    <w:p>
+      <w:pPr>
+        <w:jc w:val="both"/>
+      </w:pPr>
+      <w:r>
+        <w:rPr>
+          <w:sz w:val="20"/>
+          <w:szCs w:val="20"/>
+          <w:rFonts w:ascii="Times New Roman" w:hAnsi="Times New Roman"/>
+        </w:rPr>
+        <w:t xml:space="preserve">[94] Coetsee, T. (2020). Phase chemistry of SAW fluoride based fluxes, Univ. Pretoria.</w:t>
+      </w:r>
+    </w:p>
+    <w:p>
+      <w:pPr>
+        <w:jc w:val="both"/>
+      </w:pPr>
+      <w:r>
+        <w:rPr>
+          <w:sz w:val="20"/>
+          <w:szCs w:val="20"/>
+          <w:rFonts w:ascii="Times New Roman" w:hAnsi="Times New Roman"/>
+        </w:rPr>
+        <w:t xml:space="preserve">[95] Coetsee, T. (2018). J. South African Inst. Mining Metall., 118(7), 707-715.</w:t>
+      </w:r>
+    </w:p>
+    <w:p>
+      <w:pPr>
+        <w:jc w:val="both"/>
+      </w:pPr>
+      <w:r>
+        <w:rPr>
+          <w:sz w:val="20"/>
+          <w:szCs w:val="20"/>
+          <w:rFonts w:ascii="Times New Roman" w:hAnsi="Times New Roman"/>
+        </w:rPr>
+        <w:t xml:space="preserve">[96] Kim, J.H., Lee, S.B., Park, Y.D. (2023). J. Manufacturing Processes, 89, 245-257.</w:t>
+      </w:r>
+    </w:p>
+    <w:p>
+      <w:pPr>
+        <w:jc w:val="both"/>
+      </w:pPr>
+      <w:r>
+        <w:rPr>
+          <w:sz w:val="20"/>
+          <w:szCs w:val="20"/>
+          <w:rFonts w:ascii="Times New Roman" w:hAnsi="Times New Roman"/>
+        </w:rPr>
+        <w:t xml:space="preserve">[97] Thamaphat, K. et al. (2008). Agriculture Natural Resources, 42(3), 357-361.</w:t>
+      </w:r>
+    </w:p>
+    <w:p>
+      <w:pPr>
+        <w:jc w:val="both"/>
+      </w:pPr>
+      <w:r>
+        <w:rPr>
+          <w:sz w:val="20"/>
+          <w:szCs w:val="20"/>
+          <w:rFonts w:ascii="Times New Roman" w:hAnsi="Times New Roman"/>
+        </w:rPr>
+        <w:t xml:space="preserve">[98] Thamaphat, K. et al. (2008). Agriculture Natural Resources, 42(3), 357-361.</w:t>
+      </w:r>
+    </w:p>
+    <w:p>
+      <w:pPr>
+        <w:jc w:val="both"/>
+      </w:pPr>
+      <w:r>
+        <w:rPr>
+          <w:sz w:val="20"/>
+          <w:szCs w:val="20"/>
+          <w:rFonts w:ascii="Times New Roman" w:hAnsi="Times New Roman"/>
+        </w:rPr>
+        <w:t xml:space="preserve">[99] Paniagua-Mercado, A.M. et al. (2005). J. Mater. Process. Technol., 169(3), 346-351.</w:t>
+      </w:r>
+    </w:p>
+    <w:p>
+      <w:pPr>
+        <w:jc w:val="both"/>
+      </w:pPr>
+      <w:r>
+        <w:rPr>
+          <w:sz w:val="20"/>
+          <w:szCs w:val="20"/>
+          <w:rFonts w:ascii="Times New Roman" w:hAnsi="Times New Roman"/>
+        </w:rPr>
+        <w:t xml:space="preserve">[100] Hernandez-Ortiz, M. et al. (2024). Frontiers Environ. Chem., 5, 1462678.</w:t>
+      </w:r>
+    </w:p>
+    <w:p>
+      <w:pPr>
+        <w:jc w:val="both"/>
+      </w:pPr>
+      <w:r>
+        <w:rPr>
+          <w:sz w:val="20"/>
+          <w:szCs w:val="20"/>
+          <w:rFonts w:ascii="Times New Roman" w:hAnsi="Times New Roman"/>
+        </w:rPr>
+        <w:t xml:space="preserve">[101] Chen, L. et al. (2023). J. Hazardous Materials, 403, 123949.</w:t>
+      </w:r>
+    </w:p>
+    <w:p>
+      <w:pPr>
+        <w:jc w:val="both"/>
+      </w:pPr>
+      <w:r>
+        <w:rPr>
+          <w:sz w:val="20"/>
+          <w:szCs w:val="20"/>
+          <w:rFonts w:ascii="Times New Roman" w:hAnsi="Times New Roman"/>
+        </w:rPr>
+        <w:t xml:space="preserve">[102] Hernandez-Ortiz, M. et al. (2024). Frontiers Environ. Chem., 5, 1462678.</w:t>
+      </w:r>
+    </w:p>
+    <w:p>
+      <w:pPr>
+        <w:jc w:val="both"/>
+      </w:pPr>
+      <w:r>
+        <w:rPr>
+          <w:sz w:val="20"/>
+          <w:szCs w:val="20"/>
+          <w:rFonts w:ascii="Times New Roman" w:hAnsi="Times New Roman"/>
+        </w:rPr>
+        <w:t xml:space="preserve">[103] Lopez, V., Martinez, J. (2023). Infrared Physics and Technology, 128, 104-113.</w:t>
+      </w:r>
+    </w:p>
+    <w:p>
+      <w:pPr>
+        <w:jc w:val="both"/>
+      </w:pPr>
+      <w:r>
+        <w:rPr>
+          <w:sz w:val="20"/>
+          <w:szCs w:val="20"/>
+          <w:rFonts w:ascii="Times New Roman" w:hAnsi="Times New Roman"/>
+        </w:rPr>
+        <w:t xml:space="preserve">[104] Lopez, V., Martinez, J. (2023). Infrared Physics and Technology, 128, 104-113.</w:t>
+      </w:r>
+    </w:p>
+    <w:p>
+      <w:pPr>
+        <w:jc w:val="both"/>
+      </w:pPr>
+      <w:r>
+        <w:rPr>
+          <w:sz w:val="20"/>
+          <w:szCs w:val="20"/>
+          <w:rFonts w:ascii="Times New Roman" w:hAnsi="Times New Roman"/>
+        </w:rPr>
+        <w:t xml:space="preserve">[105] Chen, L. et al. (2023). J. Hazardous Materials, 403, 123949.</w:t>
+      </w:r>
+    </w:p>
+    <w:p>
+      <w:pPr>
+        <w:jc w:val="both"/>
+      </w:pPr>
+      <w:r>
+        <w:rPr>
+          <w:sz w:val="20"/>
+          <w:szCs w:val="20"/>
+          <w:rFonts w:ascii="Times New Roman" w:hAnsi="Times New Roman"/>
+        </w:rPr>
+        <w:t xml:space="preserve">[106] Park, J.H., Min, D.J. (2014). ISIJ International, 54(1), 27-33.</w:t>
+      </w:r>
+    </w:p>
+    <w:p>
+      <w:pPr>
+        <w:jc w:val="both"/>
+      </w:pPr>
+      <w:r>
+        <w:rPr>
+          <w:sz w:val="20"/>
+          <w:szCs w:val="20"/>
+          <w:rFonts w:ascii="Times New Roman" w:hAnsi="Times New Roman"/>
+        </w:rPr>
+        <w:t xml:space="preserve">[107] Hernandez-Ortiz, M. et al. (2024). Frontiers Environ. Chem., 5, 1462678.</w:t>
+      </w:r>
+    </w:p>
+    <w:p>
+      <w:pPr>
+        <w:jc w:val="both"/>
+      </w:pPr>
+      <w:r>
+        <w:rPr>
+          <w:sz w:val="20"/>
+          <w:szCs w:val="20"/>
+          <w:rFonts w:ascii="Times New Roman" w:hAnsi="Times New Roman"/>
+        </w:rPr>
+        <w:t xml:space="preserve">[108] Park, J.H., Min, D.J. (2014). ISIJ International, 54(1), 27-33.</w:t>
+      </w:r>
+    </w:p>
+    <w:p>
+      <w:pPr>
+        <w:jc w:val="both"/>
+      </w:pPr>
+      <w:r>
+        <w:rPr>
+          <w:sz w:val="20"/>
+          <w:szCs w:val="20"/>
+          <w:rFonts w:ascii="Times New Roman" w:hAnsi="Times New Roman"/>
+        </w:rPr>
+        <w:t xml:space="preserve">[109] Kim, J.H. et al. (2023). J. Manufacturing Processes, 89, 245-257.</w:t>
+      </w:r>
+    </w:p>
+    <w:p>
+      <w:pPr>
+        <w:jc w:val="both"/>
+      </w:pPr>
+      <w:r>
+        <w:rPr>
+          <w:sz w:val="20"/>
+          <w:szCs w:val="20"/>
+          <w:rFonts w:ascii="Times New Roman" w:hAnsi="Times New Roman"/>
+        </w:rPr>
+        <w:t xml:space="preserve">[110] Sharma, L. et al. (2023). Silicon, 15(1), 305-319.</w:t>
+      </w:r>
+    </w:p>
+    <w:p>
+      <w:pPr>
+        <w:jc w:val="both"/>
+      </w:pPr>
+      <w:r>
+        <w:rPr>
+          <w:sz w:val="20"/>
+          <w:szCs w:val="20"/>
+          <w:rFonts w:ascii="Times New Roman" w:hAnsi="Times New Roman"/>
+        </w:rPr>
+        <w:t xml:space="preserve">[111] Park, J.H., Min, D.J. (2014). ISIJ International, 54(1), 27-33.</w:t>
+      </w:r>
+    </w:p>
+    <w:p>
+      <w:pPr>
+        <w:jc w:val="both"/>
+      </w:pPr>
+      <w:r>
+        <w:rPr>
+          <w:sz w:val="20"/>
+          <w:szCs w:val="20"/>
+          <w:rFonts w:ascii="Times New Roman" w:hAnsi="Times New Roman"/>
+        </w:rPr>
+        <w:t xml:space="preserve">[112] Hernandez-Ortiz, M. et al. (2024). Frontiers Environ. Chem., 5, 1462678.</w:t>
+      </w:r>
+    </w:p>
+    <w:p>
+      <w:pPr>
+        <w:jc w:val="both"/>
+      </w:pPr>
+      <w:r>
+        <w:rPr>
+          <w:sz w:val="20"/>
+          <w:szCs w:val="20"/>
+          <w:rFonts w:ascii="Times New Roman" w:hAnsi="Times New Roman"/>
+        </w:rPr>
+        <w:t xml:space="preserve">[113] Sharma, A., Chhibber, R. (2018). Ceramics International, 44(18), 22390-22401.</w:t>
+      </w:r>
+    </w:p>
+    <w:p>
+      <w:pPr>
+        <w:jc w:val="both"/>
+      </w:pPr>
+      <w:r>
+        <w:rPr>
+          <w:sz w:val="20"/>
+          <w:szCs w:val="20"/>
+          <w:rFonts w:ascii="Times New Roman" w:hAnsi="Times New Roman"/>
+        </w:rPr>
+        <w:t xml:space="preserve">[114] Park, J.H., Min, D.J. (2014). ISIJ International, 54(1), 27-33.</w:t>
+      </w:r>
+    </w:p>
+    <w:p>
+      <w:pPr>
+        <w:jc w:val="both"/>
+      </w:pPr>
+      <w:r>
+        <w:rPr>
+          <w:sz w:val="20"/>
+          <w:szCs w:val="20"/>
+          <w:rFonts w:ascii="Times New Roman" w:hAnsi="Times New Roman"/>
+        </w:rPr>
+        <w:t xml:space="preserve">[115] Kim, J.H. et al. (2023). J. Manufacturing Processes, 89, 245-257.</w:t>
+      </w:r>
+    </w:p>
+    <w:p>
+      <w:pPr>
+        <w:jc w:val="both"/>
+      </w:pPr>
+      <w:r>
+        <w:rPr>
+          <w:sz w:val="20"/>
+          <w:szCs w:val="20"/>
+          <w:rFonts w:ascii="Times New Roman" w:hAnsi="Times New Roman"/>
+        </w:rPr>
+        <w:t xml:space="preserve">[116] Park, J.H., Min, D.J. (2014). ISIJ International, 54(1), 27-33.</w:t>
+      </w:r>
+    </w:p>
+    <w:p>
+      <w:pPr>
+        <w:jc w:val="both"/>
+      </w:pPr>
+      <w:r>
+        <w:rPr>
+          <w:sz w:val="20"/>
+          <w:szCs w:val="20"/>
+          <w:rFonts w:ascii="Times New Roman" w:hAnsi="Times New Roman"/>
+        </w:rPr>
+        <w:t xml:space="preserve">[117] Waris, K.N., Chhibber, R. (2021). Silicon, 13(7), 2441-2457.</w:t>
+      </w:r>
+    </w:p>
+    <w:p>
+      <w:pPr>
+        <w:jc w:val="both"/>
+      </w:pPr>
+      <w:r>
+        <w:rPr>
+          <w:sz w:val="20"/>
+          <w:szCs w:val="20"/>
+          <w:rFonts w:ascii="Times New Roman" w:hAnsi="Times New Roman"/>
+        </w:rPr>
+        <w:t xml:space="preserve">[118] Thamaphat, K. et al. (2008). Agriculture Natural Resources, 42(3), 357-361.</w:t>
+      </w:r>
+    </w:p>
+    <w:p>
+      <w:pPr>
+        <w:jc w:val="both"/>
+      </w:pPr>
+      <w:r>
+        <w:rPr>
+          <w:sz w:val="20"/>
+          <w:szCs w:val="20"/>
+          <w:rFonts w:ascii="Times New Roman" w:hAnsi="Times New Roman"/>
+        </w:rPr>
+        <w:t xml:space="preserve">[119] Sharma, L. et al. (2023). Silicon, 15(1), 305-319.</w:t>
+      </w:r>
+    </w:p>
+    <w:p>
+      <w:pPr>
+        <w:jc w:val="both"/>
+      </w:pPr>
+      <w:r>
+        <w:rPr>
+          <w:sz w:val="20"/>
+          <w:szCs w:val="20"/>
+          <w:rFonts w:ascii="Times New Roman" w:hAnsi="Times New Roman"/>
+        </w:rPr>
+        <w:t xml:space="preserve">[120] Kim, J.H., Lee, S.B., Park, Y.D. (2023). J. Manufacturing Processes, 89, 245-257.</w:t>
+      </w:r>
+    </w:p>
+    <w:p>
+      <w:pPr>
+        <w:jc w:val="both"/>
+      </w:pPr>
+      <w:r>
+        <w:rPr>
+          <w:sz w:val="20"/>
+          <w:szCs w:val="20"/>
+          <w:rFonts w:ascii="Times New Roman" w:hAnsi="Times New Roman"/>
+        </w:rPr>
+        <w:t xml:space="preserve">[121] Chen, D., Huang, L. (2022). Materials and Design, 215, Article 110-345.</w:t>
+      </w:r>
+    </w:p>
+    <w:p>
+      <w:pPr>
+        <w:jc w:val="both"/>
+      </w:pPr>
+      <w:r>
+        <w:rPr>
+          <w:sz w:val="20"/>
+          <w:szCs w:val="20"/>
+          <w:rFonts w:ascii="Times New Roman" w:hAnsi="Times New Roman"/>
+        </w:rPr>
+        <w:t xml:space="preserve">[122] Sharma, L., Chhibber, R. (2019). Silicon, 11, 2763-2773.</w:t>
+      </w:r>
+    </w:p>
+    <w:p>
+      <w:pPr>
+        <w:jc w:val="both"/>
+      </w:pPr>
+      <w:r>
+        <w:rPr>
+          <w:sz w:val="20"/>
+          <w:szCs w:val="20"/>
+          <w:rFonts w:ascii="Times New Roman" w:hAnsi="Times New Roman"/>
+        </w:rPr>
+        <w:t xml:space="preserve">[123] Gupta, D., Bansal, A., Jindal, S. (2025). Physica Scripta, 100(2), 025244.</w:t>
+      </w:r>
+    </w:p>
+    <w:p>
+      <w:pPr>
+        <w:jc w:val="both"/>
+      </w:pPr>
+      <w:r>
+        <w:rPr>
+          <w:sz w:val="20"/>
+          <w:szCs w:val="20"/>
+          <w:rFonts w:ascii="Times New Roman" w:hAnsi="Times New Roman"/>
+        </w:rPr>
+        <w:t xml:space="preserve">[124] Kumar, H., Misra, A. (2025). Materials Letters, 395, 138685.</w:t>
       </w:r>
     </w:p>
     <w:sectPr>
@@ -5186,6 +7188,9 @@
 <w:styles xmlns:w="http://schemas.openxmlformats.org/wordprocessingml/2006/main">
   <w:style w:type="paragraph" w:styleId="Normal" w:default="1">
     <w:name w:val="Normal"/>
+    <w:pPr>
+      <w:spacing w:after="120" w:line="360" w:lineRule="auto"/>
+    </w:pPr>
     <w:rPr>
       <w:sz w:val="24"/>
       <w:szCs w:val="24"/>
@@ -5195,7 +7200,7 @@
   <w:style w:type="paragraph" w:styleId="Heading1">
     <w:name w:val="heading 1"/>
     <w:pPr>
-      <w:spacing w:before="240" w:after="120"/>
+      <w:spacing w:before="360" w:after="120"/>
     </w:pPr>
     <w:rPr>
       <w:b/>
@@ -5207,7 +7212,7 @@
   <w:style w:type="paragraph" w:styleId="Heading2">
     <w:name w:val="heading 2"/>
     <w:pPr>
-      <w:spacing w:before="200" w:after="100"/>
+      <w:spacing w:before="240" w:after="120"/>
     </w:pPr>
     <w:rPr>
       <w:b/>
@@ -5219,7 +7224,7 @@
   <w:style w:type="paragraph" w:styleId="Heading3">
     <w:name w:val="heading 3"/>
     <w:pPr>
-      <w:spacing w:before="160" w:after="80"/>
+      <w:spacing w:before="200" w:after="80"/>
     </w:pPr>
     <w:rPr>
       <w:b/>
@@ -5230,16 +7235,6 @@
   </w:style>
   <w:style w:type="table" w:styleId="TableGrid">
     <w:name w:val="Table Grid"/>
-    <w:tblPr>
-      <w:tblBorders>
-        <w:top w:val="single" w:sz="4" w:space="0" w:color="000000"/>
-        <w:left w:val="single" w:sz="4" w:space="0" w:color="000000"/>
-        <w:bottom w:val="single" w:sz="4" w:space="0" w:color="000000"/>
-        <w:right w:val="single" w:sz="4" w:space="0" w:color="000000"/>
-        <w:insideH w:val="single" w:sz="4" w:space="0" w:color="000000"/>
-        <w:insideV w:val="single" w:sz="4" w:space="0" w:color="000000"/>
-      </w:tblBorders>
-    </w:tblPr>
   </w:style>
 </w:styles>
 </file>
</xml_diff>

<commit_message>
Remove Figures 4.4, 4.5, 4.7, 4.8 and their explanatory text
- Delete Fig 4.4 (thermophysical properties) + section 4.3.2 Thermal Properties
- Delete Fig 4.5 (XRD) + section 4.3.3 Phase Analysis; renumber FTIR to 4.3.2
- Delete Fig 4.7 (butt weld schematic) figure + its figure reference
- Delete Fig 4.8 (impact toughness) figure + its results discussion
- Clean up dangling cross-references (Figure 4.4a, Section 4.3.2)
</commit_message>
<xml_diff>
--- a/Chapter_4_Experimentation.docx
+++ b/Chapter_4_Experimentation.docx
@@ -13023,7 +13023,7 @@
           <w:sz w:val="24"/>
           <w:szCs w:val="24"/>
         </w:rPr>
-        <w:t xml:space="preserve">The density values for the 25 different submerged arc welding flux formulations were found to be in the range of 1.40 to 1.54 g/cm³ (Figure 4.4a) and correlated well with literature values for such multicomponent flux formulations. In the CaO–SiO₂–CaF₂ flux system, Sharma and Chhibber reported a similar density range of 1.35–1.58 g/cm³, and in the TiO₂–SiO₂–MgO system, Kowalski and Nowak reported a range of 1.42–1.56 g/cm³.</w:t>
+        <w:t xml:space="preserve">The density values for the 25 different submerged arc welding flux formulations were found to be in the range of 1.40 to 1.54 g/cm³ and correlated well with literature values for such multicomponent flux formulations. In the CaO–SiO₂–CaF₂ flux system, Sharma and Chhibber reported a similar density range of 1.35–1.58 g/cm³, and in the TiO₂–SiO₂–MgO system, Kowalski and Nowak reported a range of 1.42–1.56 g/cm³.</w:t>
       </w:r>
     </w:p>
     <w:p>
@@ -13050,376 +13050,7 @@
           <w:sz w:val="26"/>
           <w:szCs w:val="26"/>
         </w:rPr>
-        <w:t xml:space="preserve">4.3.2  Thermal Properties (Thermal Conductivity, Thermal Diffusivity and Specific Heat) Measurement</w:t>
-      </w:r>
-    </w:p>
-    <w:p>
-      <w:pPr>
-        <w:jc w:val="both"/>
-      </w:pPr>
-      <w:r>
-        <w:rPr>
-          <w:rFonts w:ascii="Times New Roman" w:hAnsi="Times New Roman"/>
-          <w:sz w:val="24"/>
-          <w:szCs w:val="24"/>
-        </w:rPr>
-        <w:t xml:space="preserve">Specific heat capacity, thermal diffusivity and thermal conductivity measurements were performed using the Hot Disk Transient Plane Source (TPS-2500S), which follows the international standard method (ISO 22007-2) for simultaneous measurement of thermal properties. The TPS technique utilizes a nickel sensor surrounded by two thin layers of insulation, used both as a heat source and as a resistance thermometer. The apparatus allows proper determination of the thermal transport properties by measuring the transient temperature changes observed in response to the applied heat pulse. Compared to traditional methods, the TPS method is more accurate, with measurement uncertainties usually less than ±3% and ±5% for thermal conductivity and thermal diffusivity respectively. The symmetric testing setup used in this experiment, with the sensor between two identical flux samples, removed the effect of thermal contact resistance and gave true bulk-property results.</w:t>
-      </w:r>
-    </w:p>
-    <w:p>
-      <w:pPr>
-        <w:pStyle w:val="Heading4"/>
-      </w:pPr>
-      <w:r>
-        <w:rPr>
-          <w:b/>
-          <w:i/>
-          <w:rFonts w:ascii="Times New Roman" w:hAnsi="Times New Roman"/>
-          <w:sz w:val="24"/>
-          <w:szCs w:val="24"/>
-        </w:rPr>
-        <w:t xml:space="preserve">Thermal Conductivity</w:t>
-      </w:r>
-    </w:p>
-    <w:p>
-      <w:pPr>
-        <w:jc w:val="both"/>
-      </w:pPr>
-      <w:r>
-        <w:rPr>
-          <w:rFonts w:ascii="Times New Roman" w:hAnsi="Times New Roman"/>
-          <w:sz w:val="24"/>
-          <w:szCs w:val="24"/>
-        </w:rPr>
-        <w:t xml:space="preserve">The thermal conductivity test (Figure 4.4b) showed a range of 0.34 to 0.52 W/m·K, with clear compositional dependence, reflecting the structure–property relationship known in ceramic flux systems. Dense fluxes with a high concentration of metallic oxides (MnO, BaO and TiO₂) consistently exhibited high thermal conductivity, with a maximum increase of 53% over the silicate-based fluxes. This improvement is caused by the improved phonon transport properties of crystalline metallic oxide phases relative to amorphous silicate networks.</w:t>
-      </w:r>
-    </w:p>
-    <w:p>
-      <w:pPr>
-        <w:jc w:val="both"/>
-      </w:pPr>
-      <w:r>
-        <w:rPr>
-          <w:rFonts w:ascii="Times New Roman" w:hAnsi="Times New Roman"/>
-          <w:sz w:val="24"/>
-          <w:szCs w:val="24"/>
-        </w:rPr>
-        <w:t xml:space="preserve">On the other hand, silica-based compositions (Flux 1–Flux 6) were found to have insulating properties with smaller values of thermal conductivity, in line with the known lower thermal conductivity of amorphous SiO₂ (0.1–0.2 W/m·K). The relationship is given by the expression:</w:t>
-      </w:r>
-    </w:p>
-    <w:p>
-      <w:pPr>
-        <w:jc w:val="center"/>
-        <w:spacing w:before="80" w:after="80"/>
-      </w:pPr>
-      <w:r>
-        <w:rPr>
-          <w:i/>
-          <w:rFonts w:ascii="Times New Roman" w:hAnsi="Times New Roman"/>
-          <w:sz w:val="24"/>
-          <w:szCs w:val="24"/>
-        </w:rPr>
-        <w:t xml:space="preserve">k_eff = Σ φ_i · k_i                                       (Equation 4.6)</w:t>
-      </w:r>
-    </w:p>
-    <w:p>
-      <w:pPr>
-        <w:jc w:val="both"/>
-      </w:pPr>
-      <w:r>
-        <w:rPr>
-          <w:rFonts w:ascii="Times New Roman" w:hAnsi="Times New Roman"/>
-          <w:sz w:val="24"/>
-          <w:szCs w:val="24"/>
-        </w:rPr>
-        <w:t xml:space="preserve">where k_eff is the effective thermal conductivity, φ_i is the volume fraction, and k_i is the individual phase conductivity.</w:t>
-      </w:r>
-    </w:p>
-    <w:p>
-      <w:pPr>
-        <w:pStyle w:val="Heading4"/>
-      </w:pPr>
-      <w:r>
-        <w:rPr>
-          <w:b/>
-          <w:i/>
-          <w:rFonts w:ascii="Times New Roman" w:hAnsi="Times New Roman"/>
-          <w:sz w:val="24"/>
-          <w:szCs w:val="24"/>
-        </w:rPr>
-        <w:t xml:space="preserve">Specific Heat Capacity</w:t>
-      </w:r>
-    </w:p>
-    <w:p>
-      <w:pPr>
-        <w:jc w:val="both"/>
-      </w:pPr>
-      <w:r>
-        <w:rPr>
-          <w:rFonts w:ascii="Times New Roman" w:hAnsi="Times New Roman"/>
-          <w:sz w:val="24"/>
-          <w:szCs w:val="24"/>
-        </w:rPr>
-        <w:t xml:space="preserve">The specific heat capacity of the flux formulations ranged between 0.902 and 1.192 MJ/m³·K (Figure 4.4c), of which Flux 25 had the highest specific heat capacity of 1.28 MJ/m³·K, at the highest CaF₂ and MnO concentration. In SAW applications, a high specific heat capacity has metallurgical benefits in that it enables greater thermal energy capture before an increase in temperature. This property helps to control the arc and to regulate the cooling rate of the weld pool, which are important for eliminating thermal shock and maintaining a uniform slag-layer structure. The dependence of specific heat on CaF₂ is governed by the general thermodynamic laws that describe the increase of heat capacity with the addition of fluoride, which leads to an increase in the lattice vibrational modes.</w:t>
-      </w:r>
-    </w:p>
-    <w:p>
-      <w:pPr>
-        <w:pStyle w:val="Heading4"/>
-      </w:pPr>
-      <w:r>
-        <w:rPr>
-          <w:b/>
-          <w:i/>
-          <w:rFonts w:ascii="Times New Roman" w:hAnsi="Times New Roman"/>
-          <w:sz w:val="24"/>
-          <w:szCs w:val="24"/>
-        </w:rPr>
-        <w:t xml:space="preserve">Thermal Diffusivity</w:t>
-      </w:r>
-    </w:p>
-    <w:p>
-      <w:pPr>
-        <w:jc w:val="both"/>
-      </w:pPr>
-      <w:r>
-        <w:rPr>
-          <w:rFonts w:ascii="Times New Roman" w:hAnsi="Times New Roman"/>
-          <w:sz w:val="24"/>
-          <w:szCs w:val="24"/>
-        </w:rPr>
-        <w:t xml:space="preserve">Thermal diffusivity was determined and ranged from 0.202 to 0.351 mm²/s (Figure 4.4d), using the fundamental relationship between thermal diffusivity, thermal conductivity, density and specific heat capacity, as shown below:</w:t>
-      </w:r>
-    </w:p>
-    <w:p>
-      <w:pPr>
-        <w:jc w:val="center"/>
-        <w:spacing w:before="80" w:after="80"/>
-      </w:pPr>
-      <w:r>
-        <w:rPr>
-          <w:i/>
-          <w:rFonts w:ascii="Times New Roman" w:hAnsi="Times New Roman"/>
-          <w:sz w:val="24"/>
-          <w:szCs w:val="24"/>
-        </w:rPr>
-        <w:t xml:space="preserve">α = k / (ρ · C_p)                                       (Equation 4.7)</w:t>
-      </w:r>
-    </w:p>
-    <w:p>
-      <w:pPr>
-        <w:jc w:val="both"/>
-      </w:pPr>
-      <w:r>
-        <w:rPr>
-          <w:rFonts w:ascii="Times New Roman" w:hAnsi="Times New Roman"/>
-          <w:sz w:val="24"/>
-          <w:szCs w:val="24"/>
-        </w:rPr>
-        <w:t xml:space="preserve">Flux 3 and Flux 22, containing high concentrations of silica and fluorspar, gave the lowest thermal diffusivity values (0.202–0.215 mm²/s), which provide the best thermal insulation capacity required to maintain weld-pool protection. Compositions with high BaO content (i.e. high thermal transport properties), such as Flux 8 and Flux 20, had a higher rate of heat propagation (0.335–0.351 mm²/s). Low thermal diffusivity fosters slow cooling and high ductility, whereas high thermal diffusivity fosters fast cooling and finer grain structures.</w:t>
-      </w:r>
-    </w:p>
-    <w:p>
-      <w:pPr>
-        <w:jc w:val="center"/>
-        <w:spacing w:before="120" w:after="20"/>
-      </w:pPr>
-      <w:r>
-        <w:drawing>
-          <wp:inline distT="0" distB="0" distL="0" distR="0">
-            <wp:extent cx="5486400" cy="4295851"/>
-            <wp:docPr id="3" name="Picture3"/>
-            <a:graphic xmlns:a="http://schemas.openxmlformats.org/drawingml/2006/main">
-              <a:graphicData uri="http://schemas.openxmlformats.org/drawingml/2006/picture">
-                <pic:pic xmlns:pic="http://schemas.openxmlformats.org/drawingml/2006/picture">
-                  <pic:nvPicPr>
-                    <pic:cNvPr id="3" name="Picture3"/>
-                    <pic:cNvPicPr/>
-                  </pic:nvPicPr>
-                  <pic:blipFill>
-                    <a:blip r:embed="rIdImg3"/>
-                    <a:stretch>
-                      <a:fillRect/>
-                    </a:stretch>
-                  </pic:blipFill>
-                  <pic:spPr>
-                    <a:xfrm>
-                      <a:off x="0" y="0"/>
-                      <a:ext cx="5486400" cy="4295851"/>
-                    </a:xfrm>
-                    <a:prstGeom prst="rect">
-                      <a:avLst/>
-                    </a:prstGeom>
-                  </pic:spPr>
-                </pic:pic>
-              </a:graphicData>
-            </a:graphic>
-          </wp:inline>
-        </w:drawing>
-      </w:r>
-    </w:p>
-    <w:p>
-      <w:pPr>
-        <w:jc w:val="center"/>
-        <w:spacing w:before="60" w:after="200"/>
-      </w:pPr>
-      <w:r>
-        <w:rPr>
-          <w:b/>
-          <w:rFonts w:ascii="Times New Roman" w:hAnsi="Times New Roman"/>
-          <w:sz w:val="20"/>
-          <w:szCs w:val="20"/>
-        </w:rPr>
-        <w:t xml:space="preserve">Figure 4.4  Variation of thermophysical properties with flux number: (a) density, (b) thermal conductivity, (c) specific heat capacity, (d) thermal diffusivity.</w:t>
-      </w:r>
-    </w:p>
-    <w:p>
-      <w:pPr>
-        <w:pStyle w:val="Heading3"/>
-      </w:pPr>
-      <w:r>
-        <w:rPr>
-          <w:b/>
-          <w:rFonts w:ascii="Times New Roman" w:hAnsi="Times New Roman"/>
-          <w:sz w:val="26"/>
-          <w:szCs w:val="26"/>
-        </w:rPr>
-        <w:t xml:space="preserve">4.3.3  Phase Analysis of Fluxes</w:t>
-      </w:r>
-    </w:p>
-    <w:p>
-      <w:pPr>
-        <w:jc w:val="both"/>
-      </w:pPr>
-      <w:r>
-        <w:rPr>
-          <w:rFonts w:ascii="Times New Roman" w:hAnsi="Times New Roman"/>
-          <w:sz w:val="24"/>
-          <w:szCs w:val="24"/>
-        </w:rPr>
-        <w:t xml:space="preserve">Four representative flux mixtures were shown to undergo crystallographic changes detectable by X-ray diffraction, which can supply information for in-depth analysis of thermal behaviour and metallurgical properties during welding (Figure 4.5). In Figure 4.5a, Flux 2, containing 35% CaF₂ and 25% MnO (Table 4.2), exhibits strong, sharp fluorite reflections at 2θ = 28.3°, 32.2° and 47.0°, corresponding to the (111), (200) and (220) planes respectively. The high intensity, together with a categorically small full width at half maximum (FWHM), indicates that the thermal treatment during preparation of the flux was sufficient to promote good fluorite crystal growth, as expressed by the large crystallite size. However, the intensity of the fluorite peaks is lower, and new peaks of MnO appear at 30.1° and 50.5°, in Flux 20 (Table 4.2) because its CaF₂ content is lower. The negative correlation between the intensities of the fluorite and MnO peaks probably indicates a crystallization effect, that is, the presence and addition of MnO may also have promoted the development of other crystal phases.</w:t>
-      </w:r>
-    </w:p>
-    <w:p>
-      <w:pPr>
-        <w:jc w:val="both"/>
-      </w:pPr>
-      <w:r>
-        <w:rPr>
-          <w:rFonts w:ascii="Times New Roman" w:hAnsi="Times New Roman"/>
-          <w:sz w:val="24"/>
-          <w:szCs w:val="24"/>
-        </w:rPr>
-        <w:t xml:space="preserve">Flux 12 shows an intermediate phase assemblage with strong reflections of fluorite and well-defined reflections of rutile at 27.4°, 36.1° and 54.4°, as well as MnO signatures. The arc stabilization role of titania is relevant to the high ratio of rutile-to-fluorite peak intensities in Flux 12; this ratio is higher for Flux 12 than for Flux 2.</w:t>
-      </w:r>
-    </w:p>
-    <w:p>
-      <w:pPr>
-        <w:pStyle w:val="Heading4"/>
-      </w:pPr>
-      <w:r>
-        <w:rPr>
-          <w:b/>
-          <w:i/>
-          <w:rFonts w:ascii="Times New Roman" w:hAnsi="Times New Roman"/>
-          <w:sz w:val="24"/>
-          <w:szCs w:val="24"/>
-        </w:rPr>
-        <w:t xml:space="preserve">Structure–Property Correlations</w:t>
-      </w:r>
-    </w:p>
-    <w:p>
-      <w:pPr>
-        <w:jc w:val="both"/>
-      </w:pPr>
-      <w:r>
-        <w:rPr>
-          <w:rFonts w:ascii="Times New Roman" w:hAnsi="Times New Roman"/>
-          <w:sz w:val="24"/>
-          <w:szCs w:val="24"/>
-        </w:rPr>
-        <w:t xml:space="preserve">In particular, the degree of crystallinity of fluorite (in both Flux 2 and Flux 16) showed a negative correlation with thermal diffusivity (0.215–0.245 mm²/s) compared to the MnO-rich Flux 20 (0.335 mm²/s). This is reminiscent of the well-known phonon-scattering effect of fluorite-type compounds, where defects in the crystal lattice (fluorine vacancies) reduce the heat-conduction capability of the phonons. The other compositions, however, have a higher thermal diffusivity, which can be accounted for by the more metallic character of the MnO oxidation state, allowing electronic thermal conduction.</w:t>
-      </w:r>
-    </w:p>
-    <w:p>
-      <w:pPr>
-        <w:jc w:val="both"/>
-      </w:pPr>
-      <w:r>
-        <w:rPr>
-          <w:rFonts w:ascii="Times New Roman" w:hAnsi="Times New Roman"/>
-          <w:sz w:val="24"/>
-          <w:szCs w:val="24"/>
-        </w:rPr>
-        <w:t xml:space="preserve">Generally, the diffraction peaks were stronger and sharper for higher-basicity fluxes (e.g. Flux 2 and Flux 13) than for lower-basicity ones (e.g. Flux 11 and Flux 18), the latter showing weaker and broader peaks indicating higher amorphous content. Mechanistically, this relationship is plausible because basic oxides (CaO, BaO) and CaF₂ tend to exist as distinct crystalline phases, whereas SiO₂ is known to form an amorphous glassy network.</w:t>
-      </w:r>
-    </w:p>
-    <w:p>
-      <w:pPr>
-        <w:jc w:val="center"/>
-        <w:spacing w:before="120" w:after="20"/>
-      </w:pPr>
-      <w:r>
-        <w:drawing>
-          <wp:inline distT="0" distB="0" distL="0" distR="0">
-            <wp:extent cx="5486400" cy="4295851"/>
-            <wp:docPr id="4" name="Picture4"/>
-            <a:graphic xmlns:a="http://schemas.openxmlformats.org/drawingml/2006/main">
-              <a:graphicData uri="http://schemas.openxmlformats.org/drawingml/2006/picture">
-                <pic:pic xmlns:pic="http://schemas.openxmlformats.org/drawingml/2006/picture">
-                  <pic:nvPicPr>
-                    <pic:cNvPr id="4" name="Picture4"/>
-                    <pic:cNvPicPr/>
-                  </pic:nvPicPr>
-                  <pic:blipFill>
-                    <a:blip r:embed="rIdImg4"/>
-                    <a:stretch>
-                      <a:fillRect/>
-                    </a:stretch>
-                  </pic:blipFill>
-                  <pic:spPr>
-                    <a:xfrm>
-                      <a:off x="0" y="0"/>
-                      <a:ext cx="5486400" cy="4295851"/>
-                    </a:xfrm>
-                    <a:prstGeom prst="rect">
-                      <a:avLst/>
-                    </a:prstGeom>
-                  </pic:spPr>
-                </pic:pic>
-              </a:graphicData>
-            </a:graphic>
-          </wp:inline>
-        </w:drawing>
-      </w:r>
-    </w:p>
-    <w:p>
-      <w:pPr>
-        <w:jc w:val="center"/>
-        <w:spacing w:before="60" w:after="200"/>
-      </w:pPr>
-      <w:r>
-        <w:rPr>
-          <w:b/>
-          <w:rFonts w:ascii="Times New Roman" w:hAnsi="Times New Roman"/>
-          <w:sz w:val="20"/>
-          <w:szCs w:val="20"/>
-        </w:rPr>
-        <w:t xml:space="preserve">Figure 4.5  XRD patterns of representative fluxes: (a) Flux 2, (b) Flux 12, (c) Flux 16, (d) Flux 20. F = fluorite (CaF₂), R = rutile (TiO₂), MnO = manganosite.</w:t>
-      </w:r>
-    </w:p>
-    <w:p>
-      <w:pPr>
-        <w:pStyle w:val="Heading3"/>
-      </w:pPr>
-      <w:r>
-        <w:rPr>
-          <w:b/>
-          <w:rFonts w:ascii="Times New Roman" w:hAnsi="Times New Roman"/>
-          <w:sz w:val="26"/>
-          <w:szCs w:val="26"/>
-        </w:rPr>
-        <w:t xml:space="preserve">4.3.4  Structural Analysis of Fluxes</w:t>
+        <w:t xml:space="preserve">4.3.2  Structural Analysis of Fluxes</w:t>
       </w:r>
     </w:p>
     <w:p>
@@ -13501,7 +13132,7 @@
           <w:sz w:val="24"/>
           <w:szCs w:val="24"/>
         </w:rPr>
-        <w:t xml:space="preserve">The depolymerization index obtained from FTIR confirms the trend of rising specific heat capacity with increasing depolymerization index, as obtained in Section 4.3.2. Set B (higher ratio of I₉₅₀/I₁₁₀₀) had specific heat capacities ranging from 1.05 MJ/m³·K to 1.19 MJ/m³·K, while set A (lower ratio) ranged from 0.90 MJ/m³·K to 0.98 MJ/m³·K. The correlation makes good mechanical sense, since depolymerized silicate networks appear to have more vibrational modes and higher configurational entropy than more polymerized species, thereby providing a better capacity for absorbing heat.</w:t>
+        <w:t xml:space="preserve">The depolymerization index obtained from FTIR is physically consistent with a higher heat-absorption capacity for the more depolymerized set B formulations. The correlation makes good mechanical sense, since depolymerized silicate networks appear to have more vibrational modes and higher configurational entropy than more polymerized species, thereby providing a better capacity for absorbing heat.</w:t>
       </w:r>
     </w:p>
     <w:p>
@@ -13580,16 +13211,16 @@
         <w:drawing>
           <wp:inline distT="0" distB="0" distL="0" distR="0">
             <wp:extent cx="5486400" cy="3412540"/>
-            <wp:docPr id="5" name="Picture5"/>
+            <wp:docPr id="3" name="Picture3"/>
             <a:graphic xmlns:a="http://schemas.openxmlformats.org/drawingml/2006/main">
               <a:graphicData uri="http://schemas.openxmlformats.org/drawingml/2006/picture">
                 <pic:pic xmlns:pic="http://schemas.openxmlformats.org/drawingml/2006/picture">
                   <pic:nvPicPr>
-                    <pic:cNvPr id="5" name="Picture5"/>
+                    <pic:cNvPr id="3" name="Picture3"/>
                     <pic:cNvPicPr/>
                   </pic:nvPicPr>
                   <pic:blipFill>
-                    <a:blip r:embed="rIdImg5"/>
+                    <a:blip r:embed="rIdImg3"/>
                     <a:stretch>
                       <a:fillRect/>
                     </a:stretch>
@@ -13726,16 +13357,16 @@
         <w:drawing>
           <wp:inline distT="0" distB="0" distL="0" distR="0">
             <wp:extent cx="5486400" cy="3412540"/>
-            <wp:docPr id="6" name="Picture6"/>
+            <wp:docPr id="4" name="Picture4"/>
             <a:graphic xmlns:a="http://schemas.openxmlformats.org/drawingml/2006/main">
               <a:graphicData uri="http://schemas.openxmlformats.org/drawingml/2006/picture">
                 <pic:pic xmlns:pic="http://schemas.openxmlformats.org/drawingml/2006/picture">
                   <pic:nvPicPr>
-                    <pic:cNvPr id="6" name="Picture6"/>
+                    <pic:cNvPr id="4" name="Picture4"/>
                     <pic:cNvPicPr/>
                   </pic:nvPicPr>
                   <pic:blipFill>
-                    <a:blip r:embed="rIdImg6"/>
+                    <a:blip r:embed="rIdImg4"/>
                     <a:stretch>
                       <a:fillRect/>
                     </a:stretch>
@@ -20446,61 +20077,7 @@
           <w:sz w:val="24"/>
           <w:szCs w:val="24"/>
         </w:rPr>
-        <w:t xml:space="preserve">API X70 steel base plates of dimensions 140 mm × 140 mm × 22 mm were prepared by butt welding. The joint configuration was designed with a single-V groove, an included angle of 60° and a root gap of 2 mm (as shown in Figure 4.7). This geometry provides good penetration and fusion while keeping the heat input manageable.</w:t>
-      </w:r>
-    </w:p>
-    <w:p>
-      <w:pPr>
-        <w:jc w:val="center"/>
-        <w:spacing w:before="120" w:after="20"/>
-      </w:pPr>
-      <w:r>
-        <w:drawing>
-          <wp:inline distT="0" distB="0" distL="0" distR="0">
-            <wp:extent cx="5029200" cy="3188512"/>
-            <wp:docPr id="7" name="Picture7"/>
-            <a:graphic xmlns:a="http://schemas.openxmlformats.org/drawingml/2006/main">
-              <a:graphicData uri="http://schemas.openxmlformats.org/drawingml/2006/picture">
-                <pic:pic xmlns:pic="http://schemas.openxmlformats.org/drawingml/2006/picture">
-                  <pic:nvPicPr>
-                    <pic:cNvPr id="7" name="Picture7"/>
-                    <pic:cNvPicPr/>
-                  </pic:nvPicPr>
-                  <pic:blipFill>
-                    <a:blip r:embed="rIdImg7"/>
-                    <a:stretch>
-                      <a:fillRect/>
-                    </a:stretch>
-                  </pic:blipFill>
-                  <pic:spPr>
-                    <a:xfrm>
-                      <a:off x="0" y="0"/>
-                      <a:ext cx="5029200" cy="3188512"/>
-                    </a:xfrm>
-                    <a:prstGeom prst="rect">
-                      <a:avLst/>
-                    </a:prstGeom>
-                  </pic:spPr>
-                </pic:pic>
-              </a:graphicData>
-            </a:graphic>
-          </wp:inline>
-        </w:drawing>
-      </w:r>
-    </w:p>
-    <w:p>
-      <w:pPr>
-        <w:jc w:val="center"/>
-        <w:spacing w:before="60" w:after="200"/>
-      </w:pPr>
-      <w:r>
-        <w:rPr>
-          <w:b/>
-          <w:rFonts w:ascii="Times New Roman" w:hAnsi="Times New Roman"/>
-          <w:sz w:val="20"/>
-          <w:szCs w:val="20"/>
-        </w:rPr>
-        <w:t xml:space="preserve">Figure 4.7  Schematic diagram of the butt weld joint: 60° groove angle, 2 mm root gap, 22 mm plate thickness, API X70 steel.</w:t>
+        <w:t xml:space="preserve">API X70 steel base plates of dimensions 140 mm × 140 mm × 22 mm were prepared by butt welding. The joint configuration was designed with a single-V groove, an included angle of 60° and a root gap of 2 mm. This geometry provides good penetration and fusion while keeping the heat input manageable.</w:t>
       </w:r>
     </w:p>
     <w:p>
@@ -22707,74 +22284,7 @@
           <w:sz w:val="24"/>
           <w:szCs w:val="24"/>
         </w:rPr>
-        <w:t xml:space="preserve">The impact toughness of the parent metal and weld joints is shown in Figure 4.8. Depending on the kind of flux – acidic, basic or neutral – the constituents of the flux have an important influence on the impact strength of the weld metal. The amount of oxygen in the weld metal depends on the kind of flux applied, and hence so do the final mechanical properties. If the weld metal contains too much oxygen – which could result from acidic flux or wire constituents such as SiO₂/Al₂O₃, or from atmospheric oxygen – the impact toughness will be adversely affected. Basic fluxes offer better impact properties than acidic fluxes, since the addition of fluorides or strong oxides has the ability to decrease the oxygen content in the weld metal. Charpy V-notch impact testing was performed at ambient (room) temperature and at −55°C, according to the ASTM E23 standard. Two 10 mm × 10 mm × 55 mm sub-size fusion-zone and heat-affected-zone specimens were cut from each weldment, with a 2 mm V-notch at the centre.</w:t>
-      </w:r>
-    </w:p>
-    <w:p>
-      <w:pPr>
-        <w:jc w:val="both"/>
-      </w:pPr>
-      <w:r>
-        <w:rPr>
-          <w:rFonts w:ascii="Times New Roman" w:hAnsi="Times New Roman"/>
-          <w:sz w:val="24"/>
-          <w:szCs w:val="24"/>
-        </w:rPr>
-        <w:t xml:space="preserve">The F6B flux weld joint exhibits greater impact toughness (171 J and 21 J) than the other weld joints and than the commercial flux (159 J and 18 J) at room temperature and −55°C respectively. The base metal has the highest impact toughness at room temperature and −55°C (350 J and 35 J). Weld joints fabricated using the F20B and F22B fluxes show moderate impact toughness values, lower than the parent metal and commercial flux. The impact toughness values of all weld specimens in the heat-affected zone (HAZ) are similar, with the F6B flux specimen showing the highest impact strength in the HAZ at both room temperature and −55°C. All weld specimens show increased impact strength at room temperature in the HAZ. These results are consistent with the available knowledge for submerged arc welding, where the laboratory-prepared fluxes F6B, F20B and F22B promote low oxygen pick-up, finer inclusions and formation of acicular ferrite, resulting in better toughness down to sub-zero temperatures. Figure 4.8 shows the differences in impact energy for the various weld joints at both room temperature and −55°C.</w:t>
-      </w:r>
-    </w:p>
-    <w:p>
-      <w:pPr>
-        <w:jc w:val="center"/>
-        <w:spacing w:before="120" w:after="20"/>
-      </w:pPr>
-      <w:r>
-        <w:drawing>
-          <wp:inline distT="0" distB="0" distL="0" distR="0">
-            <wp:extent cx="5486400" cy="3412540"/>
-            <wp:docPr id="8" name="Picture8"/>
-            <a:graphic xmlns:a="http://schemas.openxmlformats.org/drawingml/2006/main">
-              <a:graphicData uri="http://schemas.openxmlformats.org/drawingml/2006/picture">
-                <pic:pic xmlns:pic="http://schemas.openxmlformats.org/drawingml/2006/picture">
-                  <pic:nvPicPr>
-                    <pic:cNvPr id="8" name="Picture8"/>
-                    <pic:cNvPicPr/>
-                  </pic:nvPicPr>
-                  <pic:blipFill>
-                    <a:blip r:embed="rIdImg8"/>
-                    <a:stretch>
-                      <a:fillRect/>
-                    </a:stretch>
-                  </pic:blipFill>
-                  <pic:spPr>
-                    <a:xfrm>
-                      <a:off x="0" y="0"/>
-                      <a:ext cx="5486400" cy="3412540"/>
-                    </a:xfrm>
-                    <a:prstGeom prst="rect">
-                      <a:avLst/>
-                    </a:prstGeom>
-                  </pic:spPr>
-                </pic:pic>
-              </a:graphicData>
-            </a:graphic>
-          </wp:inline>
-        </w:drawing>
-      </w:r>
-    </w:p>
-    <w:p>
-      <w:pPr>
-        <w:jc w:val="center"/>
-        <w:spacing w:before="60" w:after="200"/>
-      </w:pPr>
-      <w:r>
-        <w:rPr>
-          <w:b/>
-          <w:rFonts w:ascii="Times New Roman" w:hAnsi="Times New Roman"/>
-          <w:sz w:val="20"/>
-          <w:szCs w:val="20"/>
-        </w:rPr>
-        <w:t xml:space="preserve">Figure 4.8  Impact toughness values for various fluxes at room temperature and −55°C (weld metal and HAZ regions).</w:t>
+        <w:t xml:space="preserve">Depending on the kind of flux – acidic, basic or neutral – the constituents of the flux have an important influence on the impact strength of the weld metal. The amount of oxygen in the weld metal depends on the kind of flux applied, and hence so do the final mechanical properties. If the weld metal contains too much oxygen – which could result from acidic flux or wire constituents such as SiO₂/Al₂O₃, or from atmospheric oxygen – the impact toughness will be adversely affected. Basic fluxes offer better impact properties than acidic fluxes, since the addition of fluorides or strong oxides has the ability to decrease the oxygen content in the weld metal. Charpy V-notch impact testing was performed at ambient (room) temperature and at −55°C, according to the ASTM E23 standard. Two 10 mm × 10 mm × 55 mm sub-size fusion-zone and heat-affected-zone specimens were cut from each weldment, with a 2 mm V-notch at the centre.</w:t>
       </w:r>
     </w:p>
     <w:p>
@@ -22827,16 +22337,16 @@
         <w:drawing>
           <wp:inline distT="0" distB="0" distL="0" distR="0">
             <wp:extent cx="5486400" cy="3900830"/>
-            <wp:docPr id="9" name="Picture9"/>
+            <wp:docPr id="5" name="Picture5"/>
             <a:graphic xmlns:a="http://schemas.openxmlformats.org/drawingml/2006/main">
               <a:graphicData uri="http://schemas.openxmlformats.org/drawingml/2006/picture">
                 <pic:pic xmlns:pic="http://schemas.openxmlformats.org/drawingml/2006/picture">
                   <pic:nvPicPr>
-                    <pic:cNvPr id="9" name="Picture9"/>
+                    <pic:cNvPr id="5" name="Picture5"/>
                     <pic:cNvPicPr/>
                   </pic:nvPicPr>
                   <pic:blipFill>
-                    <a:blip r:embed="rIdImg9"/>
+                    <a:blip r:embed="rIdImg5"/>
                     <a:stretch>
                       <a:fillRect/>
                     </a:stretch>
@@ -22976,16 +22486,16 @@
         <w:drawing>
           <wp:inline distT="0" distB="0" distL="0" distR="0">
             <wp:extent cx="5486400" cy="3780129"/>
-            <wp:docPr id="10" name="Picture10"/>
+            <wp:docPr id="6" name="Picture6"/>
             <a:graphic xmlns:a="http://schemas.openxmlformats.org/drawingml/2006/main">
               <a:graphicData uri="http://schemas.openxmlformats.org/drawingml/2006/picture">
                 <pic:pic xmlns:pic="http://schemas.openxmlformats.org/drawingml/2006/picture">
                   <pic:nvPicPr>
-                    <pic:cNvPr id="10" name="Picture10"/>
+                    <pic:cNvPr id="6" name="Picture6"/>
                     <pic:cNvPicPr/>
                   </pic:nvPicPr>
                   <pic:blipFill>
-                    <a:blip r:embed="rIdImg10"/>
+                    <a:blip r:embed="rIdImg6"/>
                     <a:stretch>
                       <a:fillRect/>
                     </a:stretch>

</xml_diff>

<commit_message>
Remove results/discussion of measured property outcomes
Strip reported measured values and their interpretation across the
experimentation chapter, keeping methodology, setup, standards, tables and figures:
- 4.3.1 density result ranges/mean/CV
- 4.3.2 FTIR spectral results and slag-behaviour inferences
- 4.4.1 element-transfer/carbon/regression R2 outcomes
- 4.4.2 measured microhardness and Ti-range results
- 4.4 X70-requirement compliance results sentence
- 4.5.3 Table 4.7 CE/S interpretation
- 4.5.5.3 fractography toughness values/findings
- 4.5.5.4 measured microhardness distributions
- 4.5.5.5 observed microstructure findings
- 4.5.5.6 corrosion result interpretation
- 4.7.5 measured CE-value tensile interpretation
- 4.8.4 measured Mo/S percentages generalized
- 4.8.5 Expected Corrosion Performance section removed
</commit_message>
<xml_diff>
--- a/Chapter_4_Experimentation.docx
+++ b/Chapter_4_Experimentation.docx
@@ -13015,32 +13015,6 @@
     </w:p>
     <w:p>
       <w:pPr>
-        <w:jc w:val="both"/>
-      </w:pPr>
-      <w:r>
-        <w:rPr>
-          <w:rFonts w:ascii="Times New Roman" w:hAnsi="Times New Roman"/>
-          <w:sz w:val="24"/>
-          <w:szCs w:val="24"/>
-        </w:rPr>
-        <w:t xml:space="preserve">The density values for the 25 different submerged arc welding flux formulations were found to be in the range of 1.40 to 1.54 g/cm³ and correlated well with literature values for such multicomponent flux formulations. In the CaO–SiO₂–CaF₂ flux system, Sharma and Chhibber reported a similar density range of 1.35–1.58 g/cm³, and in the TiO₂–SiO₂–MgO system, Kowalski and Nowak reported a range of 1.42–1.56 g/cm³.</w:t>
-      </w:r>
-    </w:p>
-    <w:p>
-      <w:pPr>
-        <w:jc w:val="both"/>
-      </w:pPr>
-      <w:r>
-        <w:rPr>
-          <w:rFonts w:ascii="Times New Roman" w:hAnsi="Times New Roman"/>
-          <w:sz w:val="24"/>
-          <w:szCs w:val="24"/>
-        </w:rPr>
-        <w:t xml:space="preserve">The maximum density values (5.72 g/cm³ for Flux 14–Flux 16 and 5.03 g/cm³ for Flux 23–Flux 25) were obtained for formulations containing high-density oxides (BaO and MnO, respectively), as per rule-of-mixtures calculations. On the other hand, silica-rich (SiO₂, ρ = 2.65 g/cm³) and fluorspar-rich (CaF₂, ρ = 3.18 g/cm³) compositions had a low bulk density (Flux 1–Flux 6). The mean density of 1.48 ± 0.04 g/cm³ is optimal with respect to compaction properties that can be successfully applied to SAW, giving good flux flow and arc coverage. A relatively low coefficient of variation (2.7%) indicates a fairly uniform density structure, which translates to low porosity and high manufacturing reproducibility, owing to the uniform addition of CaO (8%) during the agglomeration process.</w:t>
-      </w:r>
-    </w:p>
-    <w:p>
-      <w:pPr>
         <w:pStyle w:val="Heading3"/>
       </w:pPr>
       <w:r>
@@ -13068,21 +13042,6 @@
     </w:p>
     <w:p>
       <w:pPr>
-        <w:pStyle w:val="Heading4"/>
-      </w:pPr>
-      <w:r>
-        <w:rPr>
-          <w:b/>
-          <w:i/>
-          <w:rFonts w:ascii="Times New Roman" w:hAnsi="Times New Roman"/>
-          <w:sz w:val="24"/>
-          <w:szCs w:val="24"/>
-        </w:rPr>
-        <w:t xml:space="preserve">Si–O–Si Network Interaction and Depolymerization</w:t>
-      </w:r>
-    </w:p>
-    <w:p>
-      <w:pPr>
         <w:jc w:val="both"/>
       </w:pPr>
       <w:r>
@@ -13091,115 +13050,7 @@
           <w:sz w:val="24"/>
           <w:szCs w:val="24"/>
         </w:rPr>
-        <w:t xml:space="preserve">The most conspicuous feature in all of the spectra is a broad, intense absorbance at about 1070–1120 cm⁻¹, typical of the asymmetric Si–O–Si stretching of the silicate tetrahedra. A systematic shift of this band towards lower wavenumbers is noticed in Fluxes 14, 19, 21 and 25 (set B) compared with the other fluxes (set A: Flux 1, 6, 7, 11). There was an average shift in peak position from 1105 cm⁻¹ for set A to 1085 cm⁻¹ for set B. This red shift is quantitatively analysed in terms of increased depolymerization of the silicate network. Lower wavenumbers correspond to a higher number of non-bridging oxygen atoms (NBOs), the result of modification of the network by the basic oxides (BaO, MnO, CaO).</w:t>
-      </w:r>
-    </w:p>
-    <w:p>
-      <w:pPr>
-        <w:jc w:val="both"/>
-      </w:pPr>
-      <w:r>
-        <w:rPr>
-          <w:rFonts w:ascii="Times New Roman" w:hAnsi="Times New Roman"/>
-          <w:sz w:val="24"/>
-          <w:szCs w:val="24"/>
-        </w:rPr>
-        <w:t xml:space="preserve">Two shoulders were observed around 950 cm⁻¹ and assigned to Si–O (non-bridging oxygen) stretching vibrations, which are more intense in the set B samples. The intensity ratio, I₉₅₀/I₁₁₀₀, can be used as a semi-quantitative measure for the quantification of network depolymerization. The average calculated ratio is in the range 0.15–0.25 for set A and 0.30–0.45 for set B, showing that there is more depolymerization due to the modifiers in set B.</w:t>
-      </w:r>
-    </w:p>
-    <w:p>
-      <w:pPr>
-        <w:pStyle w:val="Heading4"/>
-      </w:pPr>
-      <w:r>
-        <w:rPr>
-          <w:b/>
-          <w:i/>
-          <w:rFonts w:ascii="Times New Roman" w:hAnsi="Times New Roman"/>
-          <w:sz w:val="24"/>
-          <w:szCs w:val="24"/>
-        </w:rPr>
-        <w:t xml:space="preserve">Correlation of Thermal and Anticipated Slag Behaviour</w:t>
-      </w:r>
-    </w:p>
-    <w:p>
-      <w:pPr>
-        <w:jc w:val="both"/>
-      </w:pPr>
-      <w:r>
-        <w:rPr>
-          <w:rFonts w:ascii="Times New Roman" w:hAnsi="Times New Roman"/>
-          <w:sz w:val="24"/>
-          <w:szCs w:val="24"/>
-        </w:rPr>
-        <w:t xml:space="preserve">The depolymerization index obtained from FTIR is physically consistent with a higher heat-absorption capacity for the more depolymerized set B formulations. The correlation makes good mechanical sense, since depolymerized silicate networks appear to have more vibrational modes and higher configurational entropy than more polymerized species, thereby providing a better capacity for absorbing heat.</w:t>
-      </w:r>
-    </w:p>
-    <w:p>
-      <w:pPr>
-        <w:jc w:val="both"/>
-      </w:pPr>
-      <w:r>
-        <w:rPr>
-          <w:rFonts w:ascii="Times New Roman" w:hAnsi="Times New Roman"/>
-          <w:sz w:val="24"/>
-          <w:szCs w:val="24"/>
-        </w:rPr>
-        <w:t xml:space="preserve">It is well established that an increase in network depolymerization decreases the viscosity of the slag and its melting temperature; the dependence of slag viscosity on the extent of network depolymerization is well documented in the literature. So, based on the FTIR evidence, it can reasonably be assumed that there will be more fluidity in the set B formulations, in particular Flux 21 and Flux 25, compared to the set A formulations, and consequently the slag viscosities will be lower.</w:t>
-      </w:r>
-    </w:p>
-    <w:p>
-      <w:pPr>
-        <w:pStyle w:val="Heading4"/>
-      </w:pPr>
-      <w:r>
-        <w:rPr>
-          <w:b/>
-          <w:i/>
-          <w:rFonts w:ascii="Times New Roman" w:hAnsi="Times New Roman"/>
-          <w:sz w:val="24"/>
-          <w:szCs w:val="24"/>
-        </w:rPr>
-        <w:t xml:space="preserve">Hydroxyl and Carbonate Species</w:t>
-      </w:r>
-    </w:p>
-    <w:p>
-      <w:pPr>
-        <w:jc w:val="both"/>
-      </w:pPr>
-      <w:r>
-        <w:rPr>
-          <w:rFonts w:ascii="Times New Roman" w:hAnsi="Times New Roman"/>
-          <w:sz w:val="24"/>
-          <w:szCs w:val="24"/>
-        </w:rPr>
-        <w:t xml:space="preserve">All of the spectra contain O–H stretching bands, which have a broad band shape and are centred around 3400 cm⁻¹, with differing intensities in each of the samples (Figure 4.6). The presence of hydroxyl groups is likely due to surface moisture or to water in the binder (potassium silicate solution), which can influence the hydrogen content of the weld metal. A higher hydroxyl band in the set A samples indicates a greater likelihood of moisture retention, and thus potentially a higher possibility of hydrogen-induced cracking.</w:t>
-      </w:r>
-    </w:p>
-    <w:p>
-      <w:pPr>
-        <w:jc w:val="both"/>
-      </w:pPr>
-      <w:r>
-        <w:rPr>
-          <w:rFonts w:ascii="Times New Roman" w:hAnsi="Times New Roman"/>
-          <w:sz w:val="24"/>
-          <w:szCs w:val="24"/>
-        </w:rPr>
-        <w:t xml:space="preserve">The complementary Si–O–Si bending complexes between 400 and 600 cm⁻¹ indicate the presence of ring structures and the three-dimensional network connectivity of the silicate structure; their intensity and structure are quantitative measures of the extent of polymerization of the network and the influence of the modifier content. Titanium dioxide adds characteristic lattice-vibration bands at 400–800 cm⁻¹, whose strength and spectral properties vary depending on the phase present at lower concentration. The presence of manganese oxides adds further lattice modes in the range 700–400 cm⁻¹, close to the Ti–O and Si–O–Si bands; these features increase as the percentage of MnO in the structure increases, suggesting changes in oxidation state.</w:t>
-      </w:r>
-    </w:p>
-    <w:p>
-      <w:pPr>
-        <w:jc w:val="both"/>
-      </w:pPr>
-      <w:r>
-        <w:rPr>
-          <w:rFonts w:ascii="Times New Roman" w:hAnsi="Times New Roman"/>
-          <w:sz w:val="24"/>
-          <w:szCs w:val="24"/>
-        </w:rPr>
-        <w:t xml:space="preserve">The FTIR spectra of the samples Flux 1, 6, 7, 11 (set A) and Flux 14, 19, 21, 25 (set B) are presented as percent transmittance against wavenumber (4000–500 cm⁻¹), showing clear differences in absorption in both the fingerprint and functional-group regions. A systematic study of these samples showed strong spectral development, indicating frequency changes of the molecular structure and hence compositional changes. The Si–O–Si asymmetric stretching envelope in Figure 4.6(b) showed systematic shifts to lower wavenumbers, suggesting more modifier and greater silicate-network depolymerization. This structural change is directly correlated with lower melting temperatures and higher slag fluidity.</w:t>
+        <w:t xml:space="preserve">The FTIR spectra were examined for the absorption bands associated with the asymmetric Si–O–Si stretching of the silicate tetrahedra (about 1070–1120 cm⁻¹), the Si–O non-bridging-oxygen stretching vibrations (around 950 cm⁻¹), the Si–O–Si bending complexes (400–600 cm⁻¹), the O–H stretching band (around 3400 cm⁻¹), and the metal–oxygen lattice modes contributed by TiO₂ (400–800 cm⁻¹) and MnO (700–400 cm⁻¹). The spectra are presented as percent transmittance against wavenumber over the 4000–500 cm⁻¹ range for the set A samples (Flux 1, 6, 7, 11) and the set B samples (Flux 14, 19, 21, 25).</w:t>
       </w:r>
     </w:p>
     <w:p>
@@ -13253,20 +13104,7 @@
           <w:sz w:val="20"/>
           <w:szCs w:val="20"/>
         </w:rPr>
-        <w:t xml:space="preserve">Figure 4.6  FTIR spectra of set A (Flux 1, 6, 7, 11) and set B (Flux 14, 19, 21, 25), showing transmittance vs wavenumber (4000–500 cm⁻¹). The Si–O–Si red-shift and increased NBO fraction indicate greater depolymerization in set B.</w:t>
-      </w:r>
-    </w:p>
-    <w:p>
-      <w:pPr>
-        <w:jc w:val="both"/>
-      </w:pPr>
-      <w:r>
-        <w:rPr>
-          <w:rFonts w:ascii="Times New Roman" w:hAnsi="Times New Roman"/>
-          <w:sz w:val="24"/>
-          <w:szCs w:val="24"/>
-        </w:rPr>
-        <w:t xml:space="preserve">This section provides a comprehensive characterization of the 25 formulated fluxes and defines the basic physicochemical and thermophysical properties that enable an understanding of the structure–property–performance relationships governing flux behaviour during the submerged arc welding process. This study successfully establishes quantitative relationships between the flux composition and the measured physical and thermophysical properties through a systematic approach. The data given here serve as an excellent scientific foundation for the preparation of fluxes with specified properties such as bulk density, thermal conductivity and specific heat.</w:t>
+        <w:t xml:space="preserve">Figure 4.6  FTIR spectra of set A (Flux 1, 6, 7, 11) and set B (Flux 14, 19, 21, 25), showing transmittance vs wavenumber (4000–500 cm⁻¹).</w:t>
       </w:r>
     </w:p>
     <w:p>
@@ -13332,7 +13170,7 @@
           <w:sz w:val="24"/>
           <w:szCs w:val="24"/>
         </w:rPr>
-        <w:t xml:space="preserve">The minimum physical requirements of X70 pipeline steel welds demand specific microstructural and mechanical criteria. The base metal should have a yield strength of at least 485 MPa and a tensile strength of at least 570 MPa, and the microhardness of the weld metal and HAZ should be 180–220 HV to prevent brittleness while maintaining weldability and avoiding cracking. The carbon equivalent (CE) must remain small (0.30–0.43), and low oxygen/inclusion content is sought to produce clean welds that lead to fine-grained acicular ferrite nucleation. The present work is consistent with these requirements: it shows acicular ferrite and carbide inclusions in the optimized fluxes, microhardness values of 178–226 HV across the beads, and CE values of 0.20–0.31, all of which fall within these limits and enable notch toughness through controlled element transfer.</w:t>
+        <w:t xml:space="preserve">The minimum physical requirements of X70 pipeline steel welds demand specific microstructural and mechanical criteria. The base metal should have a yield strength of at least 485 MPa and a tensile strength of at least 570 MPa, and the microhardness of the weld metal and HAZ should be 180–220 HV to prevent brittleness while maintaining weldability and avoiding cracking. The carbon equivalent (CE) must remain small (0.30–0.43), and low oxygen/inclusion content is sought to produce clean welds that lead to fine-grained acicular ferrite nucleation.</w:t>
       </w:r>
     </w:p>
     <w:p>
@@ -13452,33 +13290,7 @@
           <w:sz w:val="24"/>
           <w:szCs w:val="24"/>
         </w:rPr>
-        <w:t xml:space="preserve">The individual oxides SiO₂ and MnO were identified as having a positive effect on carbon content, while their interaction effects with other components may produce either negative or positive influences. Carbon content increased from the base-metal value (0.058%) to 0.032–0.050% in the weld beads, microhardness ranged from 175–226 HV, and carbon equivalent (CE) ranged from 0.19–0.31.</w:t>
-      </w:r>
-    </w:p>
-    <w:p>
-      <w:pPr>
-        <w:jc w:val="both"/>
-      </w:pPr>
-      <w:r>
-        <w:rPr>
-          <w:rFonts w:ascii="Times New Roman" w:hAnsi="Times New Roman"/>
-          <w:sz w:val="24"/>
-          <w:szCs w:val="24"/>
-        </w:rPr>
-        <w:t xml:space="preserve">Twenty-five different flux formulations were used in the experiments; the weld-metal composition (C, Si, Mn, P, S, Mo, Ni, Cr) was determined by atomic absorption spectroscopy (AAS), the microhardness (MH) was measured by Vickers indentation (indenter load of 50 kgf and dwell time of 10 s), and the carbon equivalent (CE) was calculated using the IIW formula.</w:t>
-      </w:r>
-    </w:p>
-    <w:p>
-      <w:pPr>
-        <w:jc w:val="both"/>
-      </w:pPr>
-      <w:r>
-        <w:rPr>
-          <w:rFonts w:ascii="Times New Roman" w:hAnsi="Times New Roman"/>
-          <w:sz w:val="24"/>
-          <w:szCs w:val="24"/>
-        </w:rPr>
-        <w:t xml:space="preserve">The element transfer and properties were predicted by statistically significant regression models (R² = 0.76–0.95, p &lt; 0.05). The equations developed can be used to predict the composition, microhardness and carbon equivalent of the weld metal directly from the flux composition, without the need for trial-and-error experiments. Furthermore, the interaction terms give clues to the synergic and antagonistic interactions between the flux components, which help provide a more in-depth understanding of the slag–metal reactions.</w:t>
+        <w:t xml:space="preserve">For each of the twenty-five flux formulations, the weld-metal composition (C, Si, Mn, P, S, Mo, Ni, Cr) was determined by atomic absorption spectroscopy (AAS), the microhardness (MH) was measured by Vickers indentation (indenter load of 50 kgf and dwell time of 10 s), and the carbon equivalent (CE) was calculated using the IIW formula.</w:t>
       </w:r>
     </w:p>
     <w:p>
@@ -13505,7 +13317,7 @@
           <w:sz w:val="24"/>
           <w:szCs w:val="24"/>
         </w:rPr>
-        <w:t xml:space="preserve">The microhardness of all twenty-five beads was analysed with a microhardness tester using a 50 kgf load and a 10 s dwell time. To assess the hardness distribution along the weld metal, Vickers microhardness was carried out on the polished cross-sections of each multipass weld bead. The microhardness values ranged from 175 HV (Flux 22) to 226 HV (Flux 15), as shown in Table 4.3. For the optimized flux, a microhardness of 220 HV, a CE of 0.29 and a fine acicular ferrite structure were obtained at low Ti levels (9–30 ppm). The F22 flux gave a microhardness of 175 HV and a CE of 0.21. The microhardness variation over the 25 formulations is due to the complex interaction between the flux chemistry, the element transfer and the resulting weld-metal microstructure.</w:t>
+        <w:t xml:space="preserve">The microhardness of all twenty-five beads was analysed with a microhardness tester using a 50 kgf load and a 10 s dwell time. To assess the hardness distribution along the weld metal, Vickers microhardness was carried out on the polished cross-sections of each multipass weld bead.</w:t>
       </w:r>
     </w:p>
     <w:p>
@@ -13518,7 +13330,7 @@
           <w:sz w:val="24"/>
           <w:szCs w:val="24"/>
         </w:rPr>
-        <w:t xml:space="preserve">Across the 25 multipass beads, the Ti content in the weld metal ranged from 0.0009% to 0.0030%. This is a very important range for the microstructural formation of acicular ferrite. Ti is one of the most efficient microalloying agents for promoting acicular ferrite (AF) in C–Mn and HSLA steel weld metals. During solidification of the molten weld pool, fine, dispersed Ti-rich oxide particles form in this optimal low-concentration range. These inclusions provide intragranular nucleation sites for the precipitated acicular ferrite, a fine-grained interlocking microstructure known to yield high toughness and strength.</w:t>
+        <w:t xml:space="preserve">Titanium is one of the most efficient microalloying agents for promoting acicular ferrite (AF) in C–Mn and HSLA steel weld metals. During solidification of the molten weld pool, fine, dispersed Ti-rich oxide particles form at low Ti concentrations. These inclusions provide intragranular nucleation sites for the precipitated acicular ferrite, a fine-grained interlocking microstructure known to yield high toughness and strength.</w:t>
       </w:r>
     </w:p>
     <w:p>
@@ -15797,19 +15609,6 @@
     </w:p>
     <w:p>
       <w:pPr>
-        <w:jc w:val="both"/>
-      </w:pPr>
-      <w:r>
-        <w:rPr>
-          <w:rFonts w:ascii="Times New Roman" w:hAnsi="Times New Roman"/>
-          <w:sz w:val="24"/>
-          <w:szCs w:val="24"/>
-        </w:rPr>
-        <w:t xml:space="preserve">The parent- and fusion-metal elements show that the Ni and Nb content in the weld metal is lowered, while significant quantities of Ti, B, Cu and Cr (carbide formers) are added from the base metal. The sulfur content in all weld joints was considerably reduced compared to the base material (BM), filler wire and commercial flux. The maximum carbon equivalent (CE = 0.38 wt%) was observed for the weld joint fabricated using the commercial flux. The CE of specimen F6B was very close to that of the base metal. Lower CE values were observed for the F20B and F22B fluxes. Significantly, the CE was reduced substantially in the fusion zone compared to the parent metal. These observations show that decreased CE% in the fusion zone reduces the volume fraction of low-temperature transformation products, which favour the formation of coarser microstructures.</w:t>
-      </w:r>
-    </w:p>
-    <w:p>
-      <w:pPr>
         <w:pStyle w:val="Heading3"/>
       </w:pPr>
       <w:r>
@@ -15943,20 +15742,7 @@
           <w:sz w:val="24"/>
           <w:szCs w:val="24"/>
         </w:rPr>
-        <w:t xml:space="preserve">The fractography of the tested specimens of the API X70 SAW weldments reveals the interactions between the welding flux chemistry, the weld-metal microstructure and the fracture mechanisms in the parent metal (PM), heat-affected zone (HAZ) and fusion zone (FZ). Systematic fractographic analysis shows that the impact-loading behaviour of these regions differs markedly, depending on the specific microstructural features and on the welding flux employed. Typical features of ductile fracture in the parent metal (PM) include microvoid coalescence and well-developed dimple structures. The parent metal showed the best impact toughness, with average Charpy energies of 350 and 400 J at ambient temperature (FZ and HAZ), and the fracture surface showed a high degree of plastic deformation prior to fracture. The F6B basic flux and the commercial flux (CF) demonstrated excellent performance, with 171 J and 159 J impact toughness in the weld zone at room temperature; fractography showed a mixture of ductile features, while brittle fracture with some faceted torn surfaces was observed at −55°C for both fluxes. The F20B and F22B fluxes, on the other hand, produced fusion-zone fracture surfaces (at both room temperature and −55°C) with larger cleavage facets and a smaller shear-lip area, indicating lower fracture resistance.</w:t>
-      </w:r>
-    </w:p>
-    <w:p>
-      <w:pPr>
-        <w:jc w:val="both"/>
-      </w:pPr>
-      <w:r>
-        <w:rPr>
-          <w:rFonts w:ascii="Times New Roman" w:hAnsi="Times New Roman"/>
-          <w:sz w:val="24"/>
-          <w:szCs w:val="24"/>
-        </w:rPr>
-        <w:t xml:space="preserve">The HAZ shows transitional fractographic behaviour between the parent metal and fusion zone. The coarse-grained HAZ (CGHAZ) adjacent to the fusion line has the most brittle properties, associated with cleavage fracture related to the presence of martensite–austenite (M–A) constituents and large prior-austenite grains. Fractographic analysis of HAZ specimens from welds made with the basic flux (F6B) and commercial flux (CF) shows improved toughness, with a greater ductile-fracture area compared to the other fluxes. The F6B flux provides 385 J of impact energy in the HAZ at ambient temperature and 28 J at −55°C, with fractography showing large numbers of coalesced microvoids. All fractographic observations were performed using a scanning electron microscope (SEM) at 1000× magnification and 15.0 kV accelerating voltage. The fractographs of the API X70 SAW weldments in the parent, fusion-zone and HAZ regions are shown in Figure 4.9.</w:t>
+        <w:t xml:space="preserve">Fractography of the tested specimens of the API X70 SAW weldments is used to relate the welding flux chemistry and the weld-metal microstructure to the fracture mechanisms in the parent metal (PM), heat-affected zone (HAZ) and fusion zone (FZ). Ductile fracture is characterized by microvoid coalescence and dimple structures, whereas brittle fracture is characterized by cleavage facets and faceted torn surfaces; the coarse-grained HAZ (CGHAZ) adjacent to the fusion line is the region most prone to cleavage, associated with martensite–austenite (M–A) constituents and large prior-austenite grains. All fractographic observations were performed using a scanning electron microscope (SEM) at 1000× magnification and 15.0 kV accelerating voltage. The fractographs of the API X70 SAW weldments in the parent, fusion-zone and HAZ regions are shown in Figure 4.9.</w:t>
       </w:r>
     </w:p>
     <w:p>
@@ -16038,33 +15824,7 @@
           <w:sz w:val="24"/>
           <w:szCs w:val="24"/>
         </w:rPr>
-        <w:t xml:space="preserve">Microhardness assessment of the API X70 SAW joints with various fluxes reveals that flux basicity, together with other factors such as weld-metal composition and microstructural changes in the parent metal, weld metal and heat-affected zone (HAZ) due to the thermal cycles, plays a complex role in the joint microhardness. The as-received API X70 steel has a fine-grained ferrite–pearlite microstructure with a microhardness range of 190–220 HV, giving a balanced strength–toughness relationship suitable for high-pressure applications. Vickers microhardness tests were performed across the cross-section of the weldment from the base metal through the HAZ, across the fusion zone, and symmetrically from the other side of the weldment, with a load of 500 gf and a dwell time of 10 s.</w:t>
-      </w:r>
-    </w:p>
-    <w:p>
-      <w:pPr>
-        <w:jc w:val="both"/>
-      </w:pPr>
-      <w:r>
-        <w:rPr>
-          <w:rFonts w:ascii="Times New Roman" w:hAnsi="Times New Roman"/>
-          <w:sz w:val="24"/>
-          <w:szCs w:val="24"/>
-        </w:rPr>
-        <w:t xml:space="preserve">The maximum microhardness values for the laboratory-prepared and commercial fluxes were 233 HV and 224 HV in the fusion zone respectively, and 257 HV and 251 HV in the heat-affected zone (HAZ). Basic fluxes prepared in the laboratory (such as F6B, F20B and F22B) tend to deposit a more basic weld, which produces more interaction between slag and metal, limiting the amount of oxygen and hydrogen in the weld, creating a refined weld-metal microstructure and reducing the chance of developing coarse martensite and fresh bainite in the fusion zone.</w:t>
-      </w:r>
-    </w:p>
-    <w:p>
-      <w:pPr>
-        <w:jc w:val="both"/>
-      </w:pPr>
-      <w:r>
-        <w:rPr>
-          <w:rFonts w:ascii="Times New Roman" w:hAnsi="Times New Roman"/>
-          <w:sz w:val="24"/>
-          <w:szCs w:val="24"/>
-        </w:rPr>
-        <w:t xml:space="preserve">The microhardness distribution of the weld metal generally shows a medium level of microhardness for the F6B welded joint (205–224 HV), which can be attributed to the presence of acicular ferrite with a small dispersion of bainite. F20B and F22B, on the other hand, with higher CaO/CaF₂ concentration, produce lower average weld-metal hardness (195–215 HV for F20B and 184–202 HV for F22B), resulting from their improved deoxidation ability and microstructural refinement. The commercial flux (CF) has a satisfactory hardness value (210–233 HV) in the fusion area, slightly higher than all the laboratory fluxes, and a hardness range of 211–257 HV in the HAZ.</w:t>
+        <w:t xml:space="preserve">Microhardness assessment of the API X70 SAW joints with various fluxes is influenced by flux basicity, together with other factors such as weld-metal composition and the microstructural changes produced in the parent metal, weld metal and heat-affected zone (HAZ) by the welding thermal cycles. Vickers microhardness tests were performed across the cross-section of the weldment from the base metal through the HAZ, across the fusion zone, and symmetrically from the other side of the weldment, with a load of 500 gf and a dwell time of 10 s.</w:t>
       </w:r>
     </w:p>
     <w:p>
@@ -16105,7 +15865,7 @@
           <w:sz w:val="24"/>
           <w:szCs w:val="24"/>
         </w:rPr>
-        <w:t xml:space="preserve">Weldments made using the basic fluxes (F6B, F20B, F22B and CF) have acicular ferrite as the major constituent of the fusion zone, with a small amount of polygonal ferrite and bainite. In previous work, it was observed that fluxes of lower basicity index or rutile-based composition yield higher oxygen content in the weld metal, resulting in a coarser inclusion distribution and the formation of less desirable microstructures such as grain-boundary ferrite (GBF) and Widmanstätten ferrite (WF). The microstructural changes in the heat-affected zone (HAZ), caused by the complex thermal cycle experienced by the material without melting, are similarly sensitive to the choice of flux. The HAZ of API X70 steel is normally composed of several sub-regions, such as the coarse-grained HAZ (CGHAZ) adjacent to the fusion line, which experiences peak temperatures and austenite grain coarsening, and the fine-grained HAZ (FGHAZ), which is subjected to normalizing temperatures. The typical microstructure of the CGHAZ of API X70 welds made using the basic fluxes F6B, F20B, F22B and the commercial flux (CF) is bainite and acicular ferrite. The microstructural behaviour of the SAW weldments fabricated using F6B, F20B, F22B and the commercial flux (CF) is shown in Figure 4.10. The following abbreviations are used: PF (polygonal ferrite); P (pearlite); AF (acicular ferrite); LB (lower bainite); UB (upper bainite); QPF (quenched polygonal ferrite); M/A (martensite–austenite); WF (Widmanstätten ferrite); GBF (grain-boundary ferrite).</w:t>
+        <w:t xml:space="preserve">The microstructural changes in the heat-affected zone (HAZ), caused by the complex thermal cycle experienced by the material without melting, are similarly sensitive to the choice of flux. The HAZ of API X70 steel is normally composed of several sub-regions, such as the coarse-grained HAZ (CGHAZ) adjacent to the fusion line, which experiences peak temperatures and austenite grain coarsening, and the fine-grained HAZ (FGHAZ), which is subjected to normalizing temperatures. The microstructures of the SAW weldments fabricated using F6B, F20B, F22B and the commercial flux (CF) are shown in Figure 4.10. The following abbreviations are used: PF (polygonal ferrite); P (pearlite); AF (acicular ferrite); LB (lower bainite); UB (upper bainite); QPF (quenched polygonal ferrite); M/A (martensite–austenite); WF (Widmanstätten ferrite); GBF (grain-boundary ferrite).</w:t>
       </w:r>
     </w:p>
     <w:p>
@@ -16200,7 +15960,7 @@
           <w:sz w:val="24"/>
           <w:szCs w:val="24"/>
         </w:rPr>
-        <w:t xml:space="preserve">The potentiodynamic polarization tests were performed in a three-electrode electrochemical cell configuration, following ASTM G59 and ASTM G102. The working electrode was the weld specimen (active surface area about 1 cm²), the reference electrode was a saturated calomel electrode (SCE), and a platinum counter electrode was used. The electrolyte was a 3.5 wt% NaCl solution at room temperature to emulate marine/offshore service conditions. Tafel extrapolation of the polarization curves was used to determine the corrosion parameters, such as corrosion potential (E_corr), corrosion current density (i_corr) and corrosion rate. The anodic polarization response was also used to assess passive-film stability and pitting resistance. A more noble corrosion potential and a lower corrosion current density indicate better corrosion resistance of the weld metal. The corrosion behaviour is strongly affected by the weld-metal chemistry, especially the amount of transferred flux oxides (Mn, Mo, Cr and Si). Basic fluxes with optimized slag–metal reactions yield weld metals containing fewer impurities, such as sulfur and phosphorus, which are known to adversely influence grain-boundary corrosion resistance. It is also seen that the inclusion morphology and distribution, dictated by the flux oxygen potential, influence the initiation sites of pitting corrosion in marine environments.</w:t>
+        <w:t xml:space="preserve">The potentiodynamic polarization tests were performed in a three-electrode electrochemical cell configuration, following ASTM G59 and ASTM G102. The working electrode was the weld specimen (active surface area about 1 cm²), the reference electrode was a saturated calomel electrode (SCE), and a platinum counter electrode was used. The electrolyte was a 3.5 wt% NaCl solution at room temperature to emulate marine/offshore service conditions. Tafel extrapolation of the polarization curves was used to determine the corrosion parameters, such as corrosion potential (E_corr), corrosion current density (i_corr) and corrosion rate. The anodic polarization response was also used to assess passive-film stability and pitting resistance.</w:t>
       </w:r>
     </w:p>
     <w:p>
@@ -16446,7 +16206,7 @@
           <w:sz w:val="24"/>
           <w:szCs w:val="24"/>
         </w:rPr>
-        <w:t xml:space="preserve">The carbon equivalent (CE) of the weld metal, calculated from the chemical analysis (Table 4.7), is directly related to the hardenability of the weld metal and thus to the tensile response of the weldment. Generally, higher CE values (e.g. commercial flux weldment, CE = 0.38) give higher strength but can lead to lower ductility, while lower CE values (e.g. F20B: CE = 0.28; F22B: CE = 0.27) give lower strength but higher ductility. An intermediate CE value (F6B: CE = 0.31) is best for the formation of acicular ferrite, and the resulting microstructure has been shown to have a very good combination of strength, toughness and ductility.</w:t>
+        <w:t xml:space="preserve">The carbon equivalent (CE) of the weld metal, calculated from the chemical analysis (Table 4.7), is directly related to the hardenability of the weld metal and thus to the tensile response of the weldment. In general, higher CE values give higher strength but can lead to lower ductility, while lower CE values give lower strength but higher ductility; an intermediate CE is favourable for the formation of acicular ferrite, whose microstructure provides a good combination of strength, toughness and ductility.</w:t>
       </w:r>
     </w:p>
     <w:p>
@@ -16911,7 +16671,7 @@
           <w:sz w:val="24"/>
           <w:szCs w:val="24"/>
         </w:rPr>
-        <w:t xml:space="preserve">•  (i) Cr and Mo content in weld metal: more stable chromium oxide (Cr₂O₃) and molybdenum-enriched passive films are formed, which resist breakdown in chlorides. As shown in Table 4.7, the F6B and F20B fluxes deposit significant amounts of Mo into the weld metal (0.392% and 0.401% respectively), improving the pitting resistance of the weld metal.</w:t>
+        <w:t xml:space="preserve">•  (i) Cr and Mo content in weld metal: more stable chromium oxide (Cr₂O₃) and molybdenum-enriched passive films are formed, which resist breakdown in chlorides and improve the pitting resistance of the weld metal.</w:t>
       </w:r>
     </w:p>
     <w:p>
@@ -16925,7 +16685,7 @@
           <w:sz w:val="24"/>
           <w:szCs w:val="24"/>
         </w:rPr>
-        <w:t xml:space="preserve">•  (ii) Sulfur and phosphorus removal: basic fluxes with high CaF₂ and CaO content effectively remove sulfur and phosphorus from the weld metal. The significantly lower sulfur content in the laboratory flux weldments (F6B: 0.0024%, F20B: 0.0019%, F22B: 0.0011%) compared to the commercial flux (CF: 0.0070%) is expected to provide superior corrosion resistance by reducing the possibility of MnS inclusion formation at grain boundaries.</w:t>
+        <w:t xml:space="preserve">•  (ii) Sulfur and phosphorus removal: basic fluxes with high CaF₂ and CaO content effectively remove sulfur and phosphorus from the weld metal, which reduces the possibility of MnS inclusion formation at grain boundaries and is beneficial for corrosion resistance.</w:t>
       </w:r>
     </w:p>
     <w:p>
@@ -16954,89 +16714,6 @@
           <w:szCs w:val="24"/>
         </w:rPr>
         <w:t xml:space="preserve">•  (iv) Microstructural uniformity: acicular-ferrite-dominated microstructures (formed by basic fluxes such as F6B) are fine-grained with random grain orientation, which minimizes the galvanic potential difference between neighbouring grains and gives more uniform corrosion behaviour. Microstructures with extensive regions of grain-boundary ferrite or Widmanstätten ferrite, on the other hand, tend to corrode along grain-boundary ferrite/pearlite or grain-boundary ferrite/bainite interfaces.</w:t>
-      </w:r>
-    </w:p>
-    <w:p>
-      <w:pPr>
-        <w:pStyle w:val="Heading3"/>
-      </w:pPr>
-      <w:r>
-        <w:rPr>
-          <w:b/>
-          <w:rFonts w:ascii="Times New Roman" w:hAnsi="Times New Roman"/>
-          <w:sz w:val="26"/>
-          <w:szCs w:val="26"/>
-        </w:rPr>
-        <w:t xml:space="preserve">4.8.5  Expected Corrosion Performance</w:t>
-      </w:r>
-    </w:p>
-    <w:p>
-      <w:pPr>
-        <w:jc w:val="both"/>
-      </w:pPr>
-      <w:r>
-        <w:rPr>
-          <w:rFonts w:ascii="Times New Roman" w:hAnsi="Times New Roman"/>
-          <w:sz w:val="24"/>
-          <w:szCs w:val="24"/>
-        </w:rPr>
-        <w:t xml:space="preserve">Based on the weld-metal chemistry (Table 4.7) and the microstructural observations (Figure 4.10), the following corrosion-performance hierarchy is expected:</w:t>
-      </w:r>
-    </w:p>
-    <w:p>
-      <w:pPr>
-        <w:ind w:left="720" w:hanging="360"/>
-        <w:jc w:val="both"/>
-      </w:pPr>
-      <w:r>
-        <w:rPr>
-          <w:rFonts w:ascii="Times New Roman" w:hAnsi="Times New Roman"/>
-          <w:sz w:val="24"/>
-          <w:szCs w:val="24"/>
-        </w:rPr>
-        <w:t xml:space="preserve">•  F6B flux weldment: optimized to contain the lowest sulfur (0.0024%), adequate Mo (0.392%) and a predominantly acicular ferrite microstructure, expected to give the most noble corrosion potential and the lowest corrosion rate of the laboratory fluxes.</w:t>
-      </w:r>
-    </w:p>
-    <w:p>
-      <w:pPr>
-        <w:ind w:left="720" w:hanging="360"/>
-        <w:jc w:val="both"/>
-      </w:pPr>
-      <w:r>
-        <w:rPr>
-          <w:rFonts w:ascii="Times New Roman" w:hAnsi="Times New Roman"/>
-          <w:sz w:val="24"/>
-          <w:szCs w:val="24"/>
-        </w:rPr>
-        <w:t xml:space="preserve">•  F20B and F22B flux weldments: with very low sulfur content (0.0019% and 0.0011%) and slightly lower Mn content, these may have slightly less passive-film stability but are expected to show intermediate corrosion resistance.</w:t>
-      </w:r>
-    </w:p>
-    <w:p>
-      <w:pPr>
-        <w:ind w:left="720" w:hanging="360"/>
-        <w:jc w:val="both"/>
-      </w:pPr>
-      <w:r>
-        <w:rPr>
-          <w:rFonts w:ascii="Times New Roman" w:hAnsi="Times New Roman"/>
-          <w:sz w:val="24"/>
-          <w:szCs w:val="24"/>
-        </w:rPr>
-        <w:t xml:space="preserve">•  Commercial flux (CF) weldment: with the highest Mo content (0.412%), but relatively higher sulfur content (0.0070%), the sulfur can offset the alloying benefit, so its corrosion resistance may be comparable to or lower than that of F6B.</w:t>
-      </w:r>
-    </w:p>
-    <w:p>
-      <w:pPr>
-        <w:ind w:left="720" w:hanging="360"/>
-        <w:jc w:val="both"/>
-      </w:pPr>
-      <w:r>
-        <w:rPr>
-          <w:rFonts w:ascii="Times New Roman" w:hAnsi="Times New Roman"/>
-          <w:sz w:val="24"/>
-          <w:szCs w:val="24"/>
-        </w:rPr>
-        <w:t xml:space="preserve">•  Base metal (API X70): a fine-grained ferrite–pearlite microstructure with controlled alloying, serving as the reference corrosion behaviour against which all weldments are compared.</w:t>
       </w:r>
     </w:p>
     <w:sectPr>

</xml_diff>

<commit_message>
Add References section (list 1-65) to Chapter 4
- Add reference() method (numbered, hanging-indent) to docx_builder
- Append 'References' heading on a new page with all 65 entries
</commit_message>
<xml_diff>
--- a/Chapter_4_Experimentation.docx
+++ b/Chapter_4_Experimentation.docx
@@ -16714,6 +16714,1000 @@
           <w:szCs w:val="24"/>
         </w:rPr>
         <w:t xml:space="preserve">•  (iv) Microstructural uniformity: acicular-ferrite-dominated microstructures (formed by basic fluxes such as F6B) are fine-grained with random grain orientation, which minimizes the galvanic potential difference between neighbouring grains and gives more uniform corrosion behaviour. Microstructures with extensive regions of grain-boundary ferrite or Widmanstätten ferrite, on the other hand, tend to corrode along grain-boundary ferrite/pearlite or grain-boundary ferrite/bainite interfaces.</w:t>
+      </w:r>
+    </w:p>
+    <w:p>
+      <w:r>
+        <w:br w:type="page"/>
+      </w:r>
+    </w:p>
+    <w:p>
+      <w:pPr>
+        <w:pStyle w:val="Heading2"/>
+      </w:pPr>
+      <w:r>
+        <w:rPr>
+          <w:b/>
+          <w:rFonts w:ascii="Times New Roman" w:hAnsi="Times New Roman"/>
+          <w:sz w:val="28"/>
+          <w:szCs w:val="28"/>
+        </w:rPr>
+        <w:t xml:space="preserve">References</w:t>
+      </w:r>
+    </w:p>
+    <w:p>
+      <w:pPr>
+        <w:ind w:left="600" w:hanging="600"/>
+        <w:jc w:val="both"/>
+        <w:spacing w:after="60" w:line="276" w:lineRule="auto"/>
+      </w:pPr>
+      <w:r>
+        <w:rPr>
+          <w:rFonts w:ascii="Times New Roman" w:hAnsi="Times New Roman"/>
+          <w:sz w:val="22"/>
+          <w:szCs w:val="22"/>
+        </w:rPr>
+        <w:t xml:space="preserve">[1]  Kumar, A., &amp; Chhibber, R. (2022). Investigation of the wetting behavior of formulated SMAW electrode coating fluxes with regression and ANN model. Metallurgical and Materials Transactions B.</w:t>
+      </w:r>
+    </w:p>
+    <w:p>
+      <w:pPr>
+        <w:ind w:left="600" w:hanging="600"/>
+        <w:jc w:val="both"/>
+        <w:spacing w:after="60" w:line="276" w:lineRule="auto"/>
+      </w:pPr>
+      <w:r>
+        <w:rPr>
+          <w:rFonts w:ascii="Times New Roman" w:hAnsi="Times New Roman"/>
+          <w:sz w:val="22"/>
+          <w:szCs w:val="22"/>
+        </w:rPr>
+        <w:t xml:space="preserve">[2]  Kumar, A., Sharma, L., &amp; Chhibber, R. (2023). Wettability studies of formulated SMAW electrode coating fluxes with regression analysis and neural network approach. Ceramics International, 49(7), 10224–10237.</w:t>
+      </w:r>
+    </w:p>
+    <w:p>
+      <w:pPr>
+        <w:ind w:left="600" w:hanging="600"/>
+        <w:jc w:val="both"/>
+        <w:spacing w:after="60" w:line="276" w:lineRule="auto"/>
+      </w:pPr>
+      <w:r>
+        <w:rPr>
+          <w:rFonts w:ascii="Times New Roman" w:hAnsi="Times New Roman"/>
+          <w:sz w:val="22"/>
+          <w:szCs w:val="22"/>
+        </w:rPr>
+        <w:t xml:space="preserve">[3]  Kumar, A., &amp; Chhibber, R. (2024). Thermal property characterization and modeling of SMAW electrode coating flux using ANN and regression analysis. Proceedings of the Institution of Mechanical Engineers, Part B: Journal of Engineering Manufacture.</w:t>
+      </w:r>
+    </w:p>
+    <w:p>
+      <w:pPr>
+        <w:ind w:left="600" w:hanging="600"/>
+        <w:jc w:val="both"/>
+        <w:spacing w:after="60" w:line="276" w:lineRule="auto"/>
+      </w:pPr>
+      <w:r>
+        <w:rPr>
+          <w:rFonts w:ascii="Times New Roman" w:hAnsi="Times New Roman"/>
+          <w:sz w:val="22"/>
+          <w:szCs w:val="22"/>
+        </w:rPr>
+        <w:t xml:space="preserve">[4]  Kumar, A., Sharma, L., &amp; Chhibber, R. (2023). Investigation and modeling of the SMAW coating flux thermal properties using neural network and regression analysis. Ceramics International, 49(11), 17753–17765.</w:t>
+      </w:r>
+    </w:p>
+    <w:p>
+      <w:pPr>
+        <w:ind w:left="600" w:hanging="600"/>
+        <w:jc w:val="both"/>
+        <w:spacing w:after="60" w:line="276" w:lineRule="auto"/>
+      </w:pPr>
+      <w:r>
+        <w:rPr>
+          <w:rFonts w:ascii="Times New Roman" w:hAnsi="Times New Roman"/>
+          <w:sz w:val="22"/>
+          <w:szCs w:val="22"/>
+        </w:rPr>
+        <w:t xml:space="preserve">[5]  Kumar, A., &amp; Chhibber, R. (2024). Element transfer, microhardness and metallurgical analysis of weld-bead using CaF₂–CaO–Al₂O₃–BaO fluxes. Materials Science and Technology, 40(18), 1377–1391.</w:t>
+      </w:r>
+    </w:p>
+    <w:p>
+      <w:pPr>
+        <w:ind w:left="600" w:hanging="600"/>
+        <w:jc w:val="both"/>
+        <w:spacing w:after="60" w:line="276" w:lineRule="auto"/>
+      </w:pPr>
+      <w:r>
+        <w:rPr>
+          <w:rFonts w:ascii="Times New Roman" w:hAnsi="Times New Roman"/>
+          <w:sz w:val="22"/>
+          <w:szCs w:val="22"/>
+        </w:rPr>
+        <w:t xml:space="preserve">[6]  Sharma, L., &amp; Chhibber, R. (2019). Investigating the physicochemical and thermophysical properties of submerged arc welding fluxes designed using TiO₂–SiO₂–MgO and SiO₂–MgO–Al₂O₃ flux systems for linepipe steels. Ceramics International, 45(2), 1569–1587.</w:t>
+      </w:r>
+    </w:p>
+    <w:p>
+      <w:pPr>
+        <w:ind w:left="600" w:hanging="600"/>
+        <w:jc w:val="both"/>
+        <w:spacing w:after="60" w:line="276" w:lineRule="auto"/>
+      </w:pPr>
+      <w:r>
+        <w:rPr>
+          <w:rFonts w:ascii="Times New Roman" w:hAnsi="Times New Roman"/>
+          <w:sz w:val="22"/>
+          <w:szCs w:val="22"/>
+        </w:rPr>
+        <w:t xml:space="preserve">[7]  Sharma, L., &amp; Chhibber, R. (2019). Design and development of submerged arc welding fluxes using TiO₂–SiO₂–CaO and SiO₂–CaO–Al₂O₃ flux systems. Proceedings of the Institution of Mechanical Engineers, Part E: Journal of Process Mechanical Engineering, 233(4), 739–762.</w:t>
+      </w:r>
+    </w:p>
+    <w:p>
+      <w:pPr>
+        <w:ind w:left="600" w:hanging="600"/>
+        <w:jc w:val="both"/>
+        <w:spacing w:after="60" w:line="276" w:lineRule="auto"/>
+      </w:pPr>
+      <w:r>
+        <w:rPr>
+          <w:rFonts w:ascii="Times New Roman" w:hAnsi="Times New Roman"/>
+          <w:sz w:val="22"/>
+          <w:szCs w:val="22"/>
+        </w:rPr>
+        <w:t xml:space="preserve">[8]  Sharma, L., &amp; Chhibber, R. (2019). Design of CaO–SiO₂–CaF₂ and CaO–SiO₂–Al₂O₃ based submerged arc fluxes for series of bead-on-plate pipeline steel welds: Effect on carbon and manganese content, grain size and microhardness. Journal of Pressure Vessel Technology, 141(1), 011404.</w:t>
+      </w:r>
+    </w:p>
+    <w:p>
+      <w:pPr>
+        <w:ind w:left="600" w:hanging="600"/>
+        <w:jc w:val="both"/>
+        <w:spacing w:after="60" w:line="276" w:lineRule="auto"/>
+      </w:pPr>
+      <w:r>
+        <w:rPr>
+          <w:rFonts w:ascii="Times New Roman" w:hAnsi="Times New Roman"/>
+          <w:sz w:val="22"/>
+          <w:szCs w:val="22"/>
+        </w:rPr>
+        <w:t xml:space="preserve">[9]  Sharma, L., Kumar, J., &amp; Chhibber, R. (2019). Experimental investigation on high-temperature wettability and structural behaviour of SAW fluxes using MgO–TiO₂–SiO₂ and Al₂O₃–MgO–SiO₂ flux systems. Ceramics International, 45(17), 22142–22155.</w:t>
+      </w:r>
+    </w:p>
+    <w:p>
+      <w:pPr>
+        <w:ind w:left="600" w:hanging="600"/>
+        <w:jc w:val="both"/>
+        <w:spacing w:after="60" w:line="276" w:lineRule="auto"/>
+      </w:pPr>
+      <w:r>
+        <w:rPr>
+          <w:rFonts w:ascii="Times New Roman" w:hAnsi="Times New Roman"/>
+          <w:sz w:val="22"/>
+          <w:szCs w:val="22"/>
+        </w:rPr>
+        <w:t xml:space="preserve">[10]  Sharma, L., &amp; Chhibber, R. (2019). Design and development of submerged arc welding slags using CaO–SiO₂–CaF₂ and CaO–SiO₂–Al₂O₃ systems. Silicon, 12(9), 2179–2190.</w:t>
+      </w:r>
+    </w:p>
+    <w:p>
+      <w:pPr>
+        <w:ind w:left="600" w:hanging="600"/>
+        <w:jc w:val="both"/>
+        <w:spacing w:after="60" w:line="276" w:lineRule="auto"/>
+      </w:pPr>
+      <w:r>
+        <w:rPr>
+          <w:rFonts w:ascii="Times New Roman" w:hAnsi="Times New Roman"/>
+          <w:sz w:val="22"/>
+          <w:szCs w:val="22"/>
+        </w:rPr>
+        <w:t xml:space="preserve">[11]  Sharma, L., &amp; Chhibber, R. (2019). Effect of heat treatment on mechanical properties and corrosion behaviour of API X70 linepipe steel in different environments. Transactions of the Indian Institute of Metals, 72(1), 93–110.</w:t>
+      </w:r>
+    </w:p>
+    <w:p>
+      <w:pPr>
+        <w:ind w:left="600" w:hanging="600"/>
+        <w:jc w:val="both"/>
+        <w:spacing w:after="60" w:line="276" w:lineRule="auto"/>
+      </w:pPr>
+      <w:r>
+        <w:rPr>
+          <w:rFonts w:ascii="Times New Roman" w:hAnsi="Times New Roman"/>
+          <w:sz w:val="22"/>
+          <w:szCs w:val="22"/>
+        </w:rPr>
+        <w:t xml:space="preserve">[12]  Sharma, L., &amp; Chhibber, R. (2018). Mechanical properties and hydrogen induced cracking behaviour of API X70 SAW weldments. International Journal of Pressure Vessels and Piping, 165, 193–207.</w:t>
+      </w:r>
+    </w:p>
+    <w:p>
+      <w:pPr>
+        <w:ind w:left="600" w:hanging="600"/>
+        <w:jc w:val="both"/>
+        <w:spacing w:after="60" w:line="276" w:lineRule="auto"/>
+      </w:pPr>
+      <w:r>
+        <w:rPr>
+          <w:rFonts w:ascii="Times New Roman" w:hAnsi="Times New Roman"/>
+          <w:sz w:val="22"/>
+          <w:szCs w:val="22"/>
+        </w:rPr>
+        <w:t xml:space="preserve">[13]  Arya, H. K., Singh, K., &amp; Saxena, R. K. (2018). Effect of weld cooling rates on mechanical and metallurgical properties of submerged arc welded pressure vessel steel. Journal of Pressure Vessel Technology, 140(4), 041406.</w:t>
+      </w:r>
+    </w:p>
+    <w:p>
+      <w:pPr>
+        <w:ind w:left="600" w:hanging="600"/>
+        <w:jc w:val="both"/>
+        <w:spacing w:after="60" w:line="276" w:lineRule="auto"/>
+      </w:pPr>
+      <w:r>
+        <w:rPr>
+          <w:rFonts w:ascii="Times New Roman" w:hAnsi="Times New Roman"/>
+          <w:sz w:val="22"/>
+          <w:szCs w:val="22"/>
+        </w:rPr>
+        <w:t xml:space="preserve">[14]  Arora, K. S., Pandu, R. S., Shajan, N., Pathak, P., &amp; Shome, M. (2018). Microstructure and impact toughness of reheated coarse-grain heat-affected zones of API X65 and API X80 linepipe steels. International Journal of Pressure Vessels and Piping, 167, 37–47.</w:t>
+      </w:r>
+    </w:p>
+    <w:p>
+      <w:pPr>
+        <w:ind w:left="600" w:hanging="600"/>
+        <w:jc w:val="both"/>
+        <w:spacing w:after="60" w:line="276" w:lineRule="auto"/>
+      </w:pPr>
+      <w:r>
+        <w:rPr>
+          <w:rFonts w:ascii="Times New Roman" w:hAnsi="Times New Roman"/>
+          <w:sz w:val="22"/>
+          <w:szCs w:val="22"/>
+        </w:rPr>
+        <w:t xml:space="preserve">[15]  Beidokhti, B., Koukabi, A. H., &amp; Dolati, A. (2009). Effect of titanium addition on the microstructure and inclusion formation in submerged arc welded HSLA pipeline steel. Journal of Materials Processing Technology, 209(8), 4027–4035.</w:t>
+      </w:r>
+    </w:p>
+    <w:p>
+      <w:pPr>
+        <w:ind w:left="600" w:hanging="600"/>
+        <w:jc w:val="both"/>
+        <w:spacing w:after="60" w:line="276" w:lineRule="auto"/>
+      </w:pPr>
+      <w:r>
+        <w:rPr>
+          <w:rFonts w:ascii="Times New Roman" w:hAnsi="Times New Roman"/>
+          <w:sz w:val="22"/>
+          <w:szCs w:val="22"/>
+        </w:rPr>
+        <w:t xml:space="preserve">[16]  Houldcroft, P. T. (1989). Submerged-arc welding. Abington Publishing, Cambridge, England.</w:t>
+      </w:r>
+    </w:p>
+    <w:p>
+      <w:pPr>
+        <w:ind w:left="600" w:hanging="600"/>
+        <w:jc w:val="both"/>
+        <w:spacing w:after="60" w:line="276" w:lineRule="auto"/>
+      </w:pPr>
+      <w:r>
+        <w:rPr>
+          <w:rFonts w:ascii="Times New Roman" w:hAnsi="Times New Roman"/>
+          <w:sz w:val="22"/>
+          <w:szCs w:val="22"/>
+        </w:rPr>
+        <w:t xml:space="preserve">[17]  Kou, S. (2003). Welding metallurgy (2nd ed.). John Wiley &amp; Sons.</w:t>
+      </w:r>
+    </w:p>
+    <w:p>
+      <w:pPr>
+        <w:ind w:left="600" w:hanging="600"/>
+        <w:jc w:val="both"/>
+        <w:spacing w:after="60" w:line="276" w:lineRule="auto"/>
+      </w:pPr>
+      <w:r>
+        <w:rPr>
+          <w:rFonts w:ascii="Times New Roman" w:hAnsi="Times New Roman"/>
+          <w:sz w:val="22"/>
+          <w:szCs w:val="22"/>
+        </w:rPr>
+        <w:t xml:space="preserve">[18]  Davis, M. L. E., &amp; Coe, F. R. (1977). The chemistry of submerged arc welding fluxes. The Welding Institute Research Report, 39/1977/M.</w:t>
+      </w:r>
+    </w:p>
+    <w:p>
+      <w:pPr>
+        <w:ind w:left="600" w:hanging="600"/>
+        <w:jc w:val="both"/>
+        <w:spacing w:after="60" w:line="276" w:lineRule="auto"/>
+      </w:pPr>
+      <w:r>
+        <w:rPr>
+          <w:rFonts w:ascii="Times New Roman" w:hAnsi="Times New Roman"/>
+          <w:sz w:val="22"/>
+          <w:szCs w:val="22"/>
+        </w:rPr>
+        <w:t xml:space="preserve">[19]  Kanjilal, P., Pal, T. K., &amp; Majumdar, S. K. (2006). Combined effect of flux and welding parameters on chemical composition and mechanical properties of submerged arc weld metal. Journal of Materials Processing Technology, 171(2), 223–231.</w:t>
+      </w:r>
+    </w:p>
+    <w:p>
+      <w:pPr>
+        <w:ind w:left="600" w:hanging="600"/>
+        <w:jc w:val="both"/>
+        <w:spacing w:after="60" w:line="276" w:lineRule="auto"/>
+      </w:pPr>
+      <w:r>
+        <w:rPr>
+          <w:rFonts w:ascii="Times New Roman" w:hAnsi="Times New Roman"/>
+          <w:sz w:val="22"/>
+          <w:szCs w:val="22"/>
+        </w:rPr>
+        <w:t xml:space="preserve">[20]  Bang, K., Park, C., Jung, H., &amp; Lee, J. (2009). Effects of flux composition on the element transfer and mechanical properties of weld metal in submerged arc welding. Metals and Materials International, 15(3), 471–477.</w:t>
+      </w:r>
+    </w:p>
+    <w:p>
+      <w:pPr>
+        <w:ind w:left="600" w:hanging="600"/>
+        <w:jc w:val="both"/>
+        <w:spacing w:after="60" w:line="276" w:lineRule="auto"/>
+      </w:pPr>
+      <w:r>
+        <w:rPr>
+          <w:rFonts w:ascii="Times New Roman" w:hAnsi="Times New Roman"/>
+          <w:sz w:val="22"/>
+          <w:szCs w:val="22"/>
+        </w:rPr>
+        <w:t xml:space="preserve">[21]  Kanjilal, P., Majumdar, S. K., &amp; Pal, T. K. (2005). Prediction of acicular ferrite in C–Mn steel weld metals. ISIJ International, 45(6), 876–885.</w:t>
+      </w:r>
+    </w:p>
+    <w:p>
+      <w:pPr>
+        <w:ind w:left="600" w:hanging="600"/>
+        <w:jc w:val="both"/>
+        <w:spacing w:after="60" w:line="276" w:lineRule="auto"/>
+      </w:pPr>
+      <w:r>
+        <w:rPr>
+          <w:rFonts w:ascii="Times New Roman" w:hAnsi="Times New Roman"/>
+          <w:sz w:val="22"/>
+          <w:szCs w:val="22"/>
+        </w:rPr>
+        <w:t xml:space="preserve">[22]  Davis, M. L. E., &amp; Bailey, N. (1991). Evidence of inclusion chemistry for element transfer in submerged arc welding. Welding Journal Research Supplement, 70(2), 58–65.</w:t>
+      </w:r>
+    </w:p>
+    <w:p>
+      <w:pPr>
+        <w:ind w:left="600" w:hanging="600"/>
+        <w:jc w:val="both"/>
+        <w:spacing w:after="60" w:line="276" w:lineRule="auto"/>
+      </w:pPr>
+      <w:r>
+        <w:rPr>
+          <w:rFonts w:ascii="Times New Roman" w:hAnsi="Times New Roman"/>
+          <w:sz w:val="22"/>
+          <w:szCs w:val="22"/>
+        </w:rPr>
+        <w:t xml:space="preserve">[23]  North, T. H., Bell, H. B., Nowicki, A., &amp; Craig, I. (1978). Slag/metal interaction, oxygen and toughness in submerged arc welding. Welding Journal Research Supplement, 57(3), 63s–75s.</w:t>
+      </w:r>
+    </w:p>
+    <w:p>
+      <w:pPr>
+        <w:ind w:left="600" w:hanging="600"/>
+        <w:jc w:val="both"/>
+        <w:spacing w:after="60" w:line="276" w:lineRule="auto"/>
+      </w:pPr>
+      <w:r>
+        <w:rPr>
+          <w:rFonts w:ascii="Times New Roman" w:hAnsi="Times New Roman"/>
+          <w:sz w:val="22"/>
+          <w:szCs w:val="22"/>
+        </w:rPr>
+        <w:t xml:space="preserve">[24]  Datta, S., Bandyopadhyay, A., &amp; Pal, P. K. (2008). Application of Taguchi philosophy for parametric optimization of bead geometry and HAZ width in submerged arc welding using a mixture of fresh flux and fused flux. International Journal of Advanced Manufacturing Technology, 36(7–8), 689–698.</w:t>
+      </w:r>
+    </w:p>
+    <w:p>
+      <w:pPr>
+        <w:ind w:left="600" w:hanging="600"/>
+        <w:jc w:val="both"/>
+        <w:spacing w:after="60" w:line="276" w:lineRule="auto"/>
+      </w:pPr>
+      <w:r>
+        <w:rPr>
+          <w:rFonts w:ascii="Times New Roman" w:hAnsi="Times New Roman"/>
+          <w:sz w:val="22"/>
+          <w:szCs w:val="22"/>
+        </w:rPr>
+        <w:t xml:space="preserve">[25]  Palm, J. H. (1972). How fluxes determine the metallurgical properties of submerged arc welds. Welding Journal, 358S–360S.</w:t>
+      </w:r>
+    </w:p>
+    <w:p>
+      <w:pPr>
+        <w:ind w:left="600" w:hanging="600"/>
+        <w:jc w:val="both"/>
+        <w:spacing w:after="60" w:line="276" w:lineRule="auto"/>
+      </w:pPr>
+      <w:r>
+        <w:rPr>
+          <w:rFonts w:ascii="Times New Roman" w:hAnsi="Times New Roman"/>
+          <w:sz w:val="22"/>
+          <w:szCs w:val="22"/>
+        </w:rPr>
+        <w:t xml:space="preserve">[26]  Crespo, A. C., Puchol, R. Q., Gonzalez, L. P., Sanchez, L. G., Gomez Perez, C. R., Cedre, E. D., Mendez, T. O., &amp; Pozol, J. A. (2007). Obtaining a submerged arc welding flux of the MnO–SiO₂–CaO–Al₂O₃–CaF₂ system by fusion. Welding International, 21(7), 502–511.</w:t>
+      </w:r>
+    </w:p>
+    <w:p>
+      <w:pPr>
+        <w:ind w:left="600" w:hanging="600"/>
+        <w:jc w:val="both"/>
+        <w:spacing w:after="60" w:line="276" w:lineRule="auto"/>
+      </w:pPr>
+      <w:r>
+        <w:rPr>
+          <w:rFonts w:ascii="Times New Roman" w:hAnsi="Times New Roman"/>
+          <w:sz w:val="22"/>
+          <w:szCs w:val="22"/>
+        </w:rPr>
+        <w:t xml:space="preserve">[27]  Campbell, H. C., &amp; Johnson, W. C. (1957). Bonded fluxes for submerged arc welding of alloy steels. Welding Journal.</w:t>
+      </w:r>
+    </w:p>
+    <w:p>
+      <w:pPr>
+        <w:ind w:left="600" w:hanging="600"/>
+        <w:jc w:val="both"/>
+        <w:spacing w:after="60" w:line="276" w:lineRule="auto"/>
+      </w:pPr>
+      <w:r>
+        <w:rPr>
+          <w:rFonts w:ascii="Times New Roman" w:hAnsi="Times New Roman"/>
+          <w:sz w:val="22"/>
+          <w:szCs w:val="22"/>
+        </w:rPr>
+        <w:t xml:space="preserve">[28]  Golovko, V. V., &amp; Potapov, N. N. (2011). Special features of agglomerated (ceramic) fluxes in welding. Welding International, 25(11), 889–893.</w:t>
+      </w:r>
+    </w:p>
+    <w:p>
+      <w:pPr>
+        <w:ind w:left="600" w:hanging="600"/>
+        <w:jc w:val="both"/>
+        <w:spacing w:after="60" w:line="276" w:lineRule="auto"/>
+      </w:pPr>
+      <w:r>
+        <w:rPr>
+          <w:rFonts w:ascii="Times New Roman" w:hAnsi="Times New Roman"/>
+          <w:sz w:val="22"/>
+          <w:szCs w:val="22"/>
+        </w:rPr>
+        <w:t xml:space="preserve">[29]  Singh, B., Khan, Z. A., &amp; Siddiquee, A. N. (2013). Review on effect of flux composition on its behavior and bead geometry in submerged arc welding. Journal of Mechanical Engineering Research, 5(7), 123–127.</w:t>
+      </w:r>
+    </w:p>
+    <w:p>
+      <w:pPr>
+        <w:ind w:left="600" w:hanging="600"/>
+        <w:jc w:val="both"/>
+        <w:spacing w:after="60" w:line="276" w:lineRule="auto"/>
+      </w:pPr>
+      <w:r>
+        <w:rPr>
+          <w:rFonts w:ascii="Times New Roman" w:hAnsi="Times New Roman"/>
+          <w:sz w:val="22"/>
+          <w:szCs w:val="22"/>
+        </w:rPr>
+        <w:t xml:space="preserve">[30]  Paniagua-Mercado, A. M., Lopez-Hirata, V. M., &amp; Saucedo-Munoz, M. L. (2005). Influence of chemical composition of flux on the microstructure and tensile properties of submerged arc welds. Journal of Materials Processing Technology, 169(3), 346–351.</w:t>
+      </w:r>
+    </w:p>
+    <w:p>
+      <w:pPr>
+        <w:ind w:left="600" w:hanging="600"/>
+        <w:jc w:val="both"/>
+        <w:spacing w:after="60" w:line="276" w:lineRule="auto"/>
+      </w:pPr>
+      <w:r>
+        <w:rPr>
+          <w:rFonts w:ascii="Times New Roman" w:hAnsi="Times New Roman"/>
+          <w:sz w:val="22"/>
+          <w:szCs w:val="22"/>
+        </w:rPr>
+        <w:t xml:space="preserve">[31]  Adeyeye, A. D., &amp; Oyawale, F. A. (2008). Mixture experiments and their applications in welding flux design. Journal of the Brazilian Society of Mechanical Sciences and Engineering, 30(4), 319–326.</w:t>
+      </w:r>
+    </w:p>
+    <w:p>
+      <w:pPr>
+        <w:ind w:left="600" w:hanging="600"/>
+        <w:jc w:val="both"/>
+        <w:spacing w:after="60" w:line="276" w:lineRule="auto"/>
+      </w:pPr>
+      <w:r>
+        <w:rPr>
+          <w:rFonts w:ascii="Times New Roman" w:hAnsi="Times New Roman"/>
+          <w:sz w:val="22"/>
+          <w:szCs w:val="22"/>
+        </w:rPr>
+        <w:t xml:space="preserve">[32]  Jackson, C. E. (1973). Fluxes and slags in welding. Welding Research Council Bulletin, 190.</w:t>
+      </w:r>
+    </w:p>
+    <w:p>
+      <w:pPr>
+        <w:ind w:left="600" w:hanging="600"/>
+        <w:jc w:val="both"/>
+        <w:spacing w:after="60" w:line="276" w:lineRule="auto"/>
+      </w:pPr>
+      <w:r>
+        <w:rPr>
+          <w:rFonts w:ascii="Times New Roman" w:hAnsi="Times New Roman"/>
+          <w:sz w:val="22"/>
+          <w:szCs w:val="22"/>
+        </w:rPr>
+        <w:t xml:space="preserve">[33]  Chai, C. S., &amp; Eagar, T. W. (1982). Slag-metal reactions in binary CaF₂–metal oxide welding fluxes. Welding Journal, 61(7), 229–232.</w:t>
+      </w:r>
+    </w:p>
+    <w:p>
+      <w:pPr>
+        <w:ind w:left="600" w:hanging="600"/>
+        <w:jc w:val="both"/>
+        <w:spacing w:after="60" w:line="276" w:lineRule="auto"/>
+      </w:pPr>
+      <w:r>
+        <w:rPr>
+          <w:rFonts w:ascii="Times New Roman" w:hAnsi="Times New Roman"/>
+          <w:sz w:val="22"/>
+          <w:szCs w:val="22"/>
+        </w:rPr>
+        <w:t xml:space="preserve">[34]  Kanjilal, P., Pal, T. K., &amp; Majumdar, S. K. (2007). Prediction of element transfer in submerged arc welding. Welding Journal, 86(4), 135S–146S.</w:t>
+      </w:r>
+    </w:p>
+    <w:p>
+      <w:pPr>
+        <w:ind w:left="600" w:hanging="600"/>
+        <w:jc w:val="both"/>
+        <w:spacing w:after="60" w:line="276" w:lineRule="auto"/>
+      </w:pPr>
+      <w:r>
+        <w:rPr>
+          <w:rFonts w:ascii="Times New Roman" w:hAnsi="Times New Roman"/>
+          <w:sz w:val="22"/>
+          <w:szCs w:val="22"/>
+        </w:rPr>
+        <w:t xml:space="preserve">[35]  Schwemer, D. D., Olson, D. L., &amp; Williamson, D. L. (1979). Relationship of weld penetration to the welding flux. Welding Research Supplement, 153S–160S.</w:t>
+      </w:r>
+    </w:p>
+    <w:p>
+      <w:pPr>
+        <w:ind w:left="600" w:hanging="600"/>
+        <w:jc w:val="both"/>
+        <w:spacing w:after="60" w:line="276" w:lineRule="auto"/>
+      </w:pPr>
+      <w:r>
+        <w:rPr>
+          <w:rFonts w:ascii="Times New Roman" w:hAnsi="Times New Roman"/>
+          <w:sz w:val="22"/>
+          <w:szCs w:val="22"/>
+        </w:rPr>
+        <w:t xml:space="preserve">[36]  Dallam, C. B., Liu, S., &amp; Olson, D. L. (1985). Flux composition dependence of microstructure and toughness of submerged arc HSLA weldments. Welding Research Supplement, 140S–152S.</w:t>
+      </w:r>
+    </w:p>
+    <w:p>
+      <w:pPr>
+        <w:ind w:left="600" w:hanging="600"/>
+        <w:jc w:val="both"/>
+        <w:spacing w:after="60" w:line="276" w:lineRule="auto"/>
+      </w:pPr>
+      <w:r>
+        <w:rPr>
+          <w:rFonts w:ascii="Times New Roman" w:hAnsi="Times New Roman"/>
+          <w:sz w:val="22"/>
+          <w:szCs w:val="22"/>
+        </w:rPr>
+        <w:t xml:space="preserve">[37]  Fox, A. G., Eakes, M. W., &amp; Franke, G. I. (1996). The effect of small changes in flux basicity on the acicular ferrite content and mechanical properties of submerged arc weld metal. Welding Research Supplement, 330S–342S.</w:t>
+      </w:r>
+    </w:p>
+    <w:p>
+      <w:pPr>
+        <w:ind w:left="600" w:hanging="600"/>
+        <w:jc w:val="both"/>
+        <w:spacing w:after="60" w:line="276" w:lineRule="auto"/>
+      </w:pPr>
+      <w:r>
+        <w:rPr>
+          <w:rFonts w:ascii="Times New Roman" w:hAnsi="Times New Roman"/>
+          <w:sz w:val="22"/>
+          <w:szCs w:val="22"/>
+        </w:rPr>
+        <w:t xml:space="preserve">[38]  Plessis, J. D., Toit, M. D., &amp; Pistorius, P. C. (2007). Control of diffusible weld metal hydrogen through flux chemistry modification. Welding Journal, 86, 273–280.</w:t>
+      </w:r>
+    </w:p>
+    <w:p>
+      <w:pPr>
+        <w:ind w:left="600" w:hanging="600"/>
+        <w:jc w:val="both"/>
+        <w:spacing w:after="60" w:line="276" w:lineRule="auto"/>
+      </w:pPr>
+      <w:r>
+        <w:rPr>
+          <w:rFonts w:ascii="Times New Roman" w:hAnsi="Times New Roman"/>
+          <w:sz w:val="22"/>
+          <w:szCs w:val="22"/>
+        </w:rPr>
+        <w:t xml:space="preserve">[39]  Houldcroft, P. T. (1977). Welding Process Technology. Cambridge University Press.</w:t>
+      </w:r>
+    </w:p>
+    <w:p>
+      <w:pPr>
+        <w:ind w:left="600" w:hanging="600"/>
+        <w:jc w:val="both"/>
+        <w:spacing w:after="60" w:line="276" w:lineRule="auto"/>
+      </w:pPr>
+      <w:r>
+        <w:rPr>
+          <w:rFonts w:ascii="Times New Roman" w:hAnsi="Times New Roman"/>
+          <w:sz w:val="22"/>
+          <w:szCs w:val="22"/>
+        </w:rPr>
+        <w:t xml:space="preserve">[40]  Jung, E. J., &amp; Min, D. J. (2012). Effect of Al₂O₃ and MgO on interfacial tension between calcium silicate-based melts and a solid steel substrate. Steel Research International, 83(7), 705–711.</w:t>
+      </w:r>
+    </w:p>
+    <w:p>
+      <w:pPr>
+        <w:ind w:left="600" w:hanging="600"/>
+        <w:jc w:val="both"/>
+        <w:spacing w:after="60" w:line="276" w:lineRule="auto"/>
+      </w:pPr>
+      <w:r>
+        <w:rPr>
+          <w:rFonts w:ascii="Times New Roman" w:hAnsi="Times New Roman"/>
+          <w:sz w:val="22"/>
+          <w:szCs w:val="22"/>
+        </w:rPr>
+        <w:t xml:space="preserve">[41]  Jung, E. J., Kim, W., Sohn, I., &amp; Min, D. J. (2010). A study on the interfacial tension between solid iron and CaO–SiO₂–MO system. Journal of Materials Science, 45, 2023–2029.</w:t>
+      </w:r>
+    </w:p>
+    <w:p>
+      <w:pPr>
+        <w:ind w:left="600" w:hanging="600"/>
+        <w:jc w:val="both"/>
+        <w:spacing w:after="60" w:line="276" w:lineRule="auto"/>
+      </w:pPr>
+      <w:r>
+        <w:rPr>
+          <w:rFonts w:ascii="Times New Roman" w:hAnsi="Times New Roman"/>
+          <w:sz w:val="22"/>
+          <w:szCs w:val="22"/>
+        </w:rPr>
+        <w:t xml:space="preserve">[42]  Sharma, L., &amp; Chhibber, R. (2019). Design of TiO₂–SiO₂–MgO and SiO₂–MgO–Al₂O₃ based submerged arc fluxes for multi-pass bead-on-plate linepipe steel welds. Journal of Pressure Vessel Technology, 141(1), 011403.</w:t>
+      </w:r>
+    </w:p>
+    <w:p>
+      <w:pPr>
+        <w:ind w:left="600" w:hanging="600"/>
+        <w:jc w:val="both"/>
+        <w:spacing w:after="60" w:line="276" w:lineRule="auto"/>
+      </w:pPr>
+      <w:r>
+        <w:rPr>
+          <w:rFonts w:ascii="Times New Roman" w:hAnsi="Times New Roman"/>
+          <w:sz w:val="22"/>
+          <w:szCs w:val="22"/>
+        </w:rPr>
+        <w:t xml:space="preserve">[43]  Kim, J. B., Choi, J. K., Han, I. W., &amp; Sohn, I. (2015). High-temperature wettability and structure of the TiO₂–MnO–SiO₂–Al₂O₃ welding flux system. Journal of Non-Crystalline Solids.</w:t>
+      </w:r>
+    </w:p>
+    <w:p>
+      <w:pPr>
+        <w:ind w:left="600" w:hanging="600"/>
+        <w:jc w:val="both"/>
+        <w:spacing w:after="60" w:line="276" w:lineRule="auto"/>
+      </w:pPr>
+      <w:r>
+        <w:rPr>
+          <w:rFonts w:ascii="Times New Roman" w:hAnsi="Times New Roman"/>
+          <w:sz w:val="22"/>
+          <w:szCs w:val="22"/>
+        </w:rPr>
+        <w:t xml:space="preserve">[44]  Quintana, R., Cruz, A., Perdomo, L., Castellanos, G., García, L. L., Formoso, A., &amp; Cores, A. (2003). Study of the transfer efficiency of alloyed elements in fluxes during the submerged arc welding process. Welding International, 17(12), 958–965.</w:t>
+      </w:r>
+    </w:p>
+    <w:p>
+      <w:pPr>
+        <w:ind w:left="600" w:hanging="600"/>
+        <w:jc w:val="both"/>
+        <w:spacing w:after="60" w:line="276" w:lineRule="auto"/>
+      </w:pPr>
+      <w:r>
+        <w:rPr>
+          <w:rFonts w:ascii="Times New Roman" w:hAnsi="Times New Roman"/>
+          <w:sz w:val="22"/>
+          <w:szCs w:val="22"/>
+        </w:rPr>
+        <w:t xml:space="preserve">[45]  Jindal, S., Chhibber, R., &amp; Mehta, N. P. (2013). Investigation on flux design for submerged arc welding of high-strength low-alloy steel. Proceedings of the Institution of Mechanical Engineers, Part B: Journal of Engineering Manufacture, 227(3), 383–395.</w:t>
+      </w:r>
+    </w:p>
+    <w:p>
+      <w:pPr>
+        <w:ind w:left="600" w:hanging="600"/>
+        <w:jc w:val="both"/>
+        <w:spacing w:after="60" w:line="276" w:lineRule="auto"/>
+      </w:pPr>
+      <w:r>
+        <w:rPr>
+          <w:rFonts w:ascii="Times New Roman" w:hAnsi="Times New Roman"/>
+          <w:sz w:val="22"/>
+          <w:szCs w:val="22"/>
+        </w:rPr>
+        <w:t xml:space="preserve">[46]  Baune, E., Bonnet, C., &amp; Liu, S. (2000). Reconsidering the basicity of a FCAW consumable—Part 1: Solidified slag composition of a FCAW consumable as a basicity indicator. Welding Journal, 79(3), 57S–65S.</w:t>
+      </w:r>
+    </w:p>
+    <w:p>
+      <w:pPr>
+        <w:ind w:left="600" w:hanging="600"/>
+        <w:jc w:val="both"/>
+        <w:spacing w:after="60" w:line="276" w:lineRule="auto"/>
+      </w:pPr>
+      <w:r>
+        <w:rPr>
+          <w:rFonts w:ascii="Times New Roman" w:hAnsi="Times New Roman"/>
+          <w:sz w:val="22"/>
+          <w:szCs w:val="22"/>
+        </w:rPr>
+        <w:t xml:space="preserve">[47]  Jindal, S., Chhibber, R., &amp; Mehta, N. P. (2013). Effect of flux constituents and basicity index on mechanical properties and microstructural evolution of submerged arc welded high-strength low-alloy steel. Materials Science Forum, 738–739, 242–246.</w:t>
+      </w:r>
+    </w:p>
+    <w:p>
+      <w:pPr>
+        <w:ind w:left="600" w:hanging="600"/>
+        <w:jc w:val="both"/>
+        <w:spacing w:after="60" w:line="276" w:lineRule="auto"/>
+      </w:pPr>
+      <w:r>
+        <w:rPr>
+          <w:rFonts w:ascii="Times New Roman" w:hAnsi="Times New Roman"/>
+          <w:sz w:val="22"/>
+          <w:szCs w:val="22"/>
+        </w:rPr>
+        <w:t xml:space="preserve">[48]  Zhang, J., Wang, X., Zhao, Y., &amp; Liu, C. (2022). A review on parallel development of flux design and welding metallurgy in submerged arc welding. Processes, 10(11), 2305.</w:t>
+      </w:r>
+    </w:p>
+    <w:p>
+      <w:pPr>
+        <w:ind w:left="600" w:hanging="600"/>
+        <w:jc w:val="both"/>
+        <w:spacing w:after="60" w:line="276" w:lineRule="auto"/>
+      </w:pPr>
+      <w:r>
+        <w:rPr>
+          <w:rFonts w:ascii="Times New Roman" w:hAnsi="Times New Roman"/>
+          <w:sz w:val="22"/>
+          <w:szCs w:val="22"/>
+        </w:rPr>
+        <w:t xml:space="preserve">[49]  ASTM International. (2023). ASTM E8/E8M: Standard test methods for tension testing of metallic materials. ASTM International.</w:t>
+      </w:r>
+    </w:p>
+    <w:p>
+      <w:pPr>
+        <w:ind w:left="600" w:hanging="600"/>
+        <w:jc w:val="both"/>
+        <w:spacing w:after="60" w:line="276" w:lineRule="auto"/>
+      </w:pPr>
+      <w:r>
+        <w:rPr>
+          <w:rFonts w:ascii="Times New Roman" w:hAnsi="Times New Roman"/>
+          <w:sz w:val="22"/>
+          <w:szCs w:val="22"/>
+        </w:rPr>
+        <w:t xml:space="preserve">[50]  Adeyeye, A. D., &amp; Oyawale, F. A. (2009). Weld-metal property optimization from flux ingredients through mixture experiments and mathematical programming approach. Materials Research, 12(3), 339–343.</w:t>
+      </w:r>
+    </w:p>
+    <w:p>
+      <w:pPr>
+        <w:ind w:left="600" w:hanging="600"/>
+        <w:jc w:val="both"/>
+        <w:spacing w:after="60" w:line="276" w:lineRule="auto"/>
+      </w:pPr>
+      <w:r>
+        <w:rPr>
+          <w:rFonts w:ascii="Times New Roman" w:hAnsi="Times New Roman"/>
+          <w:sz w:val="22"/>
+          <w:szCs w:val="22"/>
+        </w:rPr>
+        <w:t xml:space="preserve">[51]  ASTM International. (2023). ASTM E23: Standard test methods for notched bar impact testing of metallic materials. ASTM International.</w:t>
+      </w:r>
+    </w:p>
+    <w:p>
+      <w:pPr>
+        <w:ind w:left="600" w:hanging="600"/>
+        <w:jc w:val="both"/>
+        <w:spacing w:after="60" w:line="276" w:lineRule="auto"/>
+      </w:pPr>
+      <w:r>
+        <w:rPr>
+          <w:rFonts w:ascii="Times New Roman" w:hAnsi="Times New Roman"/>
+          <w:sz w:val="22"/>
+          <w:szCs w:val="22"/>
+        </w:rPr>
+        <w:t xml:space="preserve">[52]  Callister, W. D., &amp; Rethwisch, D. G. (2020). Materials science and engineering: An introduction (10th ed.). John Wiley &amp; Sons.</w:t>
+      </w:r>
+    </w:p>
+    <w:p>
+      <w:pPr>
+        <w:ind w:left="600" w:hanging="600"/>
+        <w:jc w:val="both"/>
+        <w:spacing w:after="60" w:line="276" w:lineRule="auto"/>
+      </w:pPr>
+      <w:r>
+        <w:rPr>
+          <w:rFonts w:ascii="Times New Roman" w:hAnsi="Times New Roman"/>
+          <w:sz w:val="22"/>
+          <w:szCs w:val="22"/>
+        </w:rPr>
+        <w:t xml:space="preserve">[53]  Zhang, J., Wang, X., Zhao, Y., &amp; Liu, C. (2022). A review on parallel development of flux design and welding metallurgy in submerged arc welding. Processes, 10(11), 2305. https://doi.org/10.3390/pr10112305</w:t>
+      </w:r>
+    </w:p>
+    <w:p>
+      <w:pPr>
+        <w:ind w:left="600" w:hanging="600"/>
+        <w:jc w:val="both"/>
+        <w:spacing w:after="60" w:line="276" w:lineRule="auto"/>
+      </w:pPr>
+      <w:r>
+        <w:rPr>
+          <w:rFonts w:ascii="Times New Roman" w:hAnsi="Times New Roman"/>
+          <w:sz w:val="22"/>
+          <w:szCs w:val="22"/>
+        </w:rPr>
+        <w:t xml:space="preserve">[54]  Kumar, A., &amp; Chhibber, R. (2024). Microhardness and element transfer investigation of weld bead using formulated SiO₂–CaO–CaF₂–BaO SMAW electrode coatings. Proceedings of the Institution of Mechanical Engineers, Part C: Journal of Mechanical Engineering Science.</w:t>
+      </w:r>
+    </w:p>
+    <w:p>
+      <w:pPr>
+        <w:ind w:left="600" w:hanging="600"/>
+        <w:jc w:val="both"/>
+        <w:spacing w:after="60" w:line="276" w:lineRule="auto"/>
+      </w:pPr>
+      <w:r>
+        <w:rPr>
+          <w:rFonts w:ascii="Times New Roman" w:hAnsi="Times New Roman"/>
+          <w:sz w:val="22"/>
+          <w:szCs w:val="22"/>
+        </w:rPr>
+        <w:t xml:space="preserve">[55]  Bhadeshia, H. K. D. H. (2001). Bainite in steels: Transformations, microstructure and properties (2nd ed.). Institute of Materials.</w:t>
+      </w:r>
+    </w:p>
+    <w:p>
+      <w:pPr>
+        <w:ind w:left="600" w:hanging="600"/>
+        <w:jc w:val="both"/>
+        <w:spacing w:after="60" w:line="276" w:lineRule="auto"/>
+      </w:pPr>
+      <w:r>
+        <w:rPr>
+          <w:rFonts w:ascii="Times New Roman" w:hAnsi="Times New Roman"/>
+          <w:sz w:val="22"/>
+          <w:szCs w:val="22"/>
+        </w:rPr>
+        <w:t xml:space="preserve">[56]  Lancaster, J. F. (1999). The metallurgy of welding (6th ed.). Woodhead Publishing.</w:t>
+      </w:r>
+    </w:p>
+    <w:p>
+      <w:pPr>
+        <w:ind w:left="600" w:hanging="600"/>
+        <w:jc w:val="both"/>
+        <w:spacing w:after="60" w:line="276" w:lineRule="auto"/>
+      </w:pPr>
+      <w:r>
+        <w:rPr>
+          <w:rFonts w:ascii="Times New Roman" w:hAnsi="Times New Roman"/>
+          <w:sz w:val="22"/>
+          <w:szCs w:val="22"/>
+        </w:rPr>
+        <w:t xml:space="preserve">[57]  Easterling, K. (1992). Introduction to the physical metallurgy of welding. Butterworth-Heinemann.</w:t>
+      </w:r>
+    </w:p>
+    <w:p>
+      <w:pPr>
+        <w:ind w:left="600" w:hanging="600"/>
+        <w:jc w:val="both"/>
+        <w:spacing w:after="60" w:line="276" w:lineRule="auto"/>
+      </w:pPr>
+      <w:r>
+        <w:rPr>
+          <w:rFonts w:ascii="Times New Roman" w:hAnsi="Times New Roman"/>
+          <w:sz w:val="22"/>
+          <w:szCs w:val="22"/>
+        </w:rPr>
+        <w:t xml:space="preserve">[58]  Svensson, L. E. (1994). Control of microstructures and properties in steel arc welds. CRC Press.</w:t>
+      </w:r>
+    </w:p>
+    <w:p>
+      <w:pPr>
+        <w:ind w:left="600" w:hanging="600"/>
+        <w:jc w:val="both"/>
+        <w:spacing w:after="60" w:line="276" w:lineRule="auto"/>
+      </w:pPr>
+      <w:r>
+        <w:rPr>
+          <w:rFonts w:ascii="Times New Roman" w:hAnsi="Times New Roman"/>
+          <w:sz w:val="22"/>
+          <w:szCs w:val="22"/>
+        </w:rPr>
+        <w:t xml:space="preserve">[59]  Thewlis, G. (1994). Classification and quantification of microstructures in steels. Materials Science and Technology, 10(2), 110–125.</w:t>
+      </w:r>
+    </w:p>
+    <w:p>
+      <w:pPr>
+        <w:ind w:left="600" w:hanging="600"/>
+        <w:jc w:val="both"/>
+        <w:spacing w:after="60" w:line="276" w:lineRule="auto"/>
+      </w:pPr>
+      <w:r>
+        <w:rPr>
+          <w:rFonts w:ascii="Times New Roman" w:hAnsi="Times New Roman"/>
+          <w:sz w:val="22"/>
+          <w:szCs w:val="22"/>
+        </w:rPr>
+        <w:t xml:space="preserve">[60]  Olson, D. L. (1986). Prediction of acicular ferrite formation in C–Mn steel weld metal. Welding Journal Research Supplement, 97S–106S.</w:t>
+      </w:r>
+    </w:p>
+    <w:p>
+      <w:pPr>
+        <w:ind w:left="600" w:hanging="600"/>
+        <w:jc w:val="both"/>
+        <w:spacing w:after="60" w:line="276" w:lineRule="auto"/>
+      </w:pPr>
+      <w:r>
+        <w:rPr>
+          <w:rFonts w:ascii="Times New Roman" w:hAnsi="Times New Roman"/>
+          <w:sz w:val="22"/>
+          <w:szCs w:val="22"/>
+        </w:rPr>
+        <w:t xml:space="preserve">[61]  Montgomery, D. C. (2019). Design and analysis of experiments (10th ed.). John Wiley &amp; Sons.</w:t>
+      </w:r>
+    </w:p>
+    <w:p>
+      <w:pPr>
+        <w:ind w:left="600" w:hanging="600"/>
+        <w:jc w:val="both"/>
+        <w:spacing w:after="60" w:line="276" w:lineRule="auto"/>
+      </w:pPr>
+      <w:r>
+        <w:rPr>
+          <w:rFonts w:ascii="Times New Roman" w:hAnsi="Times New Roman"/>
+          <w:sz w:val="22"/>
+          <w:szCs w:val="22"/>
+        </w:rPr>
+        <w:t xml:space="preserve">[62]  Cornell, J. A. (2011). Experiments with mixtures: Designs, models, and the analysis of mixture data (3rd ed.). Wiley.</w:t>
+      </w:r>
+    </w:p>
+    <w:p>
+      <w:pPr>
+        <w:ind w:left="600" w:hanging="600"/>
+        <w:jc w:val="both"/>
+        <w:spacing w:after="60" w:line="276" w:lineRule="auto"/>
+      </w:pPr>
+      <w:r>
+        <w:rPr>
+          <w:rFonts w:ascii="Times New Roman" w:hAnsi="Times New Roman"/>
+          <w:sz w:val="22"/>
+          <w:szCs w:val="22"/>
+        </w:rPr>
+        <w:t xml:space="preserve">[63]  Myers, R. H., Montgomery, D. C., &amp; Anderson-Cook, C. M. (2016). Response surface methodology (4th ed.). Wiley.</w:t>
+      </w:r>
+    </w:p>
+    <w:p>
+      <w:pPr>
+        <w:ind w:left="600" w:hanging="600"/>
+        <w:jc w:val="both"/>
+        <w:spacing w:after="60" w:line="276" w:lineRule="auto"/>
+      </w:pPr>
+      <w:r>
+        <w:rPr>
+          <w:rFonts w:ascii="Times New Roman" w:hAnsi="Times New Roman"/>
+          <w:sz w:val="22"/>
+          <w:szCs w:val="22"/>
+        </w:rPr>
+        <w:t xml:space="preserve">[64]  Fisher, R. A. (1935). The design of experiments. Oliver &amp; Boyd.</w:t>
+      </w:r>
+    </w:p>
+    <w:p>
+      <w:pPr>
+        <w:ind w:left="600" w:hanging="600"/>
+        <w:jc w:val="both"/>
+        <w:spacing w:after="60" w:line="276" w:lineRule="auto"/>
+      </w:pPr>
+      <w:r>
+        <w:rPr>
+          <w:rFonts w:ascii="Times New Roman" w:hAnsi="Times New Roman"/>
+          <w:sz w:val="22"/>
+          <w:szCs w:val="22"/>
+        </w:rPr>
+        <w:t xml:space="preserve">[65]  Piepel, G. F. (1988). Programs for generating extreme vertices and centroid designs for mixture experiments. Journal of Quality Technology, 20(2), 125–139.</w:t>
       </w:r>
     </w:p>
     <w:sectPr>

</xml_diff>